<commit_message>
13/05/2026 noche creación de auth service
</commit_message>
<xml_diff>
--- a/EXAMEN FINAL.docx
+++ b/EXAMEN FINAL.docx
@@ -1126,13 +1126,13 @@
         <w:rPr>
           <w:b/>
           <w:bCs/>
-          <w:highlight w:val="red"/>
+          <w:highlight w:val="yellow"/>
         </w:rPr>
         <w:t>RF-08 — Control de acceso por roles</w:t>
       </w:r>
       <w:r>
         <w:rPr>
-          <w:highlight w:val="red"/>
+          <w:highlight w:val="yellow"/>
         </w:rPr>
         <w:t> El sistema debe tener al menos tres roles: ADMIN, OPERADOR y CLIENTE. Reglas mínimas: solo ADMIN puede eliminar registros; solo ADMIN y OPERADOR pueden crear o actualizar paquetes; CLIENTE solo puede consultar sus propios paquetes e historial.</w:t>
       </w:r>
@@ -3925,8 +3925,14 @@
           <w:ilvl w:val="0"/>
           <w:numId w:val="7"/>
         </w:numPr>
-      </w:pPr>
-      <w:r>
+        <w:rPr>
+          <w:highlight w:val="green"/>
+        </w:rPr>
+      </w:pPr>
+      <w:r>
+        <w:rPr>
+          <w:highlight w:val="green"/>
+        </w:rPr>
         <w:t>Excepciones personalizadas en cada servicio que las necesite:</w:t>
       </w:r>
     </w:p>
@@ -3936,8 +3942,14 @@
           <w:ilvl w:val="1"/>
           <w:numId w:val="7"/>
         </w:numPr>
-      </w:pPr>
-      <w:r>
+        <w:rPr>
+          <w:highlight w:val="green"/>
+        </w:rPr>
+      </w:pPr>
+      <w:r>
+        <w:rPr>
+          <w:highlight w:val="green"/>
+        </w:rPr>
         <w:t>Recurso no encontrado → 404.</w:t>
       </w:r>
     </w:p>
@@ -3947,8 +3959,14 @@
           <w:ilvl w:val="1"/>
           <w:numId w:val="7"/>
         </w:numPr>
-      </w:pPr>
-      <w:r>
+        <w:rPr>
+          <w:highlight w:val="green"/>
+        </w:rPr>
+      </w:pPr>
+      <w:r>
+        <w:rPr>
+          <w:highlight w:val="green"/>
+        </w:rPr>
         <w:t>Conflicto o duplicado → 409.</w:t>
       </w:r>
     </w:p>
@@ -3958,8 +3976,14 @@
           <w:ilvl w:val="1"/>
           <w:numId w:val="7"/>
         </w:numPr>
-      </w:pPr>
-      <w:r>
+        <w:rPr>
+          <w:highlight w:val="green"/>
+        </w:rPr>
+      </w:pPr>
+      <w:r>
+        <w:rPr>
+          <w:highlight w:val="green"/>
+        </w:rPr>
         <w:t>Transición de estado inválida → 409.</w:t>
       </w:r>
     </w:p>
@@ -3969,8 +3993,14 @@
           <w:ilvl w:val="1"/>
           <w:numId w:val="7"/>
         </w:numPr>
-      </w:pPr>
-      <w:r>
+        <w:rPr>
+          <w:highlight w:val="green"/>
+        </w:rPr>
+      </w:pPr>
+      <w:r>
+        <w:rPr>
+          <w:highlight w:val="green"/>
+        </w:rPr>
         <w:t>Fallo de servicio externo (RENIEC u otro microservicio) → 502.</w:t>
       </w:r>
     </w:p>
@@ -5464,8 +5494,15 @@
         </w:tc>
       </w:tr>
     </w:tbl>
-    <w:p>
-      <w:r>
+    <w:p/>
+    <w:p>
+      <w:r>
+        <w:br w:type="page"/>
+      </w:r>
+    </w:p>
+    <w:p>
+      <w:r>
+        <w:lastRenderedPageBreak/>
         <w:pict w14:anchorId="3873DECB">
           <v:rect id="_x0000_i1036" style="width:0;height:3pt" o:hralign="center" o:hrstd="t" o:hr="t" fillcolor="#a0a0a0" stroked="f"/>
         </w:pict>
@@ -5508,7 +5545,6 @@
           <w:b/>
           <w:bCs/>
         </w:rPr>
-        <w:lastRenderedPageBreak/>
         <w:t>Qué se evalúa:</w:t>
       </w:r>
       <w:r>
@@ -6118,6 +6154,7 @@
         </w:numPr>
       </w:pPr>
       <w:r>
+        <w:lastRenderedPageBreak/>
         <w:t>Al menos 2 rutas de excepción con </w:t>
       </w:r>
       <w:proofErr w:type="spellStart"/>
@@ -6137,7 +6174,6 @@
         </w:numPr>
       </w:pPr>
       <w:r>
-        <w:lastRenderedPageBreak/>
         <w:t>Al menos 1 caso de resultado vacío (repositorio retorna lista vacía u </w:t>
       </w:r>
       <w:proofErr w:type="spellStart"/>
@@ -6691,6 +6727,7 @@
                 <w:b/>
                 <w:bCs/>
               </w:rPr>
+              <w:lastRenderedPageBreak/>
               <w:t>Criterio</w:t>
             </w:r>
           </w:p>
@@ -6805,7 +6842,6 @@
           </w:tcPr>
           <w:p>
             <w:r>
-              <w:lastRenderedPageBreak/>
               <w:t>Los tres roles con restricciones de acceso diferenciadas según RF-08</w:t>
             </w:r>
           </w:p>
@@ -7366,6 +7402,7 @@
           <w:b/>
           <w:bCs/>
         </w:rPr>
+        <w:lastRenderedPageBreak/>
         <w:t>Sección 12: API Gateway — Spring Cloud Gateway (20 puntos)</w:t>
       </w:r>
     </w:p>
@@ -7375,7 +7412,6 @@
           <w:b/>
           <w:bCs/>
         </w:rPr>
-        <w:lastRenderedPageBreak/>
         <w:t>Qué se evalúa:</w:t>
       </w:r>
       <w:r>
@@ -8148,6 +8184,7 @@
         </w:numPr>
       </w:pPr>
       <w:r>
+        <w:lastRenderedPageBreak/>
         <w:t>Demostración de recarga en caliente: cambiar una propiedad en el repositorio de configuración, llamar a /</w:t>
       </w:r>
       <w:proofErr w:type="spellStart"/>
@@ -8164,11 +8201,7 @@
       </w:r>
       <w:proofErr w:type="spellEnd"/>
       <w:r>
-        <w:t xml:space="preserve"> en el servicio afectado </w:t>
-      </w:r>
-      <w:r>
-        <w:lastRenderedPageBreak/>
-        <w:t>(requiere @RefreshScope), y verificar que el valor se actualiza sin reiniciar. Documentar el proceso con el comando </w:t>
+        <w:t> en el servicio afectado (requiere @RefreshScope), y verificar que el valor se actualiza sin reiniciar. Documentar el proceso con el comando </w:t>
       </w:r>
       <w:proofErr w:type="spellStart"/>
       <w:r>
@@ -8958,6 +8991,7 @@
           </w:tcPr>
           <w:p>
             <w:r>
+              <w:lastRenderedPageBreak/>
               <w:t>Configuración de Spring Cloud Vault en </w:t>
             </w:r>
             <w:proofErr w:type="spellStart"/>
@@ -9018,7 +9052,6 @@
           <w:b/>
           <w:bCs/>
         </w:rPr>
-        <w:lastRenderedPageBreak/>
         <w:t xml:space="preserve">Sección 15: Patrones de Resiliencia — </w:t>
       </w:r>
       <w:proofErr w:type="spellStart"/>
@@ -9636,6 +9669,7 @@
           <w:b/>
           <w:bCs/>
         </w:rPr>
+        <w:lastRenderedPageBreak/>
         <w:t>Qué se evalúa:</w:t>
       </w:r>
       <w:r>
@@ -9659,7 +9693,6 @@
         </w:numPr>
       </w:pPr>
       <w:r>
-        <w:lastRenderedPageBreak/>
         <w:t>Al menos </w:t>
       </w:r>
       <w:r>
@@ -10185,6 +10218,7 @@
     </w:p>
     <w:p>
       <w:r>
+        <w:lastRenderedPageBreak/>
         <w:t xml:space="preserve">  -H "Content-</w:t>
       </w:r>
       <w:proofErr w:type="spellStart"/>
@@ -10229,7 +10263,6 @@
     </w:p>
     <w:p>
       <w:r>
-        <w:lastRenderedPageBreak/>
         <w:t>Esperado: 200 OK — </w:t>
       </w:r>
       <w:proofErr w:type="spellStart"/>
@@ -10674,6 +10707,7 @@
           <w:b/>
           <w:bCs/>
         </w:rPr>
+        <w:lastRenderedPageBreak/>
         <w:t>Caso 7 — Registro de paquete con tarifa calculada</w:t>
       </w:r>
     </w:p>
@@ -10685,6 +10719,371 @@
       <w:proofErr w:type="spellEnd"/>
       <w:r>
         <w:t xml:space="preserve"> -s -X POST http://localhost:8080/api/v1/paquetes \</w:t>
+      </w:r>
+    </w:p>
+    <w:p>
+      <w:r>
+        <w:t xml:space="preserve">  -H "Content-</w:t>
+      </w:r>
+      <w:proofErr w:type="spellStart"/>
+      <w:r>
+        <w:t>Type</w:t>
+      </w:r>
+      <w:proofErr w:type="spellEnd"/>
+      <w:r>
+        <w:t xml:space="preserve">: </w:t>
+      </w:r>
+      <w:proofErr w:type="spellStart"/>
+      <w:r>
+        <w:t>application</w:t>
+      </w:r>
+      <w:proofErr w:type="spellEnd"/>
+      <w:r>
+        <w:t>/</w:t>
+      </w:r>
+      <w:proofErr w:type="spellStart"/>
+      <w:r>
+        <w:t>json</w:t>
+      </w:r>
+      <w:proofErr w:type="spellEnd"/>
+      <w:r>
+        <w:t>" \</w:t>
+      </w:r>
+    </w:p>
+    <w:p>
+      <w:r>
+        <w:t xml:space="preserve">  -H "</w:t>
+      </w:r>
+      <w:proofErr w:type="spellStart"/>
+      <w:r>
+        <w:t>Authorization</w:t>
+      </w:r>
+      <w:proofErr w:type="spellEnd"/>
+      <w:r>
+        <w:t>: Bearer TOKEN" \</w:t>
+      </w:r>
+    </w:p>
+    <w:p>
+      <w:r>
+        <w:t xml:space="preserve">  -d '{</w:t>
+      </w:r>
+    </w:p>
+    <w:p>
+      <w:r>
+        <w:t xml:space="preserve">    "</w:t>
+      </w:r>
+      <w:proofErr w:type="spellStart"/>
+      <w:r>
+        <w:t>descripcion</w:t>
+      </w:r>
+      <w:proofErr w:type="spellEnd"/>
+      <w:r>
+        <w:t>":"Documentos legales",</w:t>
+      </w:r>
+    </w:p>
+    <w:p>
+      <w:r>
+        <w:t xml:space="preserve">    "pesoKg":1.5,</w:t>
+      </w:r>
+    </w:p>
+    <w:p>
+      <w:r>
+        <w:t xml:space="preserve">    "valorDeclarado":200.00,</w:t>
+      </w:r>
+    </w:p>
+    <w:p>
+      <w:r>
+        <w:t xml:space="preserve">    "</w:t>
+      </w:r>
+      <w:proofErr w:type="spellStart"/>
+      <w:r>
+        <w:t>sucursalOrigen</w:t>
+      </w:r>
+      <w:proofErr w:type="spellEnd"/>
+      <w:r>
+        <w:t>":"Lima",</w:t>
+      </w:r>
+    </w:p>
+    <w:p>
+      <w:r>
+        <w:t xml:space="preserve">    "</w:t>
+      </w:r>
+      <w:proofErr w:type="spellStart"/>
+      <w:r>
+        <w:t>sucursalDestino</w:t>
+      </w:r>
+      <w:proofErr w:type="spellEnd"/>
+      <w:r>
+        <w:t>":"Arequipa",</w:t>
+      </w:r>
+    </w:p>
+    <w:p>
+      <w:r>
+        <w:t xml:space="preserve">    "dniRemitente":"12345678",</w:t>
+      </w:r>
+    </w:p>
+    <w:p>
+      <w:r>
+        <w:t xml:space="preserve">    "dniDestinatario":"87654321"</w:t>
+      </w:r>
+    </w:p>
+    <w:p>
+      <w:r>
+        <w:t xml:space="preserve">  }' | </w:t>
+      </w:r>
+      <w:proofErr w:type="spellStart"/>
+      <w:proofErr w:type="gramStart"/>
+      <w:r>
+        <w:t>jq</w:t>
+      </w:r>
+      <w:proofErr w:type="spellEnd"/>
+      <w:r>
+        <w:t xml:space="preserve"> .</w:t>
+      </w:r>
+      <w:proofErr w:type="gramEnd"/>
+    </w:p>
+    <w:p>
+      <w:r>
+        <w:t xml:space="preserve">Esperado: 201 </w:t>
+      </w:r>
+      <w:proofErr w:type="spellStart"/>
+      <w:r>
+        <w:t>Created</w:t>
+      </w:r>
+      <w:proofErr w:type="spellEnd"/>
+      <w:r>
+        <w:t> — código de rastreo generado y tarifa calculada visibles en data.</w:t>
+      </w:r>
+    </w:p>
+    <w:p>
+      <w:r>
+        <w:rPr>
+          <w:b/>
+          <w:bCs/>
+        </w:rPr>
+        <w:t>Caso 8 — Datos inválidos en registro de paquete</w:t>
+      </w:r>
+    </w:p>
+    <w:p>
+      <w:proofErr w:type="spellStart"/>
+      <w:r>
+        <w:t>curl</w:t>
+      </w:r>
+      <w:proofErr w:type="spellEnd"/>
+      <w:r>
+        <w:t xml:space="preserve"> -s -X POST http://localhost:8080/api/v1/paquetes \</w:t>
+      </w:r>
+    </w:p>
+    <w:p>
+      <w:r>
+        <w:t xml:space="preserve">  -H "Content-</w:t>
+      </w:r>
+      <w:proofErr w:type="spellStart"/>
+      <w:r>
+        <w:t>Type</w:t>
+      </w:r>
+      <w:proofErr w:type="spellEnd"/>
+      <w:r>
+        <w:t xml:space="preserve">: </w:t>
+      </w:r>
+      <w:proofErr w:type="spellStart"/>
+      <w:r>
+        <w:t>application</w:t>
+      </w:r>
+      <w:proofErr w:type="spellEnd"/>
+      <w:r>
+        <w:t>/</w:t>
+      </w:r>
+      <w:proofErr w:type="spellStart"/>
+      <w:r>
+        <w:t>json</w:t>
+      </w:r>
+      <w:proofErr w:type="spellEnd"/>
+      <w:r>
+        <w:t>" \</w:t>
+      </w:r>
+    </w:p>
+    <w:p>
+      <w:r>
+        <w:t xml:space="preserve">  -H "</w:t>
+      </w:r>
+      <w:proofErr w:type="spellStart"/>
+      <w:r>
+        <w:t>Authorization</w:t>
+      </w:r>
+      <w:proofErr w:type="spellEnd"/>
+      <w:r>
+        <w:t>: Bearer TOKEN" \</w:t>
+      </w:r>
+    </w:p>
+    <w:p>
+      <w:r>
+        <w:t xml:space="preserve">  -d '{"</w:t>
+      </w:r>
+      <w:proofErr w:type="spellStart"/>
+      <w:r>
+        <w:t>descripcion</w:t>
+      </w:r>
+      <w:proofErr w:type="spellEnd"/>
+      <w:r>
+        <w:t>":"","</w:t>
+      </w:r>
+      <w:proofErr w:type="spellStart"/>
+      <w:r>
+        <w:t>pesoKg</w:t>
+      </w:r>
+      <w:proofErr w:type="spellEnd"/>
+      <w:proofErr w:type="gramStart"/>
+      <w:r>
+        <w:t>":-</w:t>
+      </w:r>
+      <w:proofErr w:type="gramEnd"/>
+      <w:r>
+        <w:t xml:space="preserve">1,"valorDeclarado":0}' | </w:t>
+      </w:r>
+      <w:proofErr w:type="spellStart"/>
+      <w:proofErr w:type="gramStart"/>
+      <w:r>
+        <w:t>jq</w:t>
+      </w:r>
+      <w:proofErr w:type="spellEnd"/>
+      <w:r>
+        <w:t xml:space="preserve"> .</w:t>
+      </w:r>
+      <w:proofErr w:type="gramEnd"/>
+    </w:p>
+    <w:p>
+      <w:r>
+        <w:t xml:space="preserve">Esperado: 400 Bad </w:t>
+      </w:r>
+      <w:proofErr w:type="spellStart"/>
+      <w:r>
+        <w:t>Request</w:t>
+      </w:r>
+      <w:proofErr w:type="spellEnd"/>
+      <w:r>
+        <w:t> — mapa de errores por campo en data.</w:t>
+      </w:r>
+    </w:p>
+    <w:p>
+      <w:r>
+        <w:rPr>
+          <w:b/>
+          <w:bCs/>
+        </w:rPr>
+        <w:t>Caso 9 — Consulta de paquete por ID existente</w:t>
+      </w:r>
+    </w:p>
+    <w:p>
+      <w:proofErr w:type="spellStart"/>
+      <w:r>
+        <w:t>curl</w:t>
+      </w:r>
+      <w:proofErr w:type="spellEnd"/>
+      <w:r>
+        <w:t xml:space="preserve"> -s -X GET http://localhost:8080/api/v1/paquetes/{id} \</w:t>
+      </w:r>
+    </w:p>
+    <w:p>
+      <w:r>
+        <w:t xml:space="preserve">  -H "</w:t>
+      </w:r>
+      <w:proofErr w:type="spellStart"/>
+      <w:r>
+        <w:t>Authorization</w:t>
+      </w:r>
+      <w:proofErr w:type="spellEnd"/>
+      <w:r>
+        <w:t xml:space="preserve">: Bearer TOKEN" | </w:t>
+      </w:r>
+      <w:proofErr w:type="spellStart"/>
+      <w:proofErr w:type="gramStart"/>
+      <w:r>
+        <w:t>jq</w:t>
+      </w:r>
+      <w:proofErr w:type="spellEnd"/>
+      <w:r>
+        <w:t xml:space="preserve"> .</w:t>
+      </w:r>
+      <w:proofErr w:type="gramEnd"/>
+    </w:p>
+    <w:p>
+      <w:r>
+        <w:t>Esperado: 200 OK — datos del paquete incluyendo nombre del remitente y destinatario en data.</w:t>
+      </w:r>
+    </w:p>
+    <w:p>
+      <w:r>
+        <w:rPr>
+          <w:b/>
+          <w:bCs/>
+        </w:rPr>
+        <w:t>Caso 10 — Consulta de paquete por ID inexistente</w:t>
+      </w:r>
+    </w:p>
+    <w:p>
+      <w:proofErr w:type="spellStart"/>
+      <w:r>
+        <w:t>curl</w:t>
+      </w:r>
+      <w:proofErr w:type="spellEnd"/>
+      <w:r>
+        <w:t xml:space="preserve"> -s -X GET http://localhost:8080/api/v1/paquetes/00000000-0000-0000-0000-000000000000 \</w:t>
+      </w:r>
+    </w:p>
+    <w:p>
+      <w:r>
+        <w:t xml:space="preserve">  -H "</w:t>
+      </w:r>
+      <w:proofErr w:type="spellStart"/>
+      <w:r>
+        <w:t>Authorization</w:t>
+      </w:r>
+      <w:proofErr w:type="spellEnd"/>
+      <w:r>
+        <w:t xml:space="preserve">: Bearer TOKEN" | </w:t>
+      </w:r>
+      <w:proofErr w:type="spellStart"/>
+      <w:proofErr w:type="gramStart"/>
+      <w:r>
+        <w:t>jq</w:t>
+      </w:r>
+      <w:proofErr w:type="spellEnd"/>
+      <w:r>
+        <w:t xml:space="preserve"> .</w:t>
+      </w:r>
+      <w:proofErr w:type="gramEnd"/>
+    </w:p>
+    <w:p>
+      <w:r>
+        <w:t>Esperado: 404 Not Found — </w:t>
+      </w:r>
+      <w:proofErr w:type="spellStart"/>
+      <w:r>
+        <w:t>success</w:t>
+      </w:r>
+      <w:proofErr w:type="spellEnd"/>
+      <w:r>
+        <w:t>: false.</w:t>
+      </w:r>
+    </w:p>
+    <w:p>
+      <w:r>
+        <w:rPr>
+          <w:b/>
+          <w:bCs/>
+        </w:rPr>
+        <w:t>Caso 11 — Actualización de estado: transición válida (RF-04)</w:t>
+      </w:r>
+    </w:p>
+    <w:p>
+      <w:proofErr w:type="spellStart"/>
+      <w:r>
+        <w:t>curl</w:t>
+      </w:r>
+      <w:proofErr w:type="spellEnd"/>
+      <w:r>
+        <w:t xml:space="preserve"> -s -X PATCH http://localhost:8080/api/v1/paquetes/{id}/estado \</w:t>
       </w:r>
     </w:p>
     <w:p>
@@ -10732,372 +11131,6 @@
     </w:p>
     <w:p>
       <w:r>
-        <w:t xml:space="preserve">  -d '{</w:t>
-      </w:r>
-    </w:p>
-    <w:p>
-      <w:r>
-        <w:t xml:space="preserve">    "</w:t>
-      </w:r>
-      <w:proofErr w:type="spellStart"/>
-      <w:r>
-        <w:t>descripcion</w:t>
-      </w:r>
-      <w:proofErr w:type="spellEnd"/>
-      <w:r>
-        <w:t>":"Documentos legales",</w:t>
-      </w:r>
-    </w:p>
-    <w:p>
-      <w:r>
-        <w:t xml:space="preserve">    "pesoKg":1.5,</w:t>
-      </w:r>
-    </w:p>
-    <w:p>
-      <w:r>
-        <w:t xml:space="preserve">    "valorDeclarado":200.00,</w:t>
-      </w:r>
-    </w:p>
-    <w:p>
-      <w:r>
-        <w:t xml:space="preserve">    "</w:t>
-      </w:r>
-      <w:proofErr w:type="spellStart"/>
-      <w:r>
-        <w:t>sucursalOrigen</w:t>
-      </w:r>
-      <w:proofErr w:type="spellEnd"/>
-      <w:r>
-        <w:t>":"Lima",</w:t>
-      </w:r>
-    </w:p>
-    <w:p>
-      <w:r>
-        <w:t xml:space="preserve">    "</w:t>
-      </w:r>
-      <w:proofErr w:type="spellStart"/>
-      <w:r>
-        <w:t>sucursalDestino</w:t>
-      </w:r>
-      <w:proofErr w:type="spellEnd"/>
-      <w:r>
-        <w:t>":"Arequipa",</w:t>
-      </w:r>
-    </w:p>
-    <w:p>
-      <w:r>
-        <w:t xml:space="preserve">    "dniRemitente":"12345678",</w:t>
-      </w:r>
-    </w:p>
-    <w:p>
-      <w:r>
-        <w:t xml:space="preserve">    "dniDestinatario":"87654321"</w:t>
-      </w:r>
-    </w:p>
-    <w:p>
-      <w:r>
-        <w:t xml:space="preserve">  }' | </w:t>
-      </w:r>
-      <w:proofErr w:type="spellStart"/>
-      <w:proofErr w:type="gramStart"/>
-      <w:r>
-        <w:t>jq</w:t>
-      </w:r>
-      <w:proofErr w:type="spellEnd"/>
-      <w:r>
-        <w:t xml:space="preserve"> .</w:t>
-      </w:r>
-      <w:proofErr w:type="gramEnd"/>
-    </w:p>
-    <w:p>
-      <w:r>
-        <w:t xml:space="preserve">Esperado: 201 </w:t>
-      </w:r>
-      <w:proofErr w:type="spellStart"/>
-      <w:r>
-        <w:t>Created</w:t>
-      </w:r>
-      <w:proofErr w:type="spellEnd"/>
-      <w:r>
-        <w:t> — código de rastreo generado y tarifa calculada visibles en data.</w:t>
-      </w:r>
-    </w:p>
-    <w:p>
-      <w:r>
-        <w:rPr>
-          <w:b/>
-          <w:bCs/>
-        </w:rPr>
-        <w:t>Caso 8 — Datos inválidos en registro de paquete</w:t>
-      </w:r>
-    </w:p>
-    <w:p>
-      <w:proofErr w:type="spellStart"/>
-      <w:r>
-        <w:t>curl</w:t>
-      </w:r>
-      <w:proofErr w:type="spellEnd"/>
-      <w:r>
-        <w:t xml:space="preserve"> -s -X POST http://localhost:8080/api/v1/paquetes \</w:t>
-      </w:r>
-    </w:p>
-    <w:p>
-      <w:r>
-        <w:t xml:space="preserve">  -H "Content-</w:t>
-      </w:r>
-      <w:proofErr w:type="spellStart"/>
-      <w:r>
-        <w:t>Type</w:t>
-      </w:r>
-      <w:proofErr w:type="spellEnd"/>
-      <w:r>
-        <w:t xml:space="preserve">: </w:t>
-      </w:r>
-      <w:proofErr w:type="spellStart"/>
-      <w:r>
-        <w:t>application</w:t>
-      </w:r>
-      <w:proofErr w:type="spellEnd"/>
-      <w:r>
-        <w:t>/</w:t>
-      </w:r>
-      <w:proofErr w:type="spellStart"/>
-      <w:r>
-        <w:t>json</w:t>
-      </w:r>
-      <w:proofErr w:type="spellEnd"/>
-      <w:r>
-        <w:t>" \</w:t>
-      </w:r>
-    </w:p>
-    <w:p>
-      <w:r>
-        <w:t xml:space="preserve">  -H "</w:t>
-      </w:r>
-      <w:proofErr w:type="spellStart"/>
-      <w:r>
-        <w:t>Authorization</w:t>
-      </w:r>
-      <w:proofErr w:type="spellEnd"/>
-      <w:r>
-        <w:t>: Bearer TOKEN" \</w:t>
-      </w:r>
-    </w:p>
-    <w:p>
-      <w:r>
-        <w:t xml:space="preserve">  -d '{"</w:t>
-      </w:r>
-      <w:proofErr w:type="spellStart"/>
-      <w:r>
-        <w:t>descripcion</w:t>
-      </w:r>
-      <w:proofErr w:type="spellEnd"/>
-      <w:r>
-        <w:t>":"","</w:t>
-      </w:r>
-      <w:proofErr w:type="spellStart"/>
-      <w:r>
-        <w:t>pesoKg</w:t>
-      </w:r>
-      <w:proofErr w:type="spellEnd"/>
-      <w:proofErr w:type="gramStart"/>
-      <w:r>
-        <w:t>":-</w:t>
-      </w:r>
-      <w:proofErr w:type="gramEnd"/>
-      <w:r>
-        <w:t xml:space="preserve">1,"valorDeclarado":0}' | </w:t>
-      </w:r>
-      <w:proofErr w:type="spellStart"/>
-      <w:proofErr w:type="gramStart"/>
-      <w:r>
-        <w:t>jq</w:t>
-      </w:r>
-      <w:proofErr w:type="spellEnd"/>
-      <w:r>
-        <w:t xml:space="preserve"> .</w:t>
-      </w:r>
-      <w:proofErr w:type="gramEnd"/>
-    </w:p>
-    <w:p>
-      <w:r>
-        <w:t xml:space="preserve">Esperado: 400 Bad </w:t>
-      </w:r>
-      <w:proofErr w:type="spellStart"/>
-      <w:r>
-        <w:t>Request</w:t>
-      </w:r>
-      <w:proofErr w:type="spellEnd"/>
-      <w:r>
-        <w:t> — mapa de errores por campo en data.</w:t>
-      </w:r>
-    </w:p>
-    <w:p>
-      <w:r>
-        <w:rPr>
-          <w:b/>
-          <w:bCs/>
-        </w:rPr>
-        <w:t>Caso 9 — Consulta de paquete por ID existente</w:t>
-      </w:r>
-    </w:p>
-    <w:p>
-      <w:proofErr w:type="spellStart"/>
-      <w:r>
-        <w:t>curl</w:t>
-      </w:r>
-      <w:proofErr w:type="spellEnd"/>
-      <w:r>
-        <w:t xml:space="preserve"> -s -X GET http://localhost:8080/api/v1/paquetes/{id} \</w:t>
-      </w:r>
-    </w:p>
-    <w:p>
-      <w:r>
-        <w:t xml:space="preserve">  -H "</w:t>
-      </w:r>
-      <w:proofErr w:type="spellStart"/>
-      <w:r>
-        <w:t>Authorization</w:t>
-      </w:r>
-      <w:proofErr w:type="spellEnd"/>
-      <w:r>
-        <w:t xml:space="preserve">: Bearer TOKEN" | </w:t>
-      </w:r>
-      <w:proofErr w:type="spellStart"/>
-      <w:proofErr w:type="gramStart"/>
-      <w:r>
-        <w:t>jq</w:t>
-      </w:r>
-      <w:proofErr w:type="spellEnd"/>
-      <w:r>
-        <w:t xml:space="preserve"> .</w:t>
-      </w:r>
-      <w:proofErr w:type="gramEnd"/>
-    </w:p>
-    <w:p>
-      <w:r>
-        <w:t>Esperado: 200 OK — datos del paquete incluyendo nombre del remitente y destinatario en data.</w:t>
-      </w:r>
-    </w:p>
-    <w:p>
-      <w:r>
-        <w:rPr>
-          <w:b/>
-          <w:bCs/>
-        </w:rPr>
-        <w:t>Caso 10 — Consulta de paquete por ID inexistente</w:t>
-      </w:r>
-    </w:p>
-    <w:p>
-      <w:proofErr w:type="spellStart"/>
-      <w:r>
-        <w:t>curl</w:t>
-      </w:r>
-      <w:proofErr w:type="spellEnd"/>
-      <w:r>
-        <w:t xml:space="preserve"> -s -X GET http://localhost:8080/api/v1/paquetes/00000000-0000-0000-0000-000000000000 \</w:t>
-      </w:r>
-    </w:p>
-    <w:p>
-      <w:r>
-        <w:t xml:space="preserve">  -H "</w:t>
-      </w:r>
-      <w:proofErr w:type="spellStart"/>
-      <w:r>
-        <w:t>Authorization</w:t>
-      </w:r>
-      <w:proofErr w:type="spellEnd"/>
-      <w:r>
-        <w:t xml:space="preserve">: Bearer TOKEN" | </w:t>
-      </w:r>
-      <w:proofErr w:type="spellStart"/>
-      <w:proofErr w:type="gramStart"/>
-      <w:r>
-        <w:t>jq</w:t>
-      </w:r>
-      <w:proofErr w:type="spellEnd"/>
-      <w:r>
-        <w:t xml:space="preserve"> .</w:t>
-      </w:r>
-      <w:proofErr w:type="gramEnd"/>
-    </w:p>
-    <w:p>
-      <w:r>
-        <w:t>Esperado: 404 Not Found — </w:t>
-      </w:r>
-      <w:proofErr w:type="spellStart"/>
-      <w:r>
-        <w:t>success</w:t>
-      </w:r>
-      <w:proofErr w:type="spellEnd"/>
-      <w:r>
-        <w:t>: false.</w:t>
-      </w:r>
-    </w:p>
-    <w:p>
-      <w:r>
-        <w:rPr>
-          <w:b/>
-          <w:bCs/>
-        </w:rPr>
-        <w:t>Caso 11 — Actualización de estado: transición válida (RF-04)</w:t>
-      </w:r>
-    </w:p>
-    <w:p>
-      <w:proofErr w:type="spellStart"/>
-      <w:r>
-        <w:t>curl</w:t>
-      </w:r>
-      <w:proofErr w:type="spellEnd"/>
-      <w:r>
-        <w:t xml:space="preserve"> -s -X PATCH http://localhost:8080/api/v1/paquetes/{id}/estado \</w:t>
-      </w:r>
-    </w:p>
-    <w:p>
-      <w:r>
-        <w:t xml:space="preserve">  -H "Content-</w:t>
-      </w:r>
-      <w:proofErr w:type="spellStart"/>
-      <w:r>
-        <w:t>Type</w:t>
-      </w:r>
-      <w:proofErr w:type="spellEnd"/>
-      <w:r>
-        <w:t xml:space="preserve">: </w:t>
-      </w:r>
-      <w:proofErr w:type="spellStart"/>
-      <w:r>
-        <w:t>application</w:t>
-      </w:r>
-      <w:proofErr w:type="spellEnd"/>
-      <w:r>
-        <w:t>/</w:t>
-      </w:r>
-      <w:proofErr w:type="spellStart"/>
-      <w:r>
-        <w:t>json</w:t>
-      </w:r>
-      <w:proofErr w:type="spellEnd"/>
-      <w:r>
-        <w:t>" \</w:t>
-      </w:r>
-    </w:p>
-    <w:p>
-      <w:r>
-        <w:t xml:space="preserve">  -H "</w:t>
-      </w:r>
-      <w:proofErr w:type="spellStart"/>
-      <w:r>
-        <w:t>Authorization</w:t>
-      </w:r>
-      <w:proofErr w:type="spellEnd"/>
-      <w:r>
-        <w:t>: Bearer TOKEN" \</w:t>
-      </w:r>
-    </w:p>
-    <w:p>
-      <w:r>
-        <w:lastRenderedPageBreak/>
         <w:t xml:space="preserve">  -d '{"</w:t>
       </w:r>
       <w:proofErr w:type="spellStart"/>
@@ -11496,6 +11529,7 @@
           <w:b/>
           <w:bCs/>
         </w:rPr>
+        <w:lastRenderedPageBreak/>
         <w:t>Categorías (RF-09)</w:t>
       </w:r>
     </w:p>
@@ -11511,7 +11545,6 @@
     <w:p>
       <w:proofErr w:type="spellStart"/>
       <w:r>
-        <w:lastRenderedPageBreak/>
         <w:t>curl</w:t>
       </w:r>
       <w:proofErr w:type="spellEnd"/>
@@ -11897,6 +11930,7 @@
     </w:p>
     <w:p>
       <w:r>
+        <w:lastRenderedPageBreak/>
         <w:pict w14:anchorId="7D896CB3">
           <v:rect id="_x0000_i1055" style="width:0;height:3pt" o:hralign="center" o:hrstd="t" o:hr="t" fillcolor="#a0a0a0" stroked="f"/>
         </w:pict>
@@ -11925,7 +11959,6 @@
         </w:numPr>
       </w:pPr>
       <w:r>
-        <w:lastRenderedPageBreak/>
         <w:t>Repositorio Git público con todos los proyectos Maven en subdirectorios claramente nombrados.</w:t>
       </w:r>
     </w:p>
@@ -12964,6 +12997,7 @@
           </w:tcPr>
           <w:p>
             <w:r>
+              <w:lastRenderedPageBreak/>
               <w:t>A</w:t>
             </w:r>
           </w:p>
@@ -13066,7 +13100,6 @@
           </w:tcPr>
           <w:p>
             <w:r>
-              <w:lastRenderedPageBreak/>
               <w:t>A</w:t>
             </w:r>
           </w:p>
@@ -18283,7 +18316,7 @@
       <w14:ligatures w14:val="none"/>
     </w:rPr>
   </w:style>
-  <w:style w:type="character" w:styleId="Fuerte">
+  <w:style w:type="character" w:styleId="Textoennegrita">
     <w:name w:val="Strong"/>
     <w:basedOn w:val="Fuentedeprrafopredeter"/>
     <w:uiPriority w:val="22"/>

</xml_diff>

<commit_message>
se agrega eureka server
</commit_message>
<xml_diff>
--- a/EXAMEN FINAL.docx
+++ b/EXAMEN FINAL.docx
@@ -595,16 +595,21 @@
       <w:r>
         <w:rPr>
           <w:rFonts w:ascii="MS Gothic" w:eastAsia="MS Gothic" w:hAnsi="MS Gothic" w:cs="MS Gothic" w:hint="eastAsia"/>
+          <w:highlight w:val="green"/>
         </w:rPr>
         <w:t>├</w:t>
       </w:r>
       <w:r>
         <w:rPr>
           <w:rFonts w:ascii="Calibri" w:hAnsi="Calibri" w:cs="Calibri"/>
+          <w:highlight w:val="green"/>
         </w:rPr>
         <w:t>──</w:t>
       </w:r>
       <w:r>
+        <w:rPr>
+          <w:highlight w:val="green"/>
+        </w:rPr>
         <w:t xml:space="preserve"> eureka-server/</w:t>
       </w:r>
     </w:p>
@@ -774,6 +779,9 @@
     </w:p>
     <w:p>
       <w:r>
+        <w:rPr>
+          <w:highlight w:val="green"/>
+        </w:rPr>
         <w:t>└── README.md</w:t>
       </w:r>
     </w:p>
@@ -7381,7 +7389,7 @@
     <w:p>
       <w:r>
         <w:pict w14:anchorId="5036F301">
-          <v:rect id="_x0000_i1037" style="width:0;height:3pt" o:hralign="center" o:hrstd="t" o:hr="t" fillcolor="#a0a0a0" stroked="f"/>
+          <v:rect id="_x0000_i1036" style="width:0;height:3pt" o:hralign="center" o:hrstd="t" o:hr="t" fillcolor="#a0a0a0" stroked="f"/>
         </w:pict>
       </w:r>
     </w:p>
@@ -7941,7 +7949,7 @@
     <w:p>
       <w:r>
         <w:pict w14:anchorId="67153E5C">
-          <v:rect id="_x0000_i1038" style="width:0;height:3pt" o:hralign="center" o:hrstd="t" o:hr="t" fillcolor="#a0a0a0" stroked="f"/>
+          <v:rect id="_x0000_i1037" style="width:0;height:3pt" o:hralign="center" o:hrstd="t" o:hr="t" fillcolor="#a0a0a0" stroked="f"/>
         </w:pict>
       </w:r>
     </w:p>
@@ -8503,9 +8511,49 @@
       </w:r>
     </w:p>
     <w:p>
-      <w:r>
+      <w:pPr>
+        <w:rPr>
+          <w:highlight w:val="green"/>
+        </w:rPr>
+      </w:pPr>
+      <w:r>
+        <w:rPr>
+          <w:highlight w:val="green"/>
+        </w:rPr>
         <w:lastRenderedPageBreak/>
         <w:pict w14:anchorId="350636D3">
+          <v:rect id="_x0000_i1038" style="width:0;height:3pt" o:hralign="center" o:hrstd="t" o:hr="t" fillcolor="#a0a0a0" stroked="f"/>
+        </w:pict>
+      </w:r>
+    </w:p>
+    <w:p>
+      <w:pPr>
+        <w:rPr>
+          <w:b/>
+          <w:bCs/>
+          <w:highlight w:val="green"/>
+        </w:rPr>
+      </w:pPr>
+      <w:r>
+        <w:rPr>
+          <w:b/>
+          <w:bCs/>
+          <w:highlight w:val="green"/>
+        </w:rPr>
+        <w:t>PARTE B — INFRAESTRUCTURA Y PATRONES (80 puntos)</w:t>
+      </w:r>
+    </w:p>
+    <w:p>
+      <w:pPr>
+        <w:rPr>
+          <w:highlight w:val="green"/>
+        </w:rPr>
+      </w:pPr>
+      <w:r>
+        <w:rPr>
+          <w:highlight w:val="green"/>
+        </w:rPr>
+        <w:pict w14:anchorId="4A72099A">
           <v:rect id="_x0000_i1039" style="width:0;height:3pt" o:hralign="center" o:hrstd="t" o:hr="t" fillcolor="#a0a0a0" stroked="f"/>
         </w:pict>
       </w:r>
@@ -8515,55 +8563,50 @@
         <w:rPr>
           <w:b/>
           <w:bCs/>
-        </w:rPr>
-      </w:pPr>
-      <w:r>
-        <w:rPr>
-          <w:b/>
-          <w:bCs/>
-        </w:rPr>
-        <w:t>PARTE B — INFRAESTRUCTURA Y PATRONES (80 puntos)</w:t>
-      </w:r>
-    </w:p>
-    <w:p>
-      <w:r>
-        <w:pict w14:anchorId="4A72099A">
-          <v:rect id="_x0000_i1040" style="width:0;height:3pt" o:hralign="center" o:hrstd="t" o:hr="t" fillcolor="#a0a0a0" stroked="f"/>
-        </w:pict>
-      </w:r>
-    </w:p>
-    <w:p>
-      <w:pPr>
-        <w:rPr>
-          <w:b/>
-          <w:bCs/>
-        </w:rPr>
-      </w:pPr>
-      <w:r>
-        <w:rPr>
-          <w:b/>
-          <w:bCs/>
+          <w:highlight w:val="green"/>
+        </w:rPr>
+      </w:pPr>
+      <w:r>
+        <w:rPr>
+          <w:b/>
+          <w:bCs/>
+          <w:highlight w:val="green"/>
         </w:rPr>
         <w:t>Sección 11: Eureka Server y Registro de Servicios (15 puntos)</w:t>
       </w:r>
     </w:p>
     <w:p>
-      <w:r>
-        <w:rPr>
-          <w:b/>
-          <w:bCs/>
+      <w:pPr>
+        <w:rPr>
+          <w:highlight w:val="green"/>
+        </w:rPr>
+      </w:pPr>
+      <w:r>
+        <w:rPr>
+          <w:b/>
+          <w:bCs/>
+          <w:highlight w:val="green"/>
         </w:rPr>
         <w:t>Qué se evalúa:</w:t>
       </w:r>
       <w:r>
+        <w:rPr>
+          <w:highlight w:val="green"/>
+        </w:rPr>
         <w:t> Descubrimiento de servicios: configuración del servidor y registro correcto de todos los componentes. Cubre RNF-08.</w:t>
       </w:r>
     </w:p>
     <w:p>
-      <w:r>
-        <w:rPr>
-          <w:b/>
-          <w:bCs/>
+      <w:pPr>
+        <w:rPr>
+          <w:highlight w:val="green"/>
+        </w:rPr>
+      </w:pPr>
+      <w:r>
+        <w:rPr>
+          <w:b/>
+          <w:bCs/>
+          <w:highlight w:val="green"/>
         </w:rPr>
         <w:t>Entregables:</w:t>
       </w:r>
@@ -8574,18 +8617,28 @@
           <w:ilvl w:val="0"/>
           <w:numId w:val="13"/>
         </w:numPr>
-      </w:pPr>
-      <w:r>
+        <w:rPr>
+          <w:highlight w:val="green"/>
+        </w:rPr>
+      </w:pPr>
+      <w:r>
+        <w:rPr>
+          <w:highlight w:val="green"/>
+        </w:rPr>
         <w:t>Proyecto eureka-server con @EnableEurekaServer en el puerto </w:t>
       </w:r>
       <w:r>
         <w:rPr>
           <w:b/>
           <w:bCs/>
+          <w:highlight w:val="green"/>
         </w:rPr>
         <w:t>8761</w:t>
       </w:r>
       <w:r>
+        <w:rPr>
+          <w:highlight w:val="green"/>
+        </w:rPr>
         <w:t>.</w:t>
       </w:r>
     </w:p>
@@ -8595,8 +8648,14 @@
           <w:ilvl w:val="0"/>
           <w:numId w:val="13"/>
         </w:numPr>
-      </w:pPr>
-      <w:r>
+        <w:rPr>
+          <w:highlight w:val="green"/>
+        </w:rPr>
+      </w:pPr>
+      <w:r>
+        <w:rPr>
+          <w:highlight w:val="green"/>
+        </w:rPr>
         <w:t>Todos los microservicios de negocio y el API Gateway registrados como clientes Eureka con spring.application.name único y descriptivo en cada uno.</w:t>
       </w:r>
     </w:p>
@@ -8606,16 +8665,28 @@
           <w:ilvl w:val="0"/>
           <w:numId w:val="13"/>
         </w:numPr>
-      </w:pPr>
-      <w:r>
+        <w:rPr>
+          <w:highlight w:val="green"/>
+        </w:rPr>
+      </w:pPr>
+      <w:r>
+        <w:rPr>
+          <w:highlight w:val="green"/>
+        </w:rPr>
         <w:t xml:space="preserve">Captura de pantalla del </w:t>
       </w:r>
       <w:proofErr w:type="spellStart"/>
       <w:r>
+        <w:rPr>
+          <w:highlight w:val="green"/>
+        </w:rPr>
         <w:t>dashboard</w:t>
       </w:r>
       <w:proofErr w:type="spellEnd"/>
       <w:r>
+        <w:rPr>
+          <w:highlight w:val="green"/>
+        </w:rPr>
         <w:t xml:space="preserve"> de Eureka mostrando todos los servicios en estado UP. Incluirla en el README.md.</w:t>
       </w:r>
     </w:p>
@@ -8625,13 +8696,22 @@
           <w:ilvl w:val="0"/>
           <w:numId w:val="13"/>
         </w:numPr>
-      </w:pPr>
-      <w:proofErr w:type="spellStart"/>
-      <w:r>
+        <w:rPr>
+          <w:highlight w:val="green"/>
+        </w:rPr>
+      </w:pPr>
+      <w:proofErr w:type="spellStart"/>
+      <w:r>
+        <w:rPr>
+          <w:highlight w:val="green"/>
+        </w:rPr>
         <w:t>Heartbeat</w:t>
       </w:r>
       <w:proofErr w:type="spellEnd"/>
       <w:r>
+        <w:rPr>
+          <w:highlight w:val="green"/>
+        </w:rPr>
         <w:t xml:space="preserve"> e intervalo de renovación configurados explícitamente en al menos 1 servicio cliente (lease-renewal-interval-in-seconds, lease-expiration-duration-in-seconds).</w:t>
       </w:r>
     </w:p>
@@ -8959,7 +9039,7 @@
     <w:p>
       <w:r>
         <w:pict w14:anchorId="13E747B1">
-          <v:rect id="_x0000_i1041" style="width:0;height:3pt" o:hralign="center" o:hrstd="t" o:hr="t" fillcolor="#a0a0a0" stroked="f"/>
+          <v:rect id="_x0000_i1040" style="width:0;height:3pt" o:hralign="center" o:hrstd="t" o:hr="t" fillcolor="#a0a0a0" stroked="f"/>
         </w:pict>
       </w:r>
     </w:p>
@@ -9558,7 +9638,7 @@
     <w:p>
       <w:r>
         <w:pict w14:anchorId="2AB6169C">
-          <v:rect id="_x0000_i1042" style="width:0;height:3pt" o:hralign="center" o:hrstd="t" o:hr="t" fillcolor="#a0a0a0" stroked="f"/>
+          <v:rect id="_x0000_i1041" style="width:0;height:3pt" o:hralign="center" o:hrstd="t" o:hr="t" fillcolor="#a0a0a0" stroked="f"/>
         </w:pict>
       </w:r>
     </w:p>
@@ -10171,7 +10251,7 @@
     <w:p>
       <w:r>
         <w:pict w14:anchorId="268E3930">
-          <v:rect id="_x0000_i1043" style="width:0;height:3pt" o:hralign="center" o:hrstd="t" o:hr="t" fillcolor="#a0a0a0" stroked="f"/>
+          <v:rect id="_x0000_i1042" style="width:0;height:3pt" o:hralign="center" o:hrstd="t" o:hr="t" fillcolor="#a0a0a0" stroked="f"/>
         </w:pict>
       </w:r>
     </w:p>
@@ -10761,7 +10841,7 @@
     <w:p>
       <w:r>
         <w:pict w14:anchorId="3934AA19">
-          <v:rect id="_x0000_i1044" style="width:0;height:3pt" o:hralign="center" o:hrstd="t" o:hr="t" fillcolor="#a0a0a0" stroked="f"/>
+          <v:rect id="_x0000_i1043" style="width:0;height:3pt" o:hralign="center" o:hrstd="t" o:hr="t" fillcolor="#a0a0a0" stroked="f"/>
         </w:pict>
       </w:r>
     </w:p>
@@ -11385,7 +11465,7 @@
     <w:p>
       <w:r>
         <w:pict w14:anchorId="346E5BBF">
-          <v:rect id="_x0000_i1045" style="width:0;height:3pt" o:hralign="center" o:hrstd="t" o:hr="t" fillcolor="#a0a0a0" stroked="f"/>
+          <v:rect id="_x0000_i1044" style="width:0;height:3pt" o:hralign="center" o:hrstd="t" o:hr="t" fillcolor="#a0a0a0" stroked="f"/>
         </w:pict>
       </w:r>
     </w:p>
@@ -11902,6 +11982,59 @@
     <w:p>
       <w:r>
         <w:pict w14:anchorId="08C27FFD">
+          <v:rect id="_x0000_i1045" style="width:0;height:3pt" o:hralign="center" o:hrstd="t" o:hr="t" fillcolor="#a0a0a0" stroked="f"/>
+        </w:pict>
+      </w:r>
+    </w:p>
+    <w:p>
+      <w:pPr>
+        <w:rPr>
+          <w:b/>
+          <w:bCs/>
+        </w:rPr>
+      </w:pPr>
+      <w:r>
+        <w:rPr>
+          <w:b/>
+          <w:bCs/>
+        </w:rPr>
+        <w:t>APÉNDICE — CASOS DE PRUEBA</w:t>
+      </w:r>
+    </w:p>
+    <w:p>
+      <w:r>
+        <w:t>Todos los </w:t>
+      </w:r>
+      <w:proofErr w:type="spellStart"/>
+      <w:r>
+        <w:t>curl</w:t>
+      </w:r>
+      <w:proofErr w:type="spellEnd"/>
+      <w:r>
+        <w:t> van dirigidos al </w:t>
+      </w:r>
+      <w:r>
+        <w:rPr>
+          <w:b/>
+          <w:bCs/>
+        </w:rPr>
+        <w:t>API Gateway</w:t>
+      </w:r>
+      <w:r>
+        <w:t xml:space="preserve"> (localhost:8080), nunca directamente a los microservicios. Adapta las rutas al diseño que hayas implementado; si cambias alguna ruta, documéntala en el README.md. Reemplaza TOKEN por el JWT obtenido en el caso de </w:t>
+      </w:r>
+      <w:proofErr w:type="spellStart"/>
+      <w:r>
+        <w:t>login</w:t>
+      </w:r>
+      <w:proofErr w:type="spellEnd"/>
+      <w:r>
+        <w:t>. Reemplaza {id} por el UUID real del recurso.</w:t>
+      </w:r>
+    </w:p>
+    <w:p>
+      <w:r>
+        <w:pict w14:anchorId="28B4B8F8">
           <v:rect id="_x0000_i1046" style="width:0;height:3pt" o:hralign="center" o:hrstd="t" o:hr="t" fillcolor="#a0a0a0" stroked="f"/>
         </w:pict>
       </w:r>
@@ -11918,43 +12051,273 @@
           <w:b/>
           <w:bCs/>
         </w:rPr>
-        <w:t>APÉNDICE — CASOS DE PRUEBA</w:t>
-      </w:r>
-    </w:p>
-    <w:p>
-      <w:r>
-        <w:t>Todos los </w:t>
-      </w:r>
+        <w:t>Autenticación</w:t>
+      </w:r>
+    </w:p>
+    <w:p>
+      <w:r>
+        <w:rPr>
+          <w:b/>
+          <w:bCs/>
+        </w:rPr>
+        <w:t>Caso 1 — Registro de usuario</w:t>
+      </w:r>
+    </w:p>
+    <w:p>
       <w:proofErr w:type="spellStart"/>
       <w:r>
         <w:t>curl</w:t>
       </w:r>
       <w:proofErr w:type="spellEnd"/>
       <w:r>
-        <w:t> van dirigidos al </w:t>
-      </w:r>
-      <w:r>
-        <w:rPr>
-          <w:b/>
-          <w:bCs/>
-        </w:rPr>
-        <w:t>API Gateway</w:t>
-      </w:r>
-      <w:r>
-        <w:t xml:space="preserve"> (localhost:8080), nunca directamente a los microservicios. Adapta las rutas al diseño que hayas implementado; si cambias alguna ruta, documéntala en el README.md. Reemplaza TOKEN por el JWT obtenido en el caso de </w:t>
-      </w:r>
-      <w:proofErr w:type="spellStart"/>
-      <w:r>
-        <w:t>login</w:t>
-      </w:r>
-      <w:proofErr w:type="spellEnd"/>
-      <w:r>
-        <w:t>. Reemplaza {id} por el UUID real del recurso.</w:t>
-      </w:r>
-    </w:p>
-    <w:p>
-      <w:r>
-        <w:pict w14:anchorId="28B4B8F8">
+        <w:t xml:space="preserve"> -s -X POST http://localhost:8080/api/v1/auth/register \</w:t>
+      </w:r>
+    </w:p>
+    <w:p>
+      <w:r>
+        <w:t xml:space="preserve">  -H "Content-</w:t>
+      </w:r>
+      <w:proofErr w:type="spellStart"/>
+      <w:r>
+        <w:t>Type</w:t>
+      </w:r>
+      <w:proofErr w:type="spellEnd"/>
+      <w:r>
+        <w:t xml:space="preserve">: </w:t>
+      </w:r>
+      <w:proofErr w:type="spellStart"/>
+      <w:r>
+        <w:t>application</w:t>
+      </w:r>
+      <w:proofErr w:type="spellEnd"/>
+      <w:r>
+        <w:t>/</w:t>
+      </w:r>
+      <w:proofErr w:type="spellStart"/>
+      <w:r>
+        <w:t>json</w:t>
+      </w:r>
+      <w:proofErr w:type="spellEnd"/>
+      <w:r>
+        <w:t>" \</w:t>
+      </w:r>
+    </w:p>
+    <w:p>
+      <w:r>
+        <w:t xml:space="preserve">  -d '{"</w:t>
+      </w:r>
+      <w:proofErr w:type="spellStart"/>
+      <w:r>
+        <w:t>nombre":"Carlos</w:t>
+      </w:r>
+      <w:proofErr w:type="spellEnd"/>
+      <w:r>
+        <w:t xml:space="preserve"> Quispe","email":"carlos@rapidocourier.pe","password":"Segura123!","role":"OPERADOR"}' | </w:t>
+      </w:r>
+      <w:proofErr w:type="spellStart"/>
+      <w:proofErr w:type="gramStart"/>
+      <w:r>
+        <w:t>jq</w:t>
+      </w:r>
+      <w:proofErr w:type="spellEnd"/>
+      <w:r>
+        <w:t xml:space="preserve"> .</w:t>
+      </w:r>
+      <w:proofErr w:type="gramEnd"/>
+    </w:p>
+    <w:p>
+      <w:r>
+        <w:t xml:space="preserve">Esperado: 201 </w:t>
+      </w:r>
+      <w:proofErr w:type="spellStart"/>
+      <w:r>
+        <w:t>Created</w:t>
+      </w:r>
+      <w:proofErr w:type="spellEnd"/>
+      <w:r>
+        <w:t> — </w:t>
+      </w:r>
+      <w:proofErr w:type="spellStart"/>
+      <w:r>
+        <w:t>success</w:t>
+      </w:r>
+      <w:proofErr w:type="spellEnd"/>
+      <w:r>
+        <w:t>: true, JWT en data.</w:t>
+      </w:r>
+    </w:p>
+    <w:p>
+      <w:r>
+        <w:rPr>
+          <w:b/>
+          <w:bCs/>
+        </w:rPr>
+        <w:t>Caso 2 — Login exitoso</w:t>
+      </w:r>
+    </w:p>
+    <w:p>
+      <w:proofErr w:type="spellStart"/>
+      <w:r>
+        <w:lastRenderedPageBreak/>
+        <w:t>curl</w:t>
+      </w:r>
+      <w:proofErr w:type="spellEnd"/>
+      <w:r>
+        <w:t xml:space="preserve"> -s -X POST http://localhost:8080/api/v1/auth/login \</w:t>
+      </w:r>
+    </w:p>
+    <w:p>
+      <w:r>
+        <w:t xml:space="preserve">  -H "Content-</w:t>
+      </w:r>
+      <w:proofErr w:type="spellStart"/>
+      <w:r>
+        <w:t>Type</w:t>
+      </w:r>
+      <w:proofErr w:type="spellEnd"/>
+      <w:r>
+        <w:t xml:space="preserve">: </w:t>
+      </w:r>
+      <w:proofErr w:type="spellStart"/>
+      <w:r>
+        <w:t>application</w:t>
+      </w:r>
+      <w:proofErr w:type="spellEnd"/>
+      <w:r>
+        <w:t>/</w:t>
+      </w:r>
+      <w:proofErr w:type="spellStart"/>
+      <w:r>
+        <w:t>json</w:t>
+      </w:r>
+      <w:proofErr w:type="spellEnd"/>
+      <w:r>
+        <w:t>" \</w:t>
+      </w:r>
+    </w:p>
+    <w:p>
+      <w:r>
+        <w:t xml:space="preserve">  -d '{"email":"carlos@rapidocourier.pe","password":"Segura123!"}' | </w:t>
+      </w:r>
+      <w:proofErr w:type="spellStart"/>
+      <w:proofErr w:type="gramStart"/>
+      <w:r>
+        <w:t>jq</w:t>
+      </w:r>
+      <w:proofErr w:type="spellEnd"/>
+      <w:r>
+        <w:t xml:space="preserve"> .</w:t>
+      </w:r>
+      <w:proofErr w:type="gramEnd"/>
+    </w:p>
+    <w:p>
+      <w:r>
+        <w:t>Esperado: 200 OK — </w:t>
+      </w:r>
+      <w:proofErr w:type="spellStart"/>
+      <w:r>
+        <w:t>success</w:t>
+      </w:r>
+      <w:proofErr w:type="spellEnd"/>
+      <w:r>
+        <w:t>: true, JWT válido en data.</w:t>
+      </w:r>
+    </w:p>
+    <w:p>
+      <w:r>
+        <w:rPr>
+          <w:b/>
+          <w:bCs/>
+        </w:rPr>
+        <w:t>Caso 3 — Login con credenciales incorrectas</w:t>
+      </w:r>
+    </w:p>
+    <w:p>
+      <w:proofErr w:type="spellStart"/>
+      <w:r>
+        <w:t>curl</w:t>
+      </w:r>
+      <w:proofErr w:type="spellEnd"/>
+      <w:r>
+        <w:t xml:space="preserve"> -s -X POST http://localhost:8080/api/v1/auth/login \</w:t>
+      </w:r>
+    </w:p>
+    <w:p>
+      <w:r>
+        <w:t xml:space="preserve">  -H "Content-</w:t>
+      </w:r>
+      <w:proofErr w:type="spellStart"/>
+      <w:r>
+        <w:t>Type</w:t>
+      </w:r>
+      <w:proofErr w:type="spellEnd"/>
+      <w:r>
+        <w:t xml:space="preserve">: </w:t>
+      </w:r>
+      <w:proofErr w:type="spellStart"/>
+      <w:r>
+        <w:t>application</w:t>
+      </w:r>
+      <w:proofErr w:type="spellEnd"/>
+      <w:r>
+        <w:t>/</w:t>
+      </w:r>
+      <w:proofErr w:type="spellStart"/>
+      <w:r>
+        <w:t>json</w:t>
+      </w:r>
+      <w:proofErr w:type="spellEnd"/>
+      <w:r>
+        <w:t>" \</w:t>
+      </w:r>
+    </w:p>
+    <w:p>
+      <w:r>
+        <w:t xml:space="preserve">  -d '{"email":"carlos@rapidocourier.pe","</w:t>
+      </w:r>
+      <w:proofErr w:type="spellStart"/>
+      <w:r>
+        <w:t>password</w:t>
+      </w:r>
+      <w:proofErr w:type="spellEnd"/>
+      <w:r>
+        <w:t xml:space="preserve">":"incorrecta"}' | </w:t>
+      </w:r>
+      <w:proofErr w:type="spellStart"/>
+      <w:proofErr w:type="gramStart"/>
+      <w:r>
+        <w:t>jq</w:t>
+      </w:r>
+      <w:proofErr w:type="spellEnd"/>
+      <w:r>
+        <w:t xml:space="preserve"> .</w:t>
+      </w:r>
+      <w:proofErr w:type="gramEnd"/>
+    </w:p>
+    <w:p>
+      <w:r>
+        <w:t xml:space="preserve">Esperado: 401 </w:t>
+      </w:r>
+      <w:proofErr w:type="spellStart"/>
+      <w:r>
+        <w:t>Unauthorized</w:t>
+      </w:r>
+      <w:proofErr w:type="spellEnd"/>
+      <w:r>
+        <w:t> — </w:t>
+      </w:r>
+      <w:proofErr w:type="spellStart"/>
+      <w:r>
+        <w:t>success</w:t>
+      </w:r>
+      <w:proofErr w:type="spellEnd"/>
+      <w:r>
+        <w:t>: false.</w:t>
+      </w:r>
+    </w:p>
+    <w:p>
+      <w:r>
+        <w:pict w14:anchorId="3828D471">
           <v:rect id="_x0000_i1047" style="width:0;height:3pt" o:hralign="center" o:hrstd="t" o:hr="t" fillcolor="#a0a0a0" stroked="f"/>
         </w:pict>
       </w:r>
@@ -11971,16 +12334,16 @@
           <w:b/>
           <w:bCs/>
         </w:rPr>
-        <w:t>Autenticación</w:t>
-      </w:r>
-    </w:p>
-    <w:p>
-      <w:r>
-        <w:rPr>
-          <w:b/>
-          <w:bCs/>
-        </w:rPr>
-        <w:t>Caso 1 — Registro de usuario</w:t>
+        <w:t>Clientes (RF-01)</w:t>
+      </w:r>
+    </w:p>
+    <w:p>
+      <w:r>
+        <w:rPr>
+          <w:b/>
+          <w:bCs/>
+        </w:rPr>
+        <w:t>Caso 4 — Registro de cliente con consulta RENIEC</w:t>
       </w:r>
     </w:p>
     <w:p>
@@ -11990,7 +12353,7 @@
       </w:r>
       <w:proofErr w:type="spellEnd"/>
       <w:r>
-        <w:t xml:space="preserve"> -s -X POST http://localhost:8080/api/v1/auth/register \</w:t>
+        <w:t xml:space="preserve"> -s -X POST http://localhost:8080/api/v1/clientes \</w:t>
       </w:r>
     </w:p>
     <w:p>
@@ -12024,19 +12387,512 @@
     </w:p>
     <w:p>
       <w:r>
+        <w:t xml:space="preserve">  -H "</w:t>
+      </w:r>
+      <w:proofErr w:type="spellStart"/>
+      <w:r>
+        <w:t>Authorization</w:t>
+      </w:r>
+      <w:proofErr w:type="spellEnd"/>
+      <w:r>
+        <w:t>: Bearer TOKEN" \</w:t>
+      </w:r>
+    </w:p>
+    <w:p>
+      <w:r>
+        <w:t xml:space="preserve">  -d '{"dni":"12345678","email":"ana.flores@correo.com","telefono":"987654321"}' | </w:t>
+      </w:r>
+      <w:proofErr w:type="spellStart"/>
+      <w:proofErr w:type="gramStart"/>
+      <w:r>
+        <w:t>jq</w:t>
+      </w:r>
+      <w:proofErr w:type="spellEnd"/>
+      <w:r>
+        <w:t xml:space="preserve"> .</w:t>
+      </w:r>
+      <w:proofErr w:type="gramEnd"/>
+    </w:p>
+    <w:p>
+      <w:r>
+        <w:t xml:space="preserve">Esperado: 201 </w:t>
+      </w:r>
+      <w:proofErr w:type="spellStart"/>
+      <w:r>
+        <w:t>Created</w:t>
+      </w:r>
+      <w:proofErr w:type="spellEnd"/>
+      <w:r>
+        <w:t xml:space="preserve"> — nombre completo obtenido de RENIEC visible en data; el campo nombre no estaba en el </w:t>
+      </w:r>
+      <w:proofErr w:type="spellStart"/>
+      <w:r>
+        <w:t>request</w:t>
+      </w:r>
+      <w:proofErr w:type="spellEnd"/>
+      <w:r>
+        <w:t>.</w:t>
+      </w:r>
+    </w:p>
+    <w:p>
+      <w:r>
+        <w:rPr>
+          <w:b/>
+          <w:bCs/>
+        </w:rPr>
+        <w:t>Caso 5 — Email duplicado en registro de cliente</w:t>
+      </w:r>
+    </w:p>
+    <w:p>
+      <w:proofErr w:type="spellStart"/>
+      <w:r>
+        <w:t>curl</w:t>
+      </w:r>
+      <w:proofErr w:type="spellEnd"/>
+      <w:r>
+        <w:t xml:space="preserve"> -s -X POST http://localhost:8080/api/v1/clientes \</w:t>
+      </w:r>
+    </w:p>
+    <w:p>
+      <w:r>
+        <w:t xml:space="preserve">  -H "Content-</w:t>
+      </w:r>
+      <w:proofErr w:type="spellStart"/>
+      <w:r>
+        <w:t>Type</w:t>
+      </w:r>
+      <w:proofErr w:type="spellEnd"/>
+      <w:r>
+        <w:t xml:space="preserve">: </w:t>
+      </w:r>
+      <w:proofErr w:type="spellStart"/>
+      <w:r>
+        <w:t>application</w:t>
+      </w:r>
+      <w:proofErr w:type="spellEnd"/>
+      <w:r>
+        <w:t>/</w:t>
+      </w:r>
+      <w:proofErr w:type="spellStart"/>
+      <w:r>
+        <w:t>json</w:t>
+      </w:r>
+      <w:proofErr w:type="spellEnd"/>
+      <w:r>
+        <w:t>" \</w:t>
+      </w:r>
+    </w:p>
+    <w:p>
+      <w:r>
+        <w:t xml:space="preserve">  -H "</w:t>
+      </w:r>
+      <w:proofErr w:type="spellStart"/>
+      <w:r>
+        <w:t>Authorization</w:t>
+      </w:r>
+      <w:proofErr w:type="spellEnd"/>
+      <w:r>
+        <w:t>: Bearer TOKEN" \</w:t>
+      </w:r>
+    </w:p>
+    <w:p>
+      <w:r>
+        <w:t xml:space="preserve">  -d '{"dni":"87654321","email":"ana.flores@correo.com","telefono":"999888777"}' | </w:t>
+      </w:r>
+      <w:proofErr w:type="spellStart"/>
+      <w:proofErr w:type="gramStart"/>
+      <w:r>
+        <w:t>jq</w:t>
+      </w:r>
+      <w:proofErr w:type="spellEnd"/>
+      <w:r>
+        <w:t xml:space="preserve"> .</w:t>
+      </w:r>
+      <w:proofErr w:type="gramEnd"/>
+    </w:p>
+    <w:p>
+      <w:r>
+        <w:t xml:space="preserve">Esperado: 409 </w:t>
+      </w:r>
+      <w:proofErr w:type="spellStart"/>
+      <w:r>
+        <w:t>Conflict</w:t>
+      </w:r>
+      <w:proofErr w:type="spellEnd"/>
+      <w:r>
+        <w:t> — </w:t>
+      </w:r>
+      <w:proofErr w:type="spellStart"/>
+      <w:r>
+        <w:t>success</w:t>
+      </w:r>
+      <w:proofErr w:type="spellEnd"/>
+      <w:r>
+        <w:t>: false, mensaje indica email ya registrado.</w:t>
+      </w:r>
+    </w:p>
+    <w:p>
+      <w:r>
+        <w:rPr>
+          <w:b/>
+          <w:bCs/>
+        </w:rPr>
+        <w:t>Caso 6 — Datos inválidos en registro de cliente</w:t>
+      </w:r>
+    </w:p>
+    <w:p>
+      <w:proofErr w:type="spellStart"/>
+      <w:r>
+        <w:t>curl</w:t>
+      </w:r>
+      <w:proofErr w:type="spellEnd"/>
+      <w:r>
+        <w:t xml:space="preserve"> -s -X POST http://localhost:8080/api/v1/clientes \</w:t>
+      </w:r>
+    </w:p>
+    <w:p>
+      <w:r>
+        <w:t xml:space="preserve">  -H "Content-</w:t>
+      </w:r>
+      <w:proofErr w:type="spellStart"/>
+      <w:r>
+        <w:t>Type</w:t>
+      </w:r>
+      <w:proofErr w:type="spellEnd"/>
+      <w:r>
+        <w:t xml:space="preserve">: </w:t>
+      </w:r>
+      <w:proofErr w:type="spellStart"/>
+      <w:r>
+        <w:t>application</w:t>
+      </w:r>
+      <w:proofErr w:type="spellEnd"/>
+      <w:r>
+        <w:t>/</w:t>
+      </w:r>
+      <w:proofErr w:type="spellStart"/>
+      <w:r>
+        <w:t>json</w:t>
+      </w:r>
+      <w:proofErr w:type="spellEnd"/>
+      <w:r>
+        <w:t>" \</w:t>
+      </w:r>
+    </w:p>
+    <w:p>
+      <w:r>
+        <w:t xml:space="preserve">  -H "</w:t>
+      </w:r>
+      <w:proofErr w:type="spellStart"/>
+      <w:r>
+        <w:t>Authorization</w:t>
+      </w:r>
+      <w:proofErr w:type="spellEnd"/>
+      <w:r>
+        <w:t>: Bearer TOKEN" \</w:t>
+      </w:r>
+    </w:p>
+    <w:p>
+      <w:r>
+        <w:t xml:space="preserve">  -d '{"dni":"123","email":"correo-invalido","telefono":""}' | </w:t>
+      </w:r>
+      <w:proofErr w:type="spellStart"/>
+      <w:proofErr w:type="gramStart"/>
+      <w:r>
+        <w:t>jq</w:t>
+      </w:r>
+      <w:proofErr w:type="spellEnd"/>
+      <w:r>
+        <w:t xml:space="preserve"> .</w:t>
+      </w:r>
+      <w:proofErr w:type="gramEnd"/>
+    </w:p>
+    <w:p>
+      <w:r>
+        <w:t xml:space="preserve">Esperado: 400 Bad </w:t>
+      </w:r>
+      <w:proofErr w:type="spellStart"/>
+      <w:r>
+        <w:t>Request</w:t>
+      </w:r>
+      <w:proofErr w:type="spellEnd"/>
+      <w:r>
+        <w:t> — </w:t>
+      </w:r>
+      <w:proofErr w:type="spellStart"/>
+      <w:r>
+        <w:t>success</w:t>
+      </w:r>
+      <w:proofErr w:type="spellEnd"/>
+      <w:r>
+        <w:t>: false, data con mapa de errores agrupado por campo.</w:t>
+      </w:r>
+    </w:p>
+    <w:p>
+      <w:r>
+        <w:pict w14:anchorId="116ABE6F">
+          <v:rect id="_x0000_i1048" style="width:0;height:3pt" o:hralign="center" o:hrstd="t" o:hr="t" fillcolor="#a0a0a0" stroked="f"/>
+        </w:pict>
+      </w:r>
+    </w:p>
+    <w:p>
+      <w:pPr>
+        <w:rPr>
+          <w:b/>
+          <w:bCs/>
+        </w:rPr>
+      </w:pPr>
+      <w:r>
+        <w:rPr>
+          <w:b/>
+          <w:bCs/>
+        </w:rPr>
+        <w:lastRenderedPageBreak/>
+        <w:t>Paquetes (RF-02, RF-03, RF-04)</w:t>
+      </w:r>
+    </w:p>
+    <w:p>
+      <w:r>
+        <w:rPr>
+          <w:b/>
+          <w:bCs/>
+        </w:rPr>
+        <w:t>Caso 7 — Registro de paquete con tarifa calculada</w:t>
+      </w:r>
+    </w:p>
+    <w:p>
+      <w:proofErr w:type="spellStart"/>
+      <w:r>
+        <w:t>curl</w:t>
+      </w:r>
+      <w:proofErr w:type="spellEnd"/>
+      <w:r>
+        <w:t xml:space="preserve"> -s -X POST http://localhost:8080/api/v1/paquetes \</w:t>
+      </w:r>
+    </w:p>
+    <w:p>
+      <w:r>
+        <w:t xml:space="preserve">  -H "Content-</w:t>
+      </w:r>
+      <w:proofErr w:type="spellStart"/>
+      <w:r>
+        <w:t>Type</w:t>
+      </w:r>
+      <w:proofErr w:type="spellEnd"/>
+      <w:r>
+        <w:t xml:space="preserve">: </w:t>
+      </w:r>
+      <w:proofErr w:type="spellStart"/>
+      <w:r>
+        <w:t>application</w:t>
+      </w:r>
+      <w:proofErr w:type="spellEnd"/>
+      <w:r>
+        <w:t>/</w:t>
+      </w:r>
+      <w:proofErr w:type="spellStart"/>
+      <w:r>
+        <w:t>json</w:t>
+      </w:r>
+      <w:proofErr w:type="spellEnd"/>
+      <w:r>
+        <w:t>" \</w:t>
+      </w:r>
+    </w:p>
+    <w:p>
+      <w:r>
+        <w:t xml:space="preserve">  -H "</w:t>
+      </w:r>
+      <w:proofErr w:type="spellStart"/>
+      <w:r>
+        <w:t>Authorization</w:t>
+      </w:r>
+      <w:proofErr w:type="spellEnd"/>
+      <w:r>
+        <w:t>: Bearer TOKEN" \</w:t>
+      </w:r>
+    </w:p>
+    <w:p>
+      <w:r>
+        <w:t xml:space="preserve">  -d '{</w:t>
+      </w:r>
+    </w:p>
+    <w:p>
+      <w:r>
+        <w:t xml:space="preserve">    "</w:t>
+      </w:r>
+      <w:proofErr w:type="spellStart"/>
+      <w:r>
+        <w:t>descripcion</w:t>
+      </w:r>
+      <w:proofErr w:type="spellEnd"/>
+      <w:r>
+        <w:t>":"Documentos legales",</w:t>
+      </w:r>
+    </w:p>
+    <w:p>
+      <w:r>
+        <w:t xml:space="preserve">    "pesoKg":1.5,</w:t>
+      </w:r>
+    </w:p>
+    <w:p>
+      <w:r>
+        <w:t xml:space="preserve">    "valorDeclarado":200.00,</w:t>
+      </w:r>
+    </w:p>
+    <w:p>
+      <w:r>
+        <w:t xml:space="preserve">    "</w:t>
+      </w:r>
+      <w:proofErr w:type="spellStart"/>
+      <w:r>
+        <w:t>sucursalOrigen</w:t>
+      </w:r>
+      <w:proofErr w:type="spellEnd"/>
+      <w:r>
+        <w:t>":"Lima",</w:t>
+      </w:r>
+    </w:p>
+    <w:p>
+      <w:r>
+        <w:t xml:space="preserve">    "</w:t>
+      </w:r>
+      <w:proofErr w:type="spellStart"/>
+      <w:r>
+        <w:t>sucursalDestino</w:t>
+      </w:r>
+      <w:proofErr w:type="spellEnd"/>
+      <w:r>
+        <w:t>":"Arequipa",</w:t>
+      </w:r>
+    </w:p>
+    <w:p>
+      <w:r>
+        <w:t xml:space="preserve">    "dniRemitente":"12345678",</w:t>
+      </w:r>
+    </w:p>
+    <w:p>
+      <w:r>
+        <w:t xml:space="preserve">    "dniDestinatario":"87654321"</w:t>
+      </w:r>
+    </w:p>
+    <w:p>
+      <w:r>
+        <w:t xml:space="preserve">  }' | </w:t>
+      </w:r>
+      <w:proofErr w:type="spellStart"/>
+      <w:proofErr w:type="gramStart"/>
+      <w:r>
+        <w:t>jq</w:t>
+      </w:r>
+      <w:proofErr w:type="spellEnd"/>
+      <w:r>
+        <w:t xml:space="preserve"> .</w:t>
+      </w:r>
+      <w:proofErr w:type="gramEnd"/>
+    </w:p>
+    <w:p>
+      <w:r>
+        <w:t xml:space="preserve">Esperado: 201 </w:t>
+      </w:r>
+      <w:proofErr w:type="spellStart"/>
+      <w:r>
+        <w:t>Created</w:t>
+      </w:r>
+      <w:proofErr w:type="spellEnd"/>
+      <w:r>
+        <w:t> — código de rastreo generado y tarifa calculada visibles en data.</w:t>
+      </w:r>
+    </w:p>
+    <w:p>
+      <w:r>
+        <w:rPr>
+          <w:b/>
+          <w:bCs/>
+        </w:rPr>
+        <w:t>Caso 8 — Datos inválidos en registro de paquete</w:t>
+      </w:r>
+    </w:p>
+    <w:p>
+      <w:proofErr w:type="spellStart"/>
+      <w:r>
+        <w:t>curl</w:t>
+      </w:r>
+      <w:proofErr w:type="spellEnd"/>
+      <w:r>
+        <w:t xml:space="preserve"> -s -X POST http://localhost:8080/api/v1/paquetes \</w:t>
+      </w:r>
+    </w:p>
+    <w:p>
+      <w:r>
+        <w:t xml:space="preserve">  -H "Content-</w:t>
+      </w:r>
+      <w:proofErr w:type="spellStart"/>
+      <w:r>
+        <w:t>Type</w:t>
+      </w:r>
+      <w:proofErr w:type="spellEnd"/>
+      <w:r>
+        <w:t xml:space="preserve">: </w:t>
+      </w:r>
+      <w:proofErr w:type="spellStart"/>
+      <w:r>
+        <w:t>application</w:t>
+      </w:r>
+      <w:proofErr w:type="spellEnd"/>
+      <w:r>
+        <w:t>/</w:t>
+      </w:r>
+      <w:proofErr w:type="spellStart"/>
+      <w:r>
+        <w:t>json</w:t>
+      </w:r>
+      <w:proofErr w:type="spellEnd"/>
+      <w:r>
+        <w:t>" \</w:t>
+      </w:r>
+    </w:p>
+    <w:p>
+      <w:r>
+        <w:t xml:space="preserve">  -H "</w:t>
+      </w:r>
+      <w:proofErr w:type="spellStart"/>
+      <w:r>
+        <w:t>Authorization</w:t>
+      </w:r>
+      <w:proofErr w:type="spellEnd"/>
+      <w:r>
+        <w:t>: Bearer TOKEN" \</w:t>
+      </w:r>
+    </w:p>
+    <w:p>
+      <w:r>
         <w:t xml:space="preserve">  -d '{"</w:t>
       </w:r>
       <w:proofErr w:type="spellStart"/>
       <w:r>
-        <w:t>nombre":"Carlos</w:t>
-      </w:r>
-      <w:proofErr w:type="spellEnd"/>
-      <w:r>
-        <w:t xml:space="preserve"> Quispe","email":"carlos@rapidocourier.pe","password":"Segura123!","role":"OPERADOR"}' | </w:t>
-      </w:r>
-      <w:proofErr w:type="spellStart"/>
+        <w:t>descripcion</w:t>
+      </w:r>
+      <w:proofErr w:type="spellEnd"/>
+      <w:r>
+        <w:t>":"","</w:t>
+      </w:r>
+      <w:proofErr w:type="spellStart"/>
+      <w:r>
+        <w:t>pesoKg</w:t>
+      </w:r>
+      <w:proofErr w:type="spellEnd"/>
       <w:proofErr w:type="gramStart"/>
       <w:r>
+        <w:t>":-</w:t>
+      </w:r>
+      <w:proofErr w:type="gramEnd"/>
+      <w:r>
+        <w:t xml:space="preserve">1,"valorDeclarado":0}' | </w:t>
+      </w:r>
+      <w:proofErr w:type="spellStart"/>
+      <w:proofErr w:type="gramStart"/>
+      <w:r>
         <w:t>jq</w:t>
       </w:r>
       <w:proofErr w:type="spellEnd"/>
@@ -12047,15 +12903,109 @@
     </w:p>
     <w:p>
       <w:r>
-        <w:t xml:space="preserve">Esperado: 201 </w:t>
-      </w:r>
-      <w:proofErr w:type="spellStart"/>
-      <w:r>
-        <w:t>Created</w:t>
-      </w:r>
-      <w:proofErr w:type="spellEnd"/>
-      <w:r>
-        <w:t> — </w:t>
+        <w:t xml:space="preserve">Esperado: 400 Bad </w:t>
+      </w:r>
+      <w:proofErr w:type="spellStart"/>
+      <w:r>
+        <w:t>Request</w:t>
+      </w:r>
+      <w:proofErr w:type="spellEnd"/>
+      <w:r>
+        <w:t> — mapa de errores por campo en data.</w:t>
+      </w:r>
+    </w:p>
+    <w:p>
+      <w:r>
+        <w:rPr>
+          <w:b/>
+          <w:bCs/>
+        </w:rPr>
+        <w:t>Caso 9 — Consulta de paquete por ID existente</w:t>
+      </w:r>
+    </w:p>
+    <w:p>
+      <w:proofErr w:type="spellStart"/>
+      <w:r>
+        <w:t>curl</w:t>
+      </w:r>
+      <w:proofErr w:type="spellEnd"/>
+      <w:r>
+        <w:t xml:space="preserve"> -s -X GET http://localhost:8080/api/v1/paquetes/{id} \</w:t>
+      </w:r>
+    </w:p>
+    <w:p>
+      <w:r>
+        <w:t xml:space="preserve">  -H "</w:t>
+      </w:r>
+      <w:proofErr w:type="spellStart"/>
+      <w:r>
+        <w:t>Authorization</w:t>
+      </w:r>
+      <w:proofErr w:type="spellEnd"/>
+      <w:r>
+        <w:t xml:space="preserve">: Bearer TOKEN" | </w:t>
+      </w:r>
+      <w:proofErr w:type="spellStart"/>
+      <w:proofErr w:type="gramStart"/>
+      <w:r>
+        <w:t>jq</w:t>
+      </w:r>
+      <w:proofErr w:type="spellEnd"/>
+      <w:r>
+        <w:t xml:space="preserve"> .</w:t>
+      </w:r>
+      <w:proofErr w:type="gramEnd"/>
+    </w:p>
+    <w:p>
+      <w:r>
+        <w:t>Esperado: 200 OK — datos del paquete incluyendo nombre del remitente y destinatario en data.</w:t>
+      </w:r>
+    </w:p>
+    <w:p>
+      <w:r>
+        <w:rPr>
+          <w:b/>
+          <w:bCs/>
+        </w:rPr>
+        <w:t>Caso 10 — Consulta de paquete por ID inexistente</w:t>
+      </w:r>
+    </w:p>
+    <w:p>
+      <w:proofErr w:type="spellStart"/>
+      <w:r>
+        <w:t>curl</w:t>
+      </w:r>
+      <w:proofErr w:type="spellEnd"/>
+      <w:r>
+        <w:t xml:space="preserve"> -s -X GET http://localhost:8080/api/v1/paquetes/00000000-0000-0000-0000-000000000000 \</w:t>
+      </w:r>
+    </w:p>
+    <w:p>
+      <w:r>
+        <w:t xml:space="preserve">  -H "</w:t>
+      </w:r>
+      <w:proofErr w:type="spellStart"/>
+      <w:r>
+        <w:t>Authorization</w:t>
+      </w:r>
+      <w:proofErr w:type="spellEnd"/>
+      <w:r>
+        <w:t xml:space="preserve">: Bearer TOKEN" | </w:t>
+      </w:r>
+      <w:proofErr w:type="spellStart"/>
+      <w:proofErr w:type="gramStart"/>
+      <w:r>
+        <w:t>jq</w:t>
+      </w:r>
+      <w:proofErr w:type="spellEnd"/>
+      <w:r>
+        <w:t xml:space="preserve"> .</w:t>
+      </w:r>
+      <w:proofErr w:type="gramEnd"/>
+    </w:p>
+    <w:p>
+      <w:r>
+        <w:t>Esperado: 404 Not Found — </w:t>
       </w:r>
       <w:proofErr w:type="spellStart"/>
       <w:r>
@@ -12063,16 +13013,16 @@
       </w:r>
       <w:proofErr w:type="spellEnd"/>
       <w:r>
-        <w:t>: true, JWT en data.</w:t>
-      </w:r>
-    </w:p>
-    <w:p>
-      <w:r>
-        <w:rPr>
-          <w:b/>
-          <w:bCs/>
-        </w:rPr>
-        <w:t>Caso 2 — Login exitoso</w:t>
+        <w:t>: false.</w:t>
+      </w:r>
+    </w:p>
+    <w:p>
+      <w:r>
+        <w:rPr>
+          <w:b/>
+          <w:bCs/>
+        </w:rPr>
+        <w:t>Caso 11 — Actualización de estado: transición válida (RF-04)</w:t>
       </w:r>
     </w:p>
     <w:p>
@@ -12083,7 +13033,7 @@
       </w:r>
       <w:proofErr w:type="spellEnd"/>
       <w:r>
-        <w:t xml:space="preserve"> -s -X POST http://localhost:8080/api/v1/auth/login \</w:t>
+        <w:t xml:space="preserve"> -s -X PATCH http://localhost:8080/api/v1/paquetes/{id}/estado \</w:t>
       </w:r>
     </w:p>
     <w:p>
@@ -12117,7 +13067,28 @@
     </w:p>
     <w:p>
       <w:r>
-        <w:t xml:space="preserve">  -d '{"email":"carlos@rapidocourier.pe","password":"Segura123!"}' | </w:t>
+        <w:t xml:space="preserve">  -H "</w:t>
+      </w:r>
+      <w:proofErr w:type="spellStart"/>
+      <w:r>
+        <w:t>Authorization</w:t>
+      </w:r>
+      <w:proofErr w:type="spellEnd"/>
+      <w:r>
+        <w:t>: Bearer TOKEN" \</w:t>
+      </w:r>
+    </w:p>
+    <w:p>
+      <w:r>
+        <w:t xml:space="preserve">  -d '{"</w:t>
+      </w:r>
+      <w:proofErr w:type="spellStart"/>
+      <w:r>
+        <w:t>nuevoEstado</w:t>
+      </w:r>
+      <w:proofErr w:type="spellEnd"/>
+      <w:r>
+        <w:t xml:space="preserve">":"EN_TRANSITO"}' | </w:t>
       </w:r>
       <w:proofErr w:type="spellStart"/>
       <w:proofErr w:type="gramStart"/>
@@ -12132,24 +13103,16 @@
     </w:p>
     <w:p>
       <w:r>
-        <w:t>Esperado: 200 OK — </w:t>
-      </w:r>
-      <w:proofErr w:type="spellStart"/>
-      <w:r>
-        <w:t>success</w:t>
-      </w:r>
-      <w:proofErr w:type="spellEnd"/>
-      <w:r>
-        <w:t>: true, JWT válido en data.</w:t>
-      </w:r>
-    </w:p>
-    <w:p>
-      <w:r>
-        <w:rPr>
-          <w:b/>
-          <w:bCs/>
-        </w:rPr>
-        <w:t>Caso 3 — Login con credenciales incorrectas</w:t>
+        <w:t>Esperado: 200 OK — paquete con nuevo estado en data.</w:t>
+      </w:r>
+    </w:p>
+    <w:p>
+      <w:r>
+        <w:rPr>
+          <w:b/>
+          <w:bCs/>
+        </w:rPr>
+        <w:t>Caso 12 — Actualización de estado: transición inválida (RF-04)</w:t>
       </w:r>
     </w:p>
     <w:p>
@@ -12159,7 +13122,7 @@
       </w:r>
       <w:proofErr w:type="spellEnd"/>
       <w:r>
-        <w:t xml:space="preserve"> -s -X POST http://localhost:8080/api/v1/auth/login \</w:t>
+        <w:t xml:space="preserve"> -s -X PATCH http://localhost:8080/api/v1/paquetes/{id}/estado \</w:t>
       </w:r>
     </w:p>
     <w:p>
@@ -12193,15 +13156,28 @@
     </w:p>
     <w:p>
       <w:r>
-        <w:t xml:space="preserve">  -d '{"email":"carlos@rapidocourier.pe","</w:t>
-      </w:r>
-      <w:proofErr w:type="spellStart"/>
-      <w:r>
-        <w:t>password</w:t>
-      </w:r>
-      <w:proofErr w:type="spellEnd"/>
-      <w:r>
-        <w:t xml:space="preserve">":"incorrecta"}' | </w:t>
+        <w:t xml:space="preserve">  -H "</w:t>
+      </w:r>
+      <w:proofErr w:type="spellStart"/>
+      <w:r>
+        <w:t>Authorization</w:t>
+      </w:r>
+      <w:proofErr w:type="spellEnd"/>
+      <w:r>
+        <w:t>: Bearer TOKEN" \</w:t>
+      </w:r>
+    </w:p>
+    <w:p>
+      <w:r>
+        <w:t xml:space="preserve">  -d '{"</w:t>
+      </w:r>
+      <w:proofErr w:type="spellStart"/>
+      <w:r>
+        <w:t>nuevoEstado</w:t>
+      </w:r>
+      <w:proofErr w:type="spellEnd"/>
+      <w:r>
+        <w:t xml:space="preserve">":"REGISTRADO"}' | </w:t>
       </w:r>
       <w:proofErr w:type="spellStart"/>
       <w:proofErr w:type="gramStart"/>
@@ -12216,222 +13192,6 @@
     </w:p>
     <w:p>
       <w:r>
-        <w:t xml:space="preserve">Esperado: 401 </w:t>
-      </w:r>
-      <w:proofErr w:type="spellStart"/>
-      <w:r>
-        <w:t>Unauthorized</w:t>
-      </w:r>
-      <w:proofErr w:type="spellEnd"/>
-      <w:r>
-        <w:t> — </w:t>
-      </w:r>
-      <w:proofErr w:type="spellStart"/>
-      <w:r>
-        <w:t>success</w:t>
-      </w:r>
-      <w:proofErr w:type="spellEnd"/>
-      <w:r>
-        <w:t>: false.</w:t>
-      </w:r>
-    </w:p>
-    <w:p>
-      <w:r>
-        <w:pict w14:anchorId="3828D471">
-          <v:rect id="_x0000_i1048" style="width:0;height:3pt" o:hralign="center" o:hrstd="t" o:hr="t" fillcolor="#a0a0a0" stroked="f"/>
-        </w:pict>
-      </w:r>
-    </w:p>
-    <w:p>
-      <w:pPr>
-        <w:rPr>
-          <w:b/>
-          <w:bCs/>
-        </w:rPr>
-      </w:pPr>
-      <w:r>
-        <w:rPr>
-          <w:b/>
-          <w:bCs/>
-        </w:rPr>
-        <w:t>Clientes (RF-01)</w:t>
-      </w:r>
-    </w:p>
-    <w:p>
-      <w:r>
-        <w:rPr>
-          <w:b/>
-          <w:bCs/>
-        </w:rPr>
-        <w:t>Caso 4 — Registro de cliente con consulta RENIEC</w:t>
-      </w:r>
-    </w:p>
-    <w:p>
-      <w:proofErr w:type="spellStart"/>
-      <w:r>
-        <w:t>curl</w:t>
-      </w:r>
-      <w:proofErr w:type="spellEnd"/>
-      <w:r>
-        <w:t xml:space="preserve"> -s -X POST http://localhost:8080/api/v1/clientes \</w:t>
-      </w:r>
-    </w:p>
-    <w:p>
-      <w:r>
-        <w:t xml:space="preserve">  -H "Content-</w:t>
-      </w:r>
-      <w:proofErr w:type="spellStart"/>
-      <w:r>
-        <w:t>Type</w:t>
-      </w:r>
-      <w:proofErr w:type="spellEnd"/>
-      <w:r>
-        <w:t xml:space="preserve">: </w:t>
-      </w:r>
-      <w:proofErr w:type="spellStart"/>
-      <w:r>
-        <w:t>application</w:t>
-      </w:r>
-      <w:proofErr w:type="spellEnd"/>
-      <w:r>
-        <w:t>/</w:t>
-      </w:r>
-      <w:proofErr w:type="spellStart"/>
-      <w:r>
-        <w:t>json</w:t>
-      </w:r>
-      <w:proofErr w:type="spellEnd"/>
-      <w:r>
-        <w:t>" \</w:t>
-      </w:r>
-    </w:p>
-    <w:p>
-      <w:r>
-        <w:t xml:space="preserve">  -H "</w:t>
-      </w:r>
-      <w:proofErr w:type="spellStart"/>
-      <w:r>
-        <w:t>Authorization</w:t>
-      </w:r>
-      <w:proofErr w:type="spellEnd"/>
-      <w:r>
-        <w:t>: Bearer TOKEN" \</w:t>
-      </w:r>
-    </w:p>
-    <w:p>
-      <w:r>
-        <w:t xml:space="preserve">  -d '{"dni":"12345678","email":"ana.flores@correo.com","telefono":"987654321"}' | </w:t>
-      </w:r>
-      <w:proofErr w:type="spellStart"/>
-      <w:proofErr w:type="gramStart"/>
-      <w:r>
-        <w:t>jq</w:t>
-      </w:r>
-      <w:proofErr w:type="spellEnd"/>
-      <w:r>
-        <w:t xml:space="preserve"> .</w:t>
-      </w:r>
-      <w:proofErr w:type="gramEnd"/>
-    </w:p>
-    <w:p>
-      <w:r>
-        <w:t xml:space="preserve">Esperado: 201 </w:t>
-      </w:r>
-      <w:proofErr w:type="spellStart"/>
-      <w:r>
-        <w:t>Created</w:t>
-      </w:r>
-      <w:proofErr w:type="spellEnd"/>
-      <w:r>
-        <w:t xml:space="preserve"> — nombre completo obtenido de RENIEC visible en data; el campo nombre no estaba en el </w:t>
-      </w:r>
-      <w:proofErr w:type="spellStart"/>
-      <w:r>
-        <w:t>request</w:t>
-      </w:r>
-      <w:proofErr w:type="spellEnd"/>
-      <w:r>
-        <w:t>.</w:t>
-      </w:r>
-    </w:p>
-    <w:p>
-      <w:r>
-        <w:rPr>
-          <w:b/>
-          <w:bCs/>
-        </w:rPr>
-        <w:t>Caso 5 — Email duplicado en registro de cliente</w:t>
-      </w:r>
-    </w:p>
-    <w:p>
-      <w:proofErr w:type="spellStart"/>
-      <w:r>
-        <w:t>curl</w:t>
-      </w:r>
-      <w:proofErr w:type="spellEnd"/>
-      <w:r>
-        <w:t xml:space="preserve"> -s -X POST http://localhost:8080/api/v1/clientes \</w:t>
-      </w:r>
-    </w:p>
-    <w:p>
-      <w:r>
-        <w:t xml:space="preserve">  -H "Content-</w:t>
-      </w:r>
-      <w:proofErr w:type="spellStart"/>
-      <w:r>
-        <w:t>Type</w:t>
-      </w:r>
-      <w:proofErr w:type="spellEnd"/>
-      <w:r>
-        <w:t xml:space="preserve">: </w:t>
-      </w:r>
-      <w:proofErr w:type="spellStart"/>
-      <w:r>
-        <w:t>application</w:t>
-      </w:r>
-      <w:proofErr w:type="spellEnd"/>
-      <w:r>
-        <w:t>/</w:t>
-      </w:r>
-      <w:proofErr w:type="spellStart"/>
-      <w:r>
-        <w:t>json</w:t>
-      </w:r>
-      <w:proofErr w:type="spellEnd"/>
-      <w:r>
-        <w:t>" \</w:t>
-      </w:r>
-    </w:p>
-    <w:p>
-      <w:r>
-        <w:t xml:space="preserve">  -H "</w:t>
-      </w:r>
-      <w:proofErr w:type="spellStart"/>
-      <w:r>
-        <w:t>Authorization</w:t>
-      </w:r>
-      <w:proofErr w:type="spellEnd"/>
-      <w:r>
-        <w:t>: Bearer TOKEN" \</w:t>
-      </w:r>
-    </w:p>
-    <w:p>
-      <w:r>
-        <w:t xml:space="preserve">  -d '{"dni":"87654321","email":"ana.flores@correo.com","telefono":"999888777"}' | </w:t>
-      </w:r>
-      <w:proofErr w:type="spellStart"/>
-      <w:proofErr w:type="gramStart"/>
-      <w:r>
-        <w:t>jq</w:t>
-      </w:r>
-      <w:proofErr w:type="spellEnd"/>
-      <w:r>
-        <w:t xml:space="preserve"> .</w:t>
-      </w:r>
-      <w:proofErr w:type="gramEnd"/>
-    </w:p>
-    <w:p>
-      <w:r>
         <w:t xml:space="preserve">Esperado: 409 </w:t>
       </w:r>
       <w:proofErr w:type="spellStart"/>
@@ -12440,117 +13200,12 @@
       </w:r>
       <w:proofErr w:type="spellEnd"/>
       <w:r>
-        <w:t> — </w:t>
-      </w:r>
-      <w:proofErr w:type="spellStart"/>
-      <w:r>
-        <w:t>success</w:t>
-      </w:r>
-      <w:proofErr w:type="spellEnd"/>
-      <w:r>
-        <w:t>: false, mensaje indica email ya registrado.</w:t>
-      </w:r>
-    </w:p>
-    <w:p>
-      <w:r>
-        <w:rPr>
-          <w:b/>
-          <w:bCs/>
-        </w:rPr>
-        <w:t>Caso 6 — Datos inválidos en registro de cliente</w:t>
-      </w:r>
-    </w:p>
-    <w:p>
-      <w:proofErr w:type="spellStart"/>
-      <w:r>
-        <w:t>curl</w:t>
-      </w:r>
-      <w:proofErr w:type="spellEnd"/>
-      <w:r>
-        <w:t xml:space="preserve"> -s -X POST http://localhost:8080/api/v1/clientes \</w:t>
-      </w:r>
-    </w:p>
-    <w:p>
-      <w:r>
-        <w:t xml:space="preserve">  -H "Content-</w:t>
-      </w:r>
-      <w:proofErr w:type="spellStart"/>
-      <w:r>
-        <w:t>Type</w:t>
-      </w:r>
-      <w:proofErr w:type="spellEnd"/>
-      <w:r>
-        <w:t xml:space="preserve">: </w:t>
-      </w:r>
-      <w:proofErr w:type="spellStart"/>
-      <w:r>
-        <w:t>application</w:t>
-      </w:r>
-      <w:proofErr w:type="spellEnd"/>
-      <w:r>
-        <w:t>/</w:t>
-      </w:r>
-      <w:proofErr w:type="spellStart"/>
-      <w:r>
-        <w:t>json</w:t>
-      </w:r>
-      <w:proofErr w:type="spellEnd"/>
-      <w:r>
-        <w:t>" \</w:t>
-      </w:r>
-    </w:p>
-    <w:p>
-      <w:r>
-        <w:t xml:space="preserve">  -H "</w:t>
-      </w:r>
-      <w:proofErr w:type="spellStart"/>
-      <w:r>
-        <w:t>Authorization</w:t>
-      </w:r>
-      <w:proofErr w:type="spellEnd"/>
-      <w:r>
-        <w:t>: Bearer TOKEN" \</w:t>
-      </w:r>
-    </w:p>
-    <w:p>
-      <w:r>
-        <w:t xml:space="preserve">  -d '{"dni":"123","email":"correo-invalido","telefono":""}' | </w:t>
-      </w:r>
-      <w:proofErr w:type="spellStart"/>
-      <w:proofErr w:type="gramStart"/>
-      <w:r>
-        <w:t>jq</w:t>
-      </w:r>
-      <w:proofErr w:type="spellEnd"/>
-      <w:r>
-        <w:t xml:space="preserve"> .</w:t>
-      </w:r>
-      <w:proofErr w:type="gramEnd"/>
-    </w:p>
-    <w:p>
-      <w:r>
-        <w:t xml:space="preserve">Esperado: 400 Bad </w:t>
-      </w:r>
-      <w:proofErr w:type="spellStart"/>
-      <w:r>
-        <w:t>Request</w:t>
-      </w:r>
-      <w:proofErr w:type="spellEnd"/>
-      <w:r>
-        <w:t> — </w:t>
-      </w:r>
-      <w:proofErr w:type="spellStart"/>
-      <w:r>
-        <w:t>success</w:t>
-      </w:r>
-      <w:proofErr w:type="spellEnd"/>
-      <w:r>
-        <w:t>: false, data con mapa de errores agrupado por campo.</w:t>
-      </w:r>
-    </w:p>
-    <w:p>
-      <w:r>
-        <w:pict w14:anchorId="116ABE6F">
+        <w:t> — mensaje descriptivo con los estados involucrados.</w:t>
+      </w:r>
+    </w:p>
+    <w:p>
+      <w:r>
+        <w:pict w14:anchorId="47185176">
           <v:rect id="_x0000_i1049" style="width:0;height:3pt" o:hralign="center" o:hrstd="t" o:hr="t" fillcolor="#a0a0a0" stroked="f"/>
         </w:pict>
       </w:r>
@@ -12567,17 +13222,16 @@
           <w:b/>
           <w:bCs/>
         </w:rPr>
-        <w:lastRenderedPageBreak/>
-        <w:t>Paquetes (RF-02, RF-03, RF-04)</w:t>
-      </w:r>
-    </w:p>
-    <w:p>
-      <w:r>
-        <w:rPr>
-          <w:b/>
-          <w:bCs/>
-        </w:rPr>
-        <w:t>Caso 7 — Registro de paquete con tarifa calculada</w:t>
+        <w:t>Historial de Estados (RF-05)</w:t>
+      </w:r>
+    </w:p>
+    <w:p>
+      <w:r>
+        <w:rPr>
+          <w:b/>
+          <w:bCs/>
+        </w:rPr>
+        <w:t>Caso 13 — Consulta del historial de estados</w:t>
       </w:r>
     </w:p>
     <w:p>
@@ -12587,36 +13241,7 @@
       </w:r>
       <w:proofErr w:type="spellEnd"/>
       <w:r>
-        <w:t xml:space="preserve"> -s -X POST http://localhost:8080/api/v1/paquetes \</w:t>
-      </w:r>
-    </w:p>
-    <w:p>
-      <w:r>
-        <w:t xml:space="preserve">  -H "Content-</w:t>
-      </w:r>
-      <w:proofErr w:type="spellStart"/>
-      <w:r>
-        <w:t>Type</w:t>
-      </w:r>
-      <w:proofErr w:type="spellEnd"/>
-      <w:r>
-        <w:t xml:space="preserve">: </w:t>
-      </w:r>
-      <w:proofErr w:type="spellStart"/>
-      <w:r>
-        <w:t>application</w:t>
-      </w:r>
-      <w:proofErr w:type="spellEnd"/>
-      <w:r>
-        <w:t>/</w:t>
-      </w:r>
-      <w:proofErr w:type="spellStart"/>
-      <w:r>
-        <w:t>json</w:t>
-      </w:r>
-      <w:proofErr w:type="spellEnd"/>
-      <w:r>
-        <w:t>" \</w:t>
+        <w:t xml:space="preserve"> -s -X GET http://localhost:8080/api/v1/paquetes/{id}/historial \</w:t>
       </w:r>
     </w:p>
     <w:p>
@@ -12629,76 +13254,7 @@
       </w:r>
       <w:proofErr w:type="spellEnd"/>
       <w:r>
-        <w:t>: Bearer TOKEN" \</w:t>
-      </w:r>
-    </w:p>
-    <w:p>
-      <w:r>
-        <w:t xml:space="preserve">  -d '{</w:t>
-      </w:r>
-    </w:p>
-    <w:p>
-      <w:r>
-        <w:t xml:space="preserve">    "</w:t>
-      </w:r>
-      <w:proofErr w:type="spellStart"/>
-      <w:r>
-        <w:t>descripcion</w:t>
-      </w:r>
-      <w:proofErr w:type="spellEnd"/>
-      <w:r>
-        <w:t>":"Documentos legales",</w:t>
-      </w:r>
-    </w:p>
-    <w:p>
-      <w:r>
-        <w:t xml:space="preserve">    "pesoKg":1.5,</w:t>
-      </w:r>
-    </w:p>
-    <w:p>
-      <w:r>
-        <w:t xml:space="preserve">    "valorDeclarado":200.00,</w:t>
-      </w:r>
-    </w:p>
-    <w:p>
-      <w:r>
-        <w:t xml:space="preserve">    "</w:t>
-      </w:r>
-      <w:proofErr w:type="spellStart"/>
-      <w:r>
-        <w:t>sucursalOrigen</w:t>
-      </w:r>
-      <w:proofErr w:type="spellEnd"/>
-      <w:r>
-        <w:t>":"Lima",</w:t>
-      </w:r>
-    </w:p>
-    <w:p>
-      <w:r>
-        <w:t xml:space="preserve">    "</w:t>
-      </w:r>
-      <w:proofErr w:type="spellStart"/>
-      <w:r>
-        <w:t>sucursalDestino</w:t>
-      </w:r>
-      <w:proofErr w:type="spellEnd"/>
-      <w:r>
-        <w:t>":"Arequipa",</w:t>
-      </w:r>
-    </w:p>
-    <w:p>
-      <w:r>
-        <w:t xml:space="preserve">    "dniRemitente":"12345678",</w:t>
-      </w:r>
-    </w:p>
-    <w:p>
-      <w:r>
-        <w:t xml:space="preserve">    "dniDestinatario":"87654321"</w:t>
-      </w:r>
-    </w:p>
-    <w:p>
-      <w:r>
-        <w:t xml:space="preserve">  }' | </w:t>
+        <w:t xml:space="preserve">: Bearer TOKEN" | </w:t>
       </w:r>
       <w:proofErr w:type="spellStart"/>
       <w:proofErr w:type="gramStart"/>
@@ -12713,419 +13269,20 @@
     </w:p>
     <w:p>
       <w:r>
-        <w:t xml:space="preserve">Esperado: 201 </w:t>
-      </w:r>
-      <w:proofErr w:type="spellStart"/>
-      <w:r>
-        <w:t>Created</w:t>
-      </w:r>
-      <w:proofErr w:type="spellEnd"/>
-      <w:r>
-        <w:t> — código de rastreo generado y tarifa calculada visibles en data.</w:t>
-      </w:r>
-    </w:p>
-    <w:p>
-      <w:r>
-        <w:rPr>
-          <w:b/>
-          <w:bCs/>
-        </w:rPr>
-        <w:t>Caso 8 — Datos inválidos en registro de paquete</w:t>
-      </w:r>
-    </w:p>
-    <w:p>
-      <w:proofErr w:type="spellStart"/>
-      <w:r>
-        <w:t>curl</w:t>
-      </w:r>
-      <w:proofErr w:type="spellEnd"/>
-      <w:r>
-        <w:t xml:space="preserve"> -s -X POST http://localhost:8080/api/v1/paquetes \</w:t>
-      </w:r>
-    </w:p>
-    <w:p>
-      <w:r>
-        <w:t xml:space="preserve">  -H "Content-</w:t>
-      </w:r>
-      <w:proofErr w:type="spellStart"/>
-      <w:r>
-        <w:t>Type</w:t>
-      </w:r>
-      <w:proofErr w:type="spellEnd"/>
-      <w:r>
-        <w:t xml:space="preserve">: </w:t>
-      </w:r>
-      <w:proofErr w:type="spellStart"/>
-      <w:r>
-        <w:t>application</w:t>
-      </w:r>
-      <w:proofErr w:type="spellEnd"/>
-      <w:r>
-        <w:t>/</w:t>
-      </w:r>
-      <w:proofErr w:type="spellStart"/>
-      <w:r>
-        <w:t>json</w:t>
-      </w:r>
-      <w:proofErr w:type="spellEnd"/>
-      <w:r>
-        <w:t>" \</w:t>
-      </w:r>
-    </w:p>
-    <w:p>
-      <w:r>
-        <w:t xml:space="preserve">  -H "</w:t>
-      </w:r>
-      <w:proofErr w:type="spellStart"/>
-      <w:r>
-        <w:t>Authorization</w:t>
-      </w:r>
-      <w:proofErr w:type="spellEnd"/>
-      <w:r>
-        <w:t>: Bearer TOKEN" \</w:t>
-      </w:r>
-    </w:p>
-    <w:p>
-      <w:r>
-        <w:t xml:space="preserve">  -d '{"</w:t>
-      </w:r>
-      <w:proofErr w:type="spellStart"/>
-      <w:r>
-        <w:t>descripcion</w:t>
-      </w:r>
-      <w:proofErr w:type="spellEnd"/>
-      <w:r>
-        <w:t>":"","</w:t>
-      </w:r>
-      <w:proofErr w:type="spellStart"/>
-      <w:r>
-        <w:t>pesoKg</w:t>
-      </w:r>
-      <w:proofErr w:type="spellEnd"/>
-      <w:proofErr w:type="gramStart"/>
-      <w:r>
-        <w:t>":-</w:t>
-      </w:r>
-      <w:proofErr w:type="gramEnd"/>
-      <w:r>
-        <w:t xml:space="preserve">1,"valorDeclarado":0}' | </w:t>
-      </w:r>
-      <w:proofErr w:type="spellStart"/>
-      <w:proofErr w:type="gramStart"/>
-      <w:r>
-        <w:t>jq</w:t>
-      </w:r>
-      <w:proofErr w:type="spellEnd"/>
-      <w:r>
-        <w:t xml:space="preserve"> .</w:t>
-      </w:r>
-      <w:proofErr w:type="gramEnd"/>
-    </w:p>
-    <w:p>
-      <w:r>
-        <w:t xml:space="preserve">Esperado: 400 Bad </w:t>
-      </w:r>
-      <w:proofErr w:type="spellStart"/>
-      <w:r>
-        <w:t>Request</w:t>
-      </w:r>
-      <w:proofErr w:type="spellEnd"/>
-      <w:r>
-        <w:t> — mapa de errores por campo en data.</w:t>
-      </w:r>
-    </w:p>
-    <w:p>
-      <w:r>
-        <w:rPr>
-          <w:b/>
-          <w:bCs/>
-        </w:rPr>
-        <w:t>Caso 9 — Consulta de paquete por ID existente</w:t>
-      </w:r>
-    </w:p>
-    <w:p>
-      <w:proofErr w:type="spellStart"/>
-      <w:r>
-        <w:t>curl</w:t>
-      </w:r>
-      <w:proofErr w:type="spellEnd"/>
-      <w:r>
-        <w:t xml:space="preserve"> -s -X GET http://localhost:8080/api/v1/paquetes/{id} \</w:t>
-      </w:r>
-    </w:p>
-    <w:p>
-      <w:r>
-        <w:t xml:space="preserve">  -H "</w:t>
-      </w:r>
-      <w:proofErr w:type="spellStart"/>
-      <w:r>
-        <w:t>Authorization</w:t>
-      </w:r>
-      <w:proofErr w:type="spellEnd"/>
-      <w:r>
-        <w:t xml:space="preserve">: Bearer TOKEN" | </w:t>
-      </w:r>
-      <w:proofErr w:type="spellStart"/>
-      <w:proofErr w:type="gramStart"/>
-      <w:r>
-        <w:t>jq</w:t>
-      </w:r>
-      <w:proofErr w:type="spellEnd"/>
-      <w:r>
-        <w:t xml:space="preserve"> .</w:t>
-      </w:r>
-      <w:proofErr w:type="gramEnd"/>
-    </w:p>
-    <w:p>
-      <w:r>
-        <w:t>Esperado: 200 OK — datos del paquete incluyendo nombre del remitente y destinatario en data.</w:t>
-      </w:r>
-    </w:p>
-    <w:p>
-      <w:r>
-        <w:rPr>
-          <w:b/>
-          <w:bCs/>
-        </w:rPr>
-        <w:t>Caso 10 — Consulta de paquete por ID inexistente</w:t>
-      </w:r>
-    </w:p>
-    <w:p>
-      <w:proofErr w:type="spellStart"/>
-      <w:r>
-        <w:t>curl</w:t>
-      </w:r>
-      <w:proofErr w:type="spellEnd"/>
-      <w:r>
-        <w:t xml:space="preserve"> -s -X GET http://localhost:8080/api/v1/paquetes/00000000-0000-0000-0000-000000000000 \</w:t>
-      </w:r>
-    </w:p>
-    <w:p>
-      <w:r>
-        <w:t xml:space="preserve">  -H "</w:t>
-      </w:r>
-      <w:proofErr w:type="spellStart"/>
-      <w:r>
-        <w:t>Authorization</w:t>
-      </w:r>
-      <w:proofErr w:type="spellEnd"/>
-      <w:r>
-        <w:t xml:space="preserve">: Bearer TOKEN" | </w:t>
-      </w:r>
-      <w:proofErr w:type="spellStart"/>
-      <w:proofErr w:type="gramStart"/>
-      <w:r>
-        <w:t>jq</w:t>
-      </w:r>
-      <w:proofErr w:type="spellEnd"/>
-      <w:r>
-        <w:t xml:space="preserve"> .</w:t>
-      </w:r>
-      <w:proofErr w:type="gramEnd"/>
-    </w:p>
-    <w:p>
-      <w:r>
-        <w:t>Esperado: 404 Not Found — </w:t>
-      </w:r>
-      <w:proofErr w:type="spellStart"/>
-      <w:r>
-        <w:t>success</w:t>
-      </w:r>
-      <w:proofErr w:type="spellEnd"/>
-      <w:r>
-        <w:t>: false.</w:t>
-      </w:r>
-    </w:p>
-    <w:p>
-      <w:r>
-        <w:rPr>
-          <w:b/>
-          <w:bCs/>
-        </w:rPr>
-        <w:t>Caso 11 — Actualización de estado: transición válida (RF-04)</w:t>
-      </w:r>
-    </w:p>
-    <w:p>
-      <w:proofErr w:type="spellStart"/>
-      <w:r>
-        <w:lastRenderedPageBreak/>
-        <w:t>curl</w:t>
-      </w:r>
-      <w:proofErr w:type="spellEnd"/>
-      <w:r>
-        <w:t xml:space="preserve"> -s -X PATCH http://localhost:8080/api/v1/paquetes/{id}/estado \</w:t>
-      </w:r>
-    </w:p>
-    <w:p>
-      <w:r>
-        <w:t xml:space="preserve">  -H "Content-</w:t>
-      </w:r>
-      <w:proofErr w:type="spellStart"/>
-      <w:r>
-        <w:t>Type</w:t>
-      </w:r>
-      <w:proofErr w:type="spellEnd"/>
-      <w:r>
-        <w:t xml:space="preserve">: </w:t>
-      </w:r>
-      <w:proofErr w:type="spellStart"/>
-      <w:r>
-        <w:t>application</w:t>
-      </w:r>
-      <w:proofErr w:type="spellEnd"/>
-      <w:r>
-        <w:t>/</w:t>
-      </w:r>
-      <w:proofErr w:type="spellStart"/>
-      <w:r>
-        <w:t>json</w:t>
-      </w:r>
-      <w:proofErr w:type="spellEnd"/>
-      <w:r>
-        <w:t>" \</w:t>
-      </w:r>
-    </w:p>
-    <w:p>
-      <w:r>
-        <w:t xml:space="preserve">  -H "</w:t>
-      </w:r>
-      <w:proofErr w:type="spellStart"/>
-      <w:r>
-        <w:t>Authorization</w:t>
-      </w:r>
-      <w:proofErr w:type="spellEnd"/>
-      <w:r>
-        <w:t>: Bearer TOKEN" \</w:t>
-      </w:r>
-    </w:p>
-    <w:p>
-      <w:r>
-        <w:t xml:space="preserve">  -d '{"</w:t>
-      </w:r>
-      <w:proofErr w:type="spellStart"/>
-      <w:r>
-        <w:t>nuevoEstado</w:t>
-      </w:r>
-      <w:proofErr w:type="spellEnd"/>
-      <w:r>
-        <w:t xml:space="preserve">":"EN_TRANSITO"}' | </w:t>
-      </w:r>
-      <w:proofErr w:type="spellStart"/>
-      <w:proofErr w:type="gramStart"/>
-      <w:r>
-        <w:t>jq</w:t>
-      </w:r>
-      <w:proofErr w:type="spellEnd"/>
-      <w:r>
-        <w:t xml:space="preserve"> .</w:t>
-      </w:r>
-      <w:proofErr w:type="gramEnd"/>
-    </w:p>
-    <w:p>
-      <w:r>
-        <w:t>Esperado: 200 OK — paquete con nuevo estado en data.</w:t>
-      </w:r>
-    </w:p>
-    <w:p>
-      <w:r>
-        <w:rPr>
-          <w:b/>
-          <w:bCs/>
-        </w:rPr>
-        <w:t>Caso 12 — Actualización de estado: transición inválida (RF-04)</w:t>
-      </w:r>
-    </w:p>
-    <w:p>
-      <w:proofErr w:type="spellStart"/>
-      <w:r>
-        <w:t>curl</w:t>
-      </w:r>
-      <w:proofErr w:type="spellEnd"/>
-      <w:r>
-        <w:t xml:space="preserve"> -s -X PATCH http://localhost:8080/api/v1/paquetes/{id}/estado \</w:t>
-      </w:r>
-    </w:p>
-    <w:p>
-      <w:r>
-        <w:t xml:space="preserve">  -H "Content-</w:t>
-      </w:r>
-      <w:proofErr w:type="spellStart"/>
-      <w:r>
-        <w:t>Type</w:t>
-      </w:r>
-      <w:proofErr w:type="spellEnd"/>
-      <w:r>
-        <w:t xml:space="preserve">: </w:t>
-      </w:r>
-      <w:proofErr w:type="spellStart"/>
-      <w:r>
-        <w:t>application</w:t>
-      </w:r>
-      <w:proofErr w:type="spellEnd"/>
-      <w:r>
-        <w:t>/</w:t>
-      </w:r>
-      <w:proofErr w:type="spellStart"/>
-      <w:r>
-        <w:t>json</w:t>
-      </w:r>
-      <w:proofErr w:type="spellEnd"/>
-      <w:r>
-        <w:t>" \</w:t>
-      </w:r>
-    </w:p>
-    <w:p>
-      <w:r>
-        <w:t xml:space="preserve">  -H "</w:t>
-      </w:r>
-      <w:proofErr w:type="spellStart"/>
-      <w:r>
-        <w:t>Authorization</w:t>
-      </w:r>
-      <w:proofErr w:type="spellEnd"/>
-      <w:r>
-        <w:t>: Bearer TOKEN" \</w:t>
-      </w:r>
-    </w:p>
-    <w:p>
-      <w:r>
-        <w:t xml:space="preserve">  -d '{"</w:t>
-      </w:r>
-      <w:proofErr w:type="spellStart"/>
-      <w:r>
-        <w:t>nuevoEstado</w:t>
-      </w:r>
-      <w:proofErr w:type="spellEnd"/>
-      <w:r>
-        <w:t xml:space="preserve">":"REGISTRADO"}' | </w:t>
-      </w:r>
-      <w:proofErr w:type="spellStart"/>
-      <w:proofErr w:type="gramStart"/>
-      <w:r>
-        <w:t>jq</w:t>
-      </w:r>
-      <w:proofErr w:type="spellEnd"/>
-      <w:r>
-        <w:t xml:space="preserve"> .</w:t>
-      </w:r>
-      <w:proofErr w:type="gramEnd"/>
-    </w:p>
-    <w:p>
-      <w:r>
-        <w:t xml:space="preserve">Esperado: 409 </w:t>
-      </w:r>
-      <w:proofErr w:type="spellStart"/>
-      <w:r>
-        <w:t>Conflict</w:t>
-      </w:r>
-      <w:proofErr w:type="spellEnd"/>
-      <w:r>
-        <w:t> — mensaje descriptivo con los estados involucrados.</w:t>
-      </w:r>
-    </w:p>
-    <w:p>
-      <w:r>
-        <w:pict w14:anchorId="47185176">
+        <w:t xml:space="preserve">Esperado: 200 OK — lista ordenada de cambios de estado con </w:t>
+      </w:r>
+      <w:proofErr w:type="spellStart"/>
+      <w:r>
+        <w:t>timestamp</w:t>
+      </w:r>
+      <w:proofErr w:type="spellEnd"/>
+      <w:r>
+        <w:t xml:space="preserve"> y usuario en data.</w:t>
+      </w:r>
+    </w:p>
+    <w:p>
+      <w:r>
+        <w:pict w14:anchorId="0AF9EAFF">
           <v:rect id="_x0000_i1050" style="width:0;height:3pt" o:hralign="center" o:hrstd="t" o:hr="t" fillcolor="#a0a0a0" stroked="f"/>
         </w:pict>
       </w:r>
@@ -13142,16 +13299,16 @@
           <w:b/>
           <w:bCs/>
         </w:rPr>
-        <w:t>Historial de Estados (RF-05)</w:t>
-      </w:r>
-    </w:p>
-    <w:p>
-      <w:r>
-        <w:rPr>
-          <w:b/>
-          <w:bCs/>
-        </w:rPr>
-        <w:t>Caso 13 — Consulta del historial de estados</w:t>
+        <w:t>Búsqueda y Filtros (RF-06, RF-07)</w:t>
+      </w:r>
+    </w:p>
+    <w:p>
+      <w:r>
+        <w:rPr>
+          <w:b/>
+          <w:bCs/>
+        </w:rPr>
+        <w:t>Caso 14 — Búsqueda por texto parcial en código de rastreo (RF-07)</w:t>
       </w:r>
     </w:p>
     <w:p>
@@ -13161,7 +13318,15 @@
       </w:r>
       <w:proofErr w:type="spellEnd"/>
       <w:r>
-        <w:t xml:space="preserve"> -s -X GET http://localhost:8080/api/v1/paquetes/{id}/historial \</w:t>
+        <w:t xml:space="preserve"> -s -X GET "http://localhost:8080/api/v1/</w:t>
+      </w:r>
+      <w:proofErr w:type="spellStart"/>
+      <w:r>
+        <w:t>paquetes?busqueda</w:t>
+      </w:r>
+      <w:proofErr w:type="spellEnd"/>
+      <w:r>
+        <w:t>=RC2024" \</w:t>
       </w:r>
     </w:p>
     <w:p>
@@ -13189,20 +13354,115 @@
     </w:p>
     <w:p>
       <w:r>
-        <w:t xml:space="preserve">Esperado: 200 OK — lista ordenada de cambios de estado con </w:t>
-      </w:r>
-      <w:proofErr w:type="spellStart"/>
-      <w:r>
-        <w:t>timestamp</w:t>
-      </w:r>
-      <w:proofErr w:type="spellEnd"/>
-      <w:r>
-        <w:t xml:space="preserve"> y usuario en data.</w:t>
-      </w:r>
-    </w:p>
-    <w:p>
-      <w:r>
-        <w:pict w14:anchorId="0AF9EAFF">
+        <w:t>Esperado: 200 OK — lista de paquetes cuyo código de rastreo contenga "RC2024".</w:t>
+      </w:r>
+    </w:p>
+    <w:p>
+      <w:r>
+        <w:rPr>
+          <w:b/>
+          <w:bCs/>
+        </w:rPr>
+        <w:t>Caso 15 — Búsqueda por nombre de cliente (RF-07)</w:t>
+      </w:r>
+    </w:p>
+    <w:p>
+      <w:proofErr w:type="spellStart"/>
+      <w:r>
+        <w:t>curl</w:t>
+      </w:r>
+      <w:proofErr w:type="spellEnd"/>
+      <w:r>
+        <w:t xml:space="preserve"> -s -X GET "http://localhost:8080/api/v1/</w:t>
+      </w:r>
+      <w:proofErr w:type="spellStart"/>
+      <w:r>
+        <w:t>paquetes?busqueda</w:t>
+      </w:r>
+      <w:proofErr w:type="spellEnd"/>
+      <w:r>
+        <w:t>=flores" \</w:t>
+      </w:r>
+    </w:p>
+    <w:p>
+      <w:r>
+        <w:t xml:space="preserve">  -H "</w:t>
+      </w:r>
+      <w:proofErr w:type="spellStart"/>
+      <w:r>
+        <w:t>Authorization</w:t>
+      </w:r>
+      <w:proofErr w:type="spellEnd"/>
+      <w:r>
+        <w:t xml:space="preserve">: Bearer TOKEN" | </w:t>
+      </w:r>
+      <w:proofErr w:type="spellStart"/>
+      <w:proofErr w:type="gramStart"/>
+      <w:r>
+        <w:t>jq</w:t>
+      </w:r>
+      <w:proofErr w:type="spellEnd"/>
+      <w:r>
+        <w:t xml:space="preserve"> .</w:t>
+      </w:r>
+      <w:proofErr w:type="gramEnd"/>
+    </w:p>
+    <w:p>
+      <w:r>
+        <w:t>Esperado: 200 OK — paquetes cuyo remitente o destinatario contenga "flores" en su nombre.</w:t>
+      </w:r>
+    </w:p>
+    <w:p>
+      <w:r>
+        <w:rPr>
+          <w:b/>
+          <w:bCs/>
+        </w:rPr>
+        <w:t>Caso 16 — Filtro por sucursal y estado (RF-06)</w:t>
+      </w:r>
+    </w:p>
+    <w:p>
+      <w:proofErr w:type="spellStart"/>
+      <w:r>
+        <w:t>curl</w:t>
+      </w:r>
+      <w:proofErr w:type="spellEnd"/>
+      <w:r>
+        <w:t xml:space="preserve"> -s -X GET "http://localhost:8080/api/v1/paquetes?sucursal=Lima&amp;estado=EN_TRANSITO" \</w:t>
+      </w:r>
+    </w:p>
+    <w:p>
+      <w:r>
+        <w:t xml:space="preserve">  -H "</w:t>
+      </w:r>
+      <w:proofErr w:type="spellStart"/>
+      <w:r>
+        <w:t>Authorization</w:t>
+      </w:r>
+      <w:proofErr w:type="spellEnd"/>
+      <w:r>
+        <w:t xml:space="preserve">: Bearer TOKEN" | </w:t>
+      </w:r>
+      <w:proofErr w:type="spellStart"/>
+      <w:proofErr w:type="gramStart"/>
+      <w:r>
+        <w:t>jq</w:t>
+      </w:r>
+      <w:proofErr w:type="spellEnd"/>
+      <w:r>
+        <w:t xml:space="preserve"> .</w:t>
+      </w:r>
+      <w:proofErr w:type="gramEnd"/>
+    </w:p>
+    <w:p>
+      <w:r>
+        <w:t>Esperado: 200 OK — paquetes con origen o destino en Lima y estado EN_TRANSITO.</w:t>
+      </w:r>
+    </w:p>
+    <w:p>
+      <w:r>
+        <w:lastRenderedPageBreak/>
+        <w:pict w14:anchorId="30B8E4EC">
           <v:rect id="_x0000_i1051" style="width:0;height:3pt" o:hralign="center" o:hrstd="t" o:hr="t" fillcolor="#a0a0a0" stroked="f"/>
         </w:pict>
       </w:r>
@@ -13219,16 +13479,16 @@
           <w:b/>
           <w:bCs/>
         </w:rPr>
-        <w:t>Búsqueda y Filtros (RF-06, RF-07)</w:t>
-      </w:r>
-    </w:p>
-    <w:p>
-      <w:r>
-        <w:rPr>
-          <w:b/>
-          <w:bCs/>
-        </w:rPr>
-        <w:t>Caso 14 — Búsqueda por texto parcial en código de rastreo (RF-07)</w:t>
+        <w:t>Categorías (RF-09)</w:t>
+      </w:r>
+    </w:p>
+    <w:p>
+      <w:r>
+        <w:rPr>
+          <w:b/>
+          <w:bCs/>
+        </w:rPr>
+        <w:t>Caso 17 — Asignación de categoría a un paquete</w:t>
       </w:r>
     </w:p>
     <w:p>
@@ -13238,15 +13498,7 @@
       </w:r>
       <w:proofErr w:type="spellEnd"/>
       <w:r>
-        <w:t xml:space="preserve"> -s -X GET "http://localhost:8080/api/v1/</w:t>
-      </w:r>
-      <w:proofErr w:type="spellStart"/>
-      <w:r>
-        <w:t>paquetes?busqueda</w:t>
-      </w:r>
-      <w:proofErr w:type="spellEnd"/>
-      <w:r>
-        <w:t>=RC2024" \</w:t>
+        <w:t xml:space="preserve"> -s -X POST http://localhost:8080/api/v1/paquetes/{id}/categorias/{categoriaId} \</w:t>
       </w:r>
     </w:p>
     <w:p>
@@ -13274,115 +13526,12 @@
     </w:p>
     <w:p>
       <w:r>
-        <w:t>Esperado: 200 OK — lista de paquetes cuyo código de rastreo contenga "RC2024".</w:t>
-      </w:r>
-    </w:p>
-    <w:p>
-      <w:r>
-        <w:rPr>
-          <w:b/>
-          <w:bCs/>
-        </w:rPr>
-        <w:t>Caso 15 — Búsqueda por nombre de cliente (RF-07)</w:t>
-      </w:r>
-    </w:p>
-    <w:p>
-      <w:proofErr w:type="spellStart"/>
-      <w:r>
-        <w:t>curl</w:t>
-      </w:r>
-      <w:proofErr w:type="spellEnd"/>
-      <w:r>
-        <w:t xml:space="preserve"> -s -X GET "http://localhost:8080/api/v1/</w:t>
-      </w:r>
-      <w:proofErr w:type="spellStart"/>
-      <w:r>
-        <w:t>paquetes?busqueda</w:t>
-      </w:r>
-      <w:proofErr w:type="spellEnd"/>
-      <w:r>
-        <w:t>=flores" \</w:t>
-      </w:r>
-    </w:p>
-    <w:p>
-      <w:r>
-        <w:t xml:space="preserve">  -H "</w:t>
-      </w:r>
-      <w:proofErr w:type="spellStart"/>
-      <w:r>
-        <w:t>Authorization</w:t>
-      </w:r>
-      <w:proofErr w:type="spellEnd"/>
-      <w:r>
-        <w:t xml:space="preserve">: Bearer TOKEN" | </w:t>
-      </w:r>
-      <w:proofErr w:type="spellStart"/>
-      <w:proofErr w:type="gramStart"/>
-      <w:r>
-        <w:t>jq</w:t>
-      </w:r>
-      <w:proofErr w:type="spellEnd"/>
-      <w:r>
-        <w:t xml:space="preserve"> .</w:t>
-      </w:r>
-      <w:proofErr w:type="gramEnd"/>
-    </w:p>
-    <w:p>
-      <w:r>
-        <w:t>Esperado: 200 OK — paquetes cuyo remitente o destinatario contenga "flores" en su nombre.</w:t>
-      </w:r>
-    </w:p>
-    <w:p>
-      <w:r>
-        <w:rPr>
-          <w:b/>
-          <w:bCs/>
-        </w:rPr>
-        <w:t>Caso 16 — Filtro por sucursal y estado (RF-06)</w:t>
-      </w:r>
-    </w:p>
-    <w:p>
-      <w:proofErr w:type="spellStart"/>
-      <w:r>
-        <w:t>curl</w:t>
-      </w:r>
-      <w:proofErr w:type="spellEnd"/>
-      <w:r>
-        <w:t xml:space="preserve"> -s -X GET "http://localhost:8080/api/v1/paquetes?sucursal=Lima&amp;estado=EN_TRANSITO" \</w:t>
-      </w:r>
-    </w:p>
-    <w:p>
-      <w:r>
-        <w:t xml:space="preserve">  -H "</w:t>
-      </w:r>
-      <w:proofErr w:type="spellStart"/>
-      <w:r>
-        <w:t>Authorization</w:t>
-      </w:r>
-      <w:proofErr w:type="spellEnd"/>
-      <w:r>
-        <w:t xml:space="preserve">: Bearer TOKEN" | </w:t>
-      </w:r>
-      <w:proofErr w:type="spellStart"/>
-      <w:proofErr w:type="gramStart"/>
-      <w:r>
-        <w:t>jq</w:t>
-      </w:r>
-      <w:proofErr w:type="spellEnd"/>
-      <w:r>
-        <w:t xml:space="preserve"> .</w:t>
-      </w:r>
-      <w:proofErr w:type="gramEnd"/>
-    </w:p>
-    <w:p>
-      <w:r>
-        <w:t>Esperado: 200 OK — paquetes con origen o destino en Lima y estado EN_TRANSITO.</w:t>
-      </w:r>
-    </w:p>
-    <w:p>
-      <w:r>
-        <w:lastRenderedPageBreak/>
-        <w:pict w14:anchorId="30B8E4EC">
+        <w:t>Esperado: 200 OK — paquete actualizado con la categoría asignada en data.</w:t>
+      </w:r>
+    </w:p>
+    <w:p>
+      <w:r>
+        <w:pict w14:anchorId="4032F29F">
           <v:rect id="_x0000_i1052" style="width:0;height:3pt" o:hralign="center" o:hrstd="t" o:hr="t" fillcolor="#a0a0a0" stroked="f"/>
         </w:pict>
       </w:r>
@@ -13399,16 +13548,16 @@
           <w:b/>
           <w:bCs/>
         </w:rPr>
-        <w:t>Categorías (RF-09)</w:t>
-      </w:r>
-    </w:p>
-    <w:p>
-      <w:r>
-        <w:rPr>
-          <w:b/>
-          <w:bCs/>
-        </w:rPr>
-        <w:t>Caso 17 — Asignación de categoría a un paquete</w:t>
+        <w:t>Operaciones de escritura y borrado</w:t>
+      </w:r>
+    </w:p>
+    <w:p>
+      <w:r>
+        <w:rPr>
+          <w:b/>
+          <w:bCs/>
+        </w:rPr>
+        <w:t>Caso 18 — Actualización de paquete</w:t>
       </w:r>
     </w:p>
     <w:p>
@@ -13418,7 +13567,36 @@
       </w:r>
       <w:proofErr w:type="spellEnd"/>
       <w:r>
-        <w:t xml:space="preserve"> -s -X POST http://localhost:8080/api/v1/paquetes/{id}/categorias/{categoriaId} \</w:t>
+        <w:t xml:space="preserve"> -s -X PUT http://localhost:8080/api/v1/paquetes/{id} \</w:t>
+      </w:r>
+    </w:p>
+    <w:p>
+      <w:r>
+        <w:t xml:space="preserve">  -H "Content-</w:t>
+      </w:r>
+      <w:proofErr w:type="spellStart"/>
+      <w:r>
+        <w:t>Type</w:t>
+      </w:r>
+      <w:proofErr w:type="spellEnd"/>
+      <w:r>
+        <w:t xml:space="preserve">: </w:t>
+      </w:r>
+      <w:proofErr w:type="spellStart"/>
+      <w:r>
+        <w:t>application</w:t>
+      </w:r>
+      <w:proofErr w:type="spellEnd"/>
+      <w:r>
+        <w:t>/</w:t>
+      </w:r>
+      <w:proofErr w:type="spellStart"/>
+      <w:r>
+        <w:t>json</w:t>
+      </w:r>
+      <w:proofErr w:type="spellEnd"/>
+      <w:r>
+        <w:t>" \</w:t>
       </w:r>
     </w:p>
     <w:p>
@@ -13431,7 +13609,20 @@
       </w:r>
       <w:proofErr w:type="spellEnd"/>
       <w:r>
-        <w:t xml:space="preserve">: Bearer TOKEN" | </w:t>
+        <w:t>: Bearer TOKEN" \</w:t>
+      </w:r>
+    </w:p>
+    <w:p>
+      <w:r>
+        <w:t xml:space="preserve">  -d '{"</w:t>
+      </w:r>
+      <w:proofErr w:type="spellStart"/>
+      <w:r>
+        <w:t>descripcion</w:t>
+      </w:r>
+      <w:proofErr w:type="spellEnd"/>
+      <w:r>
+        <w:t xml:space="preserve">":"Documentos actualizados","pesoKg":2.0}' | </w:t>
       </w:r>
       <w:proofErr w:type="spellStart"/>
       <w:proofErr w:type="gramStart"/>
@@ -13446,12 +13637,114 @@
     </w:p>
     <w:p>
       <w:r>
-        <w:t>Esperado: 200 OK — paquete actualizado con la categoría asignada en data.</w:t>
-      </w:r>
-    </w:p>
-    <w:p>
-      <w:r>
-        <w:pict w14:anchorId="4032F29F">
+        <w:t>Esperado: 200 OK — datos actualizados en data.</w:t>
+      </w:r>
+    </w:p>
+    <w:p>
+      <w:r>
+        <w:rPr>
+          <w:b/>
+          <w:bCs/>
+        </w:rPr>
+        <w:t>Caso 19 — Eliminación de paquete (solo ADMIN)</w:t>
+      </w:r>
+    </w:p>
+    <w:p>
+      <w:proofErr w:type="spellStart"/>
+      <w:r>
+        <w:t>curl</w:t>
+      </w:r>
+      <w:proofErr w:type="spellEnd"/>
+      <w:r>
+        <w:t xml:space="preserve"> -s -X DELETE http://localhost:8080/api/v1/paquetes/{id} \</w:t>
+      </w:r>
+    </w:p>
+    <w:p>
+      <w:r>
+        <w:t xml:space="preserve">  -H "</w:t>
+      </w:r>
+      <w:proofErr w:type="spellStart"/>
+      <w:r>
+        <w:t>Authorization</w:t>
+      </w:r>
+      <w:proofErr w:type="spellEnd"/>
+      <w:r>
+        <w:t xml:space="preserve">: Bearer TOKEN_ADMIN" | </w:t>
+      </w:r>
+      <w:proofErr w:type="spellStart"/>
+      <w:proofErr w:type="gramStart"/>
+      <w:r>
+        <w:t>jq</w:t>
+      </w:r>
+      <w:proofErr w:type="spellEnd"/>
+      <w:r>
+        <w:t xml:space="preserve"> .</w:t>
+      </w:r>
+      <w:proofErr w:type="gramEnd"/>
+    </w:p>
+    <w:p>
+      <w:r>
+        <w:t>Esperado: 204 No Content.</w:t>
+      </w:r>
+    </w:p>
+    <w:p>
+      <w:r>
+        <w:rPr>
+          <w:b/>
+          <w:bCs/>
+        </w:rPr>
+        <w:t>Caso 20 — Eliminación de recurso inexistente</w:t>
+      </w:r>
+    </w:p>
+    <w:p>
+      <w:proofErr w:type="spellStart"/>
+      <w:r>
+        <w:t>curl</w:t>
+      </w:r>
+      <w:proofErr w:type="spellEnd"/>
+      <w:r>
+        <w:t xml:space="preserve"> -s -X DELETE http://localhost:8080/api/v1/paquetes/00000000-0000-0000-0000-000000000000 \</w:t>
+      </w:r>
+    </w:p>
+    <w:p>
+      <w:r>
+        <w:t xml:space="preserve">  -H "</w:t>
+      </w:r>
+      <w:proofErr w:type="spellStart"/>
+      <w:r>
+        <w:t>Authorization</w:t>
+      </w:r>
+      <w:proofErr w:type="spellEnd"/>
+      <w:r>
+        <w:t xml:space="preserve">: Bearer TOKEN_ADMIN" | </w:t>
+      </w:r>
+      <w:proofErr w:type="spellStart"/>
+      <w:proofErr w:type="gramStart"/>
+      <w:r>
+        <w:t>jq</w:t>
+      </w:r>
+      <w:proofErr w:type="spellEnd"/>
+      <w:r>
+        <w:t xml:space="preserve"> .</w:t>
+      </w:r>
+      <w:proofErr w:type="gramEnd"/>
+    </w:p>
+    <w:p>
+      <w:r>
+        <w:t>Esperado: 404 Not Found — </w:t>
+      </w:r>
+      <w:proofErr w:type="spellStart"/>
+      <w:r>
+        <w:t>success</w:t>
+      </w:r>
+      <w:proofErr w:type="spellEnd"/>
+      <w:r>
+        <w:t>: false.</w:t>
+      </w:r>
+    </w:p>
+    <w:p>
+      <w:r>
+        <w:pict w14:anchorId="7D92A323">
           <v:rect id="_x0000_i1053" style="width:0;height:3pt" o:hralign="center" o:hrstd="t" o:hr="t" fillcolor="#a0a0a0" stroked="f"/>
         </w:pict>
       </w:r>
@@ -13468,219 +13761,6 @@
           <w:b/>
           <w:bCs/>
         </w:rPr>
-        <w:t>Operaciones de escritura y borrado</w:t>
-      </w:r>
-    </w:p>
-    <w:p>
-      <w:r>
-        <w:rPr>
-          <w:b/>
-          <w:bCs/>
-        </w:rPr>
-        <w:t>Caso 18 — Actualización de paquete</w:t>
-      </w:r>
-    </w:p>
-    <w:p>
-      <w:proofErr w:type="spellStart"/>
-      <w:r>
-        <w:t>curl</w:t>
-      </w:r>
-      <w:proofErr w:type="spellEnd"/>
-      <w:r>
-        <w:t xml:space="preserve"> -s -X PUT http://localhost:8080/api/v1/paquetes/{id} \</w:t>
-      </w:r>
-    </w:p>
-    <w:p>
-      <w:r>
-        <w:t xml:space="preserve">  -H "Content-</w:t>
-      </w:r>
-      <w:proofErr w:type="spellStart"/>
-      <w:r>
-        <w:t>Type</w:t>
-      </w:r>
-      <w:proofErr w:type="spellEnd"/>
-      <w:r>
-        <w:t xml:space="preserve">: </w:t>
-      </w:r>
-      <w:proofErr w:type="spellStart"/>
-      <w:r>
-        <w:t>application</w:t>
-      </w:r>
-      <w:proofErr w:type="spellEnd"/>
-      <w:r>
-        <w:t>/</w:t>
-      </w:r>
-      <w:proofErr w:type="spellStart"/>
-      <w:r>
-        <w:t>json</w:t>
-      </w:r>
-      <w:proofErr w:type="spellEnd"/>
-      <w:r>
-        <w:t>" \</w:t>
-      </w:r>
-    </w:p>
-    <w:p>
-      <w:r>
-        <w:t xml:space="preserve">  -H "</w:t>
-      </w:r>
-      <w:proofErr w:type="spellStart"/>
-      <w:r>
-        <w:t>Authorization</w:t>
-      </w:r>
-      <w:proofErr w:type="spellEnd"/>
-      <w:r>
-        <w:t>: Bearer TOKEN" \</w:t>
-      </w:r>
-    </w:p>
-    <w:p>
-      <w:r>
-        <w:t xml:space="preserve">  -d '{"</w:t>
-      </w:r>
-      <w:proofErr w:type="spellStart"/>
-      <w:r>
-        <w:t>descripcion</w:t>
-      </w:r>
-      <w:proofErr w:type="spellEnd"/>
-      <w:r>
-        <w:t xml:space="preserve">":"Documentos actualizados","pesoKg":2.0}' | </w:t>
-      </w:r>
-      <w:proofErr w:type="spellStart"/>
-      <w:proofErr w:type="gramStart"/>
-      <w:r>
-        <w:t>jq</w:t>
-      </w:r>
-      <w:proofErr w:type="spellEnd"/>
-      <w:r>
-        <w:t xml:space="preserve"> .</w:t>
-      </w:r>
-      <w:proofErr w:type="gramEnd"/>
-    </w:p>
-    <w:p>
-      <w:r>
-        <w:t>Esperado: 200 OK — datos actualizados en data.</w:t>
-      </w:r>
-    </w:p>
-    <w:p>
-      <w:r>
-        <w:rPr>
-          <w:b/>
-          <w:bCs/>
-        </w:rPr>
-        <w:t>Caso 19 — Eliminación de paquete (solo ADMIN)</w:t>
-      </w:r>
-    </w:p>
-    <w:p>
-      <w:proofErr w:type="spellStart"/>
-      <w:r>
-        <w:t>curl</w:t>
-      </w:r>
-      <w:proofErr w:type="spellEnd"/>
-      <w:r>
-        <w:t xml:space="preserve"> -s -X DELETE http://localhost:8080/api/v1/paquetes/{id} \</w:t>
-      </w:r>
-    </w:p>
-    <w:p>
-      <w:r>
-        <w:t xml:space="preserve">  -H "</w:t>
-      </w:r>
-      <w:proofErr w:type="spellStart"/>
-      <w:r>
-        <w:t>Authorization</w:t>
-      </w:r>
-      <w:proofErr w:type="spellEnd"/>
-      <w:r>
-        <w:t xml:space="preserve">: Bearer TOKEN_ADMIN" | </w:t>
-      </w:r>
-      <w:proofErr w:type="spellStart"/>
-      <w:proofErr w:type="gramStart"/>
-      <w:r>
-        <w:t>jq</w:t>
-      </w:r>
-      <w:proofErr w:type="spellEnd"/>
-      <w:r>
-        <w:t xml:space="preserve"> .</w:t>
-      </w:r>
-      <w:proofErr w:type="gramEnd"/>
-    </w:p>
-    <w:p>
-      <w:r>
-        <w:t>Esperado: 204 No Content.</w:t>
-      </w:r>
-    </w:p>
-    <w:p>
-      <w:r>
-        <w:rPr>
-          <w:b/>
-          <w:bCs/>
-        </w:rPr>
-        <w:t>Caso 20 — Eliminación de recurso inexistente</w:t>
-      </w:r>
-    </w:p>
-    <w:p>
-      <w:proofErr w:type="spellStart"/>
-      <w:r>
-        <w:t>curl</w:t>
-      </w:r>
-      <w:proofErr w:type="spellEnd"/>
-      <w:r>
-        <w:t xml:space="preserve"> -s -X DELETE http://localhost:8080/api/v1/paquetes/00000000-0000-0000-0000-000000000000 \</w:t>
-      </w:r>
-    </w:p>
-    <w:p>
-      <w:r>
-        <w:t xml:space="preserve">  -H "</w:t>
-      </w:r>
-      <w:proofErr w:type="spellStart"/>
-      <w:r>
-        <w:t>Authorization</w:t>
-      </w:r>
-      <w:proofErr w:type="spellEnd"/>
-      <w:r>
-        <w:t xml:space="preserve">: Bearer TOKEN_ADMIN" | </w:t>
-      </w:r>
-      <w:proofErr w:type="spellStart"/>
-      <w:proofErr w:type="gramStart"/>
-      <w:r>
-        <w:t>jq</w:t>
-      </w:r>
-      <w:proofErr w:type="spellEnd"/>
-      <w:r>
-        <w:t xml:space="preserve"> .</w:t>
-      </w:r>
-      <w:proofErr w:type="gramEnd"/>
-    </w:p>
-    <w:p>
-      <w:r>
-        <w:t>Esperado: 404 Not Found — </w:t>
-      </w:r>
-      <w:proofErr w:type="spellStart"/>
-      <w:r>
-        <w:t>success</w:t>
-      </w:r>
-      <w:proofErr w:type="spellEnd"/>
-      <w:r>
-        <w:t>: false.</w:t>
-      </w:r>
-    </w:p>
-    <w:p>
-      <w:r>
-        <w:pict w14:anchorId="7D92A323">
-          <v:rect id="_x0000_i1054" style="width:0;height:3pt" o:hralign="center" o:hrstd="t" o:hr="t" fillcolor="#a0a0a0" stroked="f"/>
-        </w:pict>
-      </w:r>
-    </w:p>
-    <w:p>
-      <w:pPr>
-        <w:rPr>
-          <w:b/>
-          <w:bCs/>
-        </w:rPr>
-      </w:pPr>
-      <w:r>
-        <w:rPr>
-          <w:b/>
-          <w:bCs/>
-        </w:rPr>
         <w:t>Seguridad (RF-08)</w:t>
       </w:r>
     </w:p>
@@ -13801,7 +13881,7 @@
     <w:p>
       <w:r>
         <w:pict w14:anchorId="7D896CB3">
-          <v:rect id="_x0000_i1055" style="width:0;height:3pt" o:hralign="center" o:hrstd="t" o:hr="t" fillcolor="#a0a0a0" stroked="f"/>
+          <v:rect id="_x0000_i1054" style="width:0;height:3pt" o:hralign="center" o:hrstd="t" o:hr="t" fillcolor="#a0a0a0" stroked="f"/>
         </w:pict>
       </w:r>
     </w:p>
@@ -14046,7 +14126,7 @@
     <w:p>
       <w:r>
         <w:pict w14:anchorId="1C1BF9F4">
-          <v:rect id="_x0000_i1056" style="width:0;height:3pt" o:hralign="center" o:hrstd="t" o:hr="t" fillcolor="#a0a0a0" stroked="f"/>
+          <v:rect id="_x0000_i1055" style="width:0;height:3pt" o:hralign="center" o:hrstd="t" o:hr="t" fillcolor="#a0a0a0" stroked="f"/>
         </w:pict>
       </w:r>
     </w:p>

</xml_diff>

<commit_message>
config server, config client, readme
</commit_message>
<xml_diff>
--- a/EXAMEN FINAL.docx
+++ b/EXAMEN FINAL.docx
@@ -617,24 +617,35 @@
       <w:r>
         <w:rPr>
           <w:rFonts w:ascii="MS Gothic" w:eastAsia="MS Gothic" w:hAnsi="MS Gothic" w:cs="MS Gothic" w:hint="eastAsia"/>
+          <w:highlight w:val="green"/>
         </w:rPr>
         <w:t>├</w:t>
       </w:r>
       <w:r>
         <w:rPr>
           <w:rFonts w:ascii="Calibri" w:hAnsi="Calibri" w:cs="Calibri"/>
+          <w:highlight w:val="green"/>
         </w:rPr>
         <w:t>──</w:t>
       </w:r>
       <w:r>
+        <w:rPr>
+          <w:highlight w:val="green"/>
+        </w:rPr>
         <w:t xml:space="preserve"> api-</w:t>
       </w:r>
       <w:proofErr w:type="spellStart"/>
       <w:r>
+        <w:rPr>
+          <w:highlight w:val="green"/>
+        </w:rPr>
         <w:t>gateway</w:t>
       </w:r>
       <w:proofErr w:type="spellEnd"/>
       <w:r>
+        <w:rPr>
+          <w:highlight w:val="green"/>
+        </w:rPr>
         <w:t>/</w:t>
       </w:r>
     </w:p>
@@ -642,24 +653,35 @@
       <w:r>
         <w:rPr>
           <w:rFonts w:ascii="MS Gothic" w:eastAsia="MS Gothic" w:hAnsi="MS Gothic" w:cs="MS Gothic" w:hint="eastAsia"/>
+          <w:highlight w:val="green"/>
         </w:rPr>
         <w:t>├</w:t>
       </w:r>
       <w:r>
         <w:rPr>
           <w:rFonts w:ascii="Calibri" w:hAnsi="Calibri" w:cs="Calibri"/>
+          <w:highlight w:val="green"/>
         </w:rPr>
         <w:t>──</w:t>
       </w:r>
       <w:r>
+        <w:rPr>
+          <w:highlight w:val="green"/>
+        </w:rPr>
         <w:t xml:space="preserve"> </w:t>
       </w:r>
       <w:proofErr w:type="spellStart"/>
       <w:r>
+        <w:rPr>
+          <w:highlight w:val="green"/>
+        </w:rPr>
         <w:t>config</w:t>
       </w:r>
       <w:proofErr w:type="spellEnd"/>
       <w:r>
+        <w:rPr>
+          <w:highlight w:val="green"/>
+        </w:rPr>
         <w:t>-server/</w:t>
       </w:r>
     </w:p>
@@ -764,16 +786,21 @@
       <w:r>
         <w:rPr>
           <w:rFonts w:ascii="MS Gothic" w:eastAsia="MS Gothic" w:hAnsi="MS Gothic" w:cs="MS Gothic" w:hint="eastAsia"/>
+          <w:highlight w:val="green"/>
         </w:rPr>
         <w:t>├</w:t>
       </w:r>
       <w:r>
         <w:rPr>
           <w:rFonts w:ascii="Calibri" w:hAnsi="Calibri" w:cs="Calibri"/>
+          <w:highlight w:val="green"/>
         </w:rPr>
         <w:t>──</w:t>
       </w:r>
       <w:r>
+        <w:rPr>
+          <w:highlight w:val="green"/>
+        </w:rPr>
         <w:t xml:space="preserve"> RESPUESTAS-CONCEPTUALES.md</w:t>
       </w:r>
     </w:p>
@@ -1660,18 +1687,23 @@
         <w:rPr>
           <w:b/>
           <w:bCs/>
-        </w:rPr>
-      </w:pPr>
-      <w:r>
-        <w:rPr>
-          <w:b/>
-          <w:bCs/>
+          <w:highlight w:val="green"/>
+        </w:rPr>
+      </w:pPr>
+      <w:r>
+        <w:rPr>
+          <w:b/>
+          <w:bCs/>
+          <w:highlight w:val="green"/>
         </w:rPr>
         <w:t>Requerimientos No Funcionales</w:t>
       </w:r>
     </w:p>
     <w:p>
       <w:r>
+        <w:rPr>
+          <w:highlight w:val="green"/>
+        </w:rPr>
         <w:t>Aplican a todos los microservicios del sistema y serán verificados durante la corrección.</w:t>
       </w:r>
     </w:p>
@@ -2058,10 +2090,14 @@
         <w:rPr>
           <w:b/>
           <w:bCs/>
+          <w:highlight w:val="green"/>
         </w:rPr>
         <w:t>RNF-08 — Todo el tráfico pasa por el Gateway</w:t>
       </w:r>
       <w:r>
+        <w:rPr>
+          <w:highlight w:val="green"/>
+        </w:rPr>
         <w:t> Los clientes externos solo interactúan con el sistema a través del API Gateway. Los microservicios de negocio no deben ser accesibles directamente desde el exterior en el entorno de producción local (puertos no expuestos o protegidos).</w:t>
       </w:r>
     </w:p>
@@ -2886,18 +2922,28 @@
           <w:ilvl w:val="0"/>
           <w:numId w:val="4"/>
         </w:numPr>
-      </w:pPr>
-      <w:r>
+        <w:rPr>
+          <w:highlight w:val="green"/>
+        </w:rPr>
+      </w:pPr>
+      <w:r>
+        <w:rPr>
+          <w:highlight w:val="green"/>
+        </w:rPr>
         <w:t>Al menos </w:t>
       </w:r>
       <w:r>
         <w:rPr>
           <w:b/>
           <w:bCs/>
+          <w:highlight w:val="green"/>
         </w:rPr>
         <w:t>una relación @ManyToMany</w:t>
       </w:r>
       <w:r>
+        <w:rPr>
+          <w:highlight w:val="green"/>
+        </w:rPr>
         <w:t> con tabla intermedia explícita en alguno de los servicios (cubre RF-09).</w:t>
       </w:r>
     </w:p>
@@ -2969,8 +3015,14 @@
           <w:ilvl w:val="0"/>
           <w:numId w:val="4"/>
         </w:numPr>
-      </w:pPr>
-      <w:r>
+        <w:rPr>
+          <w:highlight w:val="green"/>
+        </w:rPr>
+      </w:pPr>
+      <w:r>
+        <w:rPr>
+          <w:highlight w:val="green"/>
+        </w:rPr>
         <w:t>Modelo de datos de cada servicio documentado en el README.md.</w:t>
       </w:r>
     </w:p>
@@ -4850,16 +4902,35 @@
           <w:ilvl w:val="1"/>
           <w:numId w:val="7"/>
         </w:numPr>
-      </w:pPr>
-      <w:r>
-        <w:rPr>
-          <w:b/>
-          <w:bCs/>
+        <w:rPr>
+          <w:highlight w:val="green"/>
+        </w:rPr>
+      </w:pPr>
+      <w:r>
+        <w:rPr>
+          <w:b/>
+          <w:bCs/>
+          <w:highlight w:val="green"/>
         </w:rPr>
         <w:t>RF-04:</w:t>
       </w:r>
       <w:r>
-        <w:t> validación de transiciones de estado; transición inválida rechazada con excepción descriptiva que indique los estados involucrados. Estados y transiciones documentados en el README.md.</w:t>
+        <w:rPr>
+          <w:highlight w:val="green"/>
+        </w:rPr>
+        <w:t xml:space="preserve"> validación de transiciones de estado; transición inválida rechazada </w:t>
+      </w:r>
+      <w:r>
+        <w:rPr>
+          <w:highlight w:val="green"/>
+        </w:rPr>
+        <w:t xml:space="preserve">de los tokens invalidados </w:t>
+      </w:r>
+      <w:r>
+        <w:rPr>
+          <w:highlight w:val="green"/>
+        </w:rPr>
+        <w:t>con excepción descriptiva que indique los estados involucrados. Estados y transiciones documentados en el README.md.</w:t>
       </w:r>
     </w:p>
     <w:p>
@@ -4868,23 +4939,42 @@
           <w:ilvl w:val="1"/>
           <w:numId w:val="7"/>
         </w:numPr>
-      </w:pPr>
-      <w:r>
-        <w:rPr>
-          <w:b/>
-          <w:bCs/>
+        <w:rPr>
+          <w:highlight w:val="green"/>
+        </w:rPr>
+      </w:pPr>
+      <w:r>
+        <w:rPr>
+          <w:b/>
+          <w:bCs/>
+          <w:highlight w:val="green"/>
         </w:rPr>
         <w:t>RF-05:</w:t>
       </w:r>
       <w:r>
+        <w:rPr>
+          <w:highlight w:val="green"/>
+        </w:rPr>
         <w:t xml:space="preserve"> registro automático en el historial de estados en cada cambio, incluyendo usuario y </w:t>
       </w:r>
       <w:proofErr w:type="spellStart"/>
       <w:r>
+        <w:rPr>
+          <w:highlight w:val="green"/>
+        </w:rPr>
         <w:t>timestamp</w:t>
       </w:r>
       <w:proofErr w:type="spellEnd"/>
       <w:r>
+        <w:rPr>
+          <w:highlight w:val="green"/>
+        </w:rPr>
+        <w:t>, se aplicó auditoría automática</w:t>
+      </w:r>
+      <w:r>
+        <w:rPr>
+          <w:highlight w:val="green"/>
+        </w:rPr>
         <w:t>.</w:t>
       </w:r>
     </w:p>
@@ -9063,42 +9153,65 @@
         <w:rPr>
           <w:b/>
           <w:bCs/>
-        </w:rPr>
-      </w:pPr>
-      <w:r>
-        <w:rPr>
-          <w:b/>
-          <w:bCs/>
+          <w:highlight w:val="green"/>
+        </w:rPr>
+      </w:pPr>
+      <w:r>
+        <w:rPr>
+          <w:b/>
+          <w:bCs/>
+          <w:highlight w:val="green"/>
         </w:rPr>
         <w:lastRenderedPageBreak/>
         <w:t>Sección 12: API Gateway — Spring Cloud Gateway (20 puntos)</w:t>
       </w:r>
     </w:p>
     <w:p>
-      <w:r>
-        <w:rPr>
-          <w:b/>
-          <w:bCs/>
+      <w:pPr>
+        <w:rPr>
+          <w:highlight w:val="green"/>
+        </w:rPr>
+      </w:pPr>
+      <w:r>
+        <w:rPr>
+          <w:b/>
+          <w:bCs/>
+          <w:highlight w:val="green"/>
         </w:rPr>
         <w:t>Qué se evalúa:</w:t>
       </w:r>
       <w:r>
+        <w:rPr>
+          <w:highlight w:val="green"/>
+        </w:rPr>
         <w:t> Punto de entrada único; enrutamiento load-</w:t>
       </w:r>
       <w:proofErr w:type="spellStart"/>
       <w:r>
+        <w:rPr>
+          <w:highlight w:val="green"/>
+        </w:rPr>
         <w:t>balanced</w:t>
       </w:r>
       <w:proofErr w:type="spellEnd"/>
       <w:r>
+        <w:rPr>
+          <w:highlight w:val="green"/>
+        </w:rPr>
         <w:t xml:space="preserve"> vía Eureka; filtros globales y por ruta. Cubre RNF-08.</w:t>
       </w:r>
     </w:p>
     <w:p>
-      <w:r>
-        <w:rPr>
-          <w:b/>
-          <w:bCs/>
+      <w:pPr>
+        <w:rPr>
+          <w:highlight w:val="green"/>
+        </w:rPr>
+      </w:pPr>
+      <w:r>
+        <w:rPr>
+          <w:b/>
+          <w:bCs/>
+          <w:highlight w:val="green"/>
         </w:rPr>
         <w:t>Entregables:</w:t>
       </w:r>
@@ -9109,26 +9222,44 @@
           <w:ilvl w:val="0"/>
           <w:numId w:val="14"/>
         </w:numPr>
-      </w:pPr>
-      <w:r>
+        <w:rPr>
+          <w:highlight w:val="green"/>
+        </w:rPr>
+      </w:pPr>
+      <w:r>
+        <w:rPr>
+          <w:highlight w:val="green"/>
+        </w:rPr>
         <w:t>Proyecto api-</w:t>
       </w:r>
       <w:proofErr w:type="spellStart"/>
       <w:r>
+        <w:rPr>
+          <w:highlight w:val="green"/>
+        </w:rPr>
         <w:t>gateway</w:t>
       </w:r>
       <w:proofErr w:type="spellEnd"/>
       <w:r>
+        <w:rPr>
+          <w:highlight w:val="green"/>
+        </w:rPr>
         <w:t> configurado en </w:t>
       </w:r>
       <w:proofErr w:type="spellStart"/>
       <w:proofErr w:type="gramStart"/>
       <w:r>
+        <w:rPr>
+          <w:highlight w:val="green"/>
+        </w:rPr>
         <w:t>application.yaml</w:t>
       </w:r>
       <w:proofErr w:type="spellEnd"/>
       <w:proofErr w:type="gramEnd"/>
       <w:r>
+        <w:rPr>
+          <w:highlight w:val="green"/>
+        </w:rPr>
         <w:t>.</w:t>
       </w:r>
     </w:p>
@@ -9138,18 +9269,28 @@
           <w:ilvl w:val="0"/>
           <w:numId w:val="14"/>
         </w:numPr>
-      </w:pPr>
-      <w:r>
+        <w:rPr>
+          <w:highlight w:val="green"/>
+        </w:rPr>
+      </w:pPr>
+      <w:r>
+        <w:rPr>
+          <w:highlight w:val="green"/>
+        </w:rPr>
         <w:t>Mínimo </w:t>
       </w:r>
       <w:r>
         <w:rPr>
           <w:b/>
           <w:bCs/>
+          <w:highlight w:val="green"/>
         </w:rPr>
         <w:t>3 rutas</w:t>
       </w:r>
       <w:r>
+        <w:rPr>
+          <w:highlight w:val="green"/>
+        </w:rPr>
         <w:t> (una por microservicio de negocio) usando lb:// para resolución vía Eureka.</w:t>
       </w:r>
     </w:p>
@@ -9159,18 +9300,28 @@
           <w:ilvl w:val="0"/>
           <w:numId w:val="14"/>
         </w:numPr>
-      </w:pPr>
-      <w:r>
+        <w:rPr>
+          <w:highlight w:val="green"/>
+        </w:rPr>
+      </w:pPr>
+      <w:r>
+        <w:rPr>
+          <w:highlight w:val="green"/>
+        </w:rPr>
         <w:t>Al menos </w:t>
       </w:r>
       <w:r>
         <w:rPr>
           <w:b/>
           <w:bCs/>
+          <w:highlight w:val="green"/>
         </w:rPr>
         <w:t>1 predicado</w:t>
       </w:r>
       <w:r>
+        <w:rPr>
+          <w:highlight w:val="green"/>
+        </w:rPr>
         <w:t> por ruta (Path, Method, Header u otro).</w:t>
       </w:r>
     </w:p>
@@ -9180,74 +9331,126 @@
           <w:ilvl w:val="0"/>
           <w:numId w:val="14"/>
         </w:numPr>
-      </w:pPr>
-      <w:r>
+        <w:rPr>
+          <w:highlight w:val="green"/>
+        </w:rPr>
+      </w:pPr>
+      <w:r>
+        <w:rPr>
+          <w:highlight w:val="green"/>
+        </w:rPr>
         <w:t>Al menos </w:t>
       </w:r>
       <w:r>
         <w:rPr>
           <w:b/>
           <w:bCs/>
+          <w:highlight w:val="green"/>
         </w:rPr>
         <w:t>1 filtro global personalizado</w:t>
       </w:r>
       <w:r>
+        <w:rPr>
+          <w:highlight w:val="green"/>
+        </w:rPr>
         <w:t> implementando </w:t>
       </w:r>
       <w:proofErr w:type="spellStart"/>
       <w:r>
+        <w:rPr>
+          <w:highlight w:val="green"/>
+        </w:rPr>
         <w:t>GlobalFilter</w:t>
       </w:r>
       <w:proofErr w:type="spellEnd"/>
       <w:r>
+        <w:rPr>
+          <w:highlight w:val="green"/>
+        </w:rPr>
         <w:t> y </w:t>
       </w:r>
       <w:proofErr w:type="spellStart"/>
       <w:r>
+        <w:rPr>
+          <w:highlight w:val="green"/>
+        </w:rPr>
         <w:t>Ordered</w:t>
       </w:r>
       <w:proofErr w:type="spellEnd"/>
       <w:r>
+        <w:rPr>
+          <w:highlight w:val="green"/>
+        </w:rPr>
         <w:t xml:space="preserve"> que agregue un </w:t>
       </w:r>
       <w:proofErr w:type="spellStart"/>
       <w:r>
+        <w:rPr>
+          <w:highlight w:val="green"/>
+        </w:rPr>
         <w:t>header</w:t>
       </w:r>
       <w:proofErr w:type="spellEnd"/>
       <w:r>
+        <w:rPr>
+          <w:highlight w:val="green"/>
+        </w:rPr>
         <w:t xml:space="preserve"> de trazabilidad a cada </w:t>
       </w:r>
       <w:proofErr w:type="spellStart"/>
       <w:r>
+        <w:rPr>
+          <w:highlight w:val="green"/>
+        </w:rPr>
         <w:t>request</w:t>
       </w:r>
       <w:proofErr w:type="spellEnd"/>
       <w:r>
+        <w:rPr>
+          <w:highlight w:val="green"/>
+        </w:rPr>
         <w:t xml:space="preserve"> (por </w:t>
       </w:r>
       <w:proofErr w:type="gramStart"/>
       <w:r>
+        <w:rPr>
+          <w:highlight w:val="green"/>
+        </w:rPr>
         <w:t>ejemplo</w:t>
       </w:r>
       <w:proofErr w:type="gramEnd"/>
       <w:r>
+        <w:rPr>
+          <w:highlight w:val="green"/>
+        </w:rPr>
         <w:t> X-</w:t>
       </w:r>
       <w:proofErr w:type="spellStart"/>
       <w:r>
+        <w:rPr>
+          <w:highlight w:val="green"/>
+        </w:rPr>
         <w:t>Request</w:t>
       </w:r>
       <w:proofErr w:type="spellEnd"/>
       <w:r>
+        <w:rPr>
+          <w:highlight w:val="green"/>
+        </w:rPr>
         <w:t>-Id con UUID o X-Gateway-</w:t>
       </w:r>
       <w:proofErr w:type="spellStart"/>
       <w:r>
+        <w:rPr>
+          <w:highlight w:val="green"/>
+        </w:rPr>
         <w:t>Timestamp</w:t>
       </w:r>
       <w:proofErr w:type="spellEnd"/>
       <w:r>
+        <w:rPr>
+          <w:highlight w:val="green"/>
+        </w:rPr>
         <w:t>).</w:t>
       </w:r>
     </w:p>
@@ -9257,42 +9460,70 @@
           <w:ilvl w:val="0"/>
           <w:numId w:val="14"/>
         </w:numPr>
-      </w:pPr>
-      <w:r>
+        <w:rPr>
+          <w:highlight w:val="green"/>
+        </w:rPr>
+      </w:pPr>
+      <w:r>
+        <w:rPr>
+          <w:highlight w:val="green"/>
+        </w:rPr>
         <w:t>Al menos </w:t>
       </w:r>
       <w:r>
         <w:rPr>
           <w:b/>
           <w:bCs/>
+          <w:highlight w:val="green"/>
         </w:rPr>
         <w:t>1 filtro de ruta específico</w:t>
       </w:r>
       <w:r>
+        <w:rPr>
+          <w:highlight w:val="green"/>
+        </w:rPr>
         <w:t> aplicado a al menos una ruta (</w:t>
       </w:r>
       <w:proofErr w:type="spellStart"/>
       <w:r>
+        <w:rPr>
+          <w:highlight w:val="green"/>
+        </w:rPr>
         <w:t>StripPrefix</w:t>
       </w:r>
       <w:proofErr w:type="spellEnd"/>
       <w:r>
+        <w:rPr>
+          <w:highlight w:val="green"/>
+        </w:rPr>
         <w:t>, </w:t>
       </w:r>
       <w:proofErr w:type="spellStart"/>
       <w:r>
+        <w:rPr>
+          <w:highlight w:val="green"/>
+        </w:rPr>
         <w:t>AddRequestHeader</w:t>
       </w:r>
       <w:proofErr w:type="spellEnd"/>
       <w:r>
+        <w:rPr>
+          <w:highlight w:val="green"/>
+        </w:rPr>
         <w:t>, </w:t>
       </w:r>
       <w:proofErr w:type="spellStart"/>
       <w:r>
+        <w:rPr>
+          <w:highlight w:val="green"/>
+        </w:rPr>
         <w:t>CircuitBreaker</w:t>
       </w:r>
       <w:proofErr w:type="spellEnd"/>
       <w:r>
+        <w:rPr>
+          <w:highlight w:val="green"/>
+        </w:rPr>
         <w:t> u otro de Spring Cloud Gateway).</w:t>
       </w:r>
     </w:p>
@@ -9302,8 +9533,14 @@
           <w:ilvl w:val="0"/>
           <w:numId w:val="14"/>
         </w:numPr>
-      </w:pPr>
-      <w:r>
+        <w:rPr>
+          <w:highlight w:val="green"/>
+        </w:rPr>
+      </w:pPr>
+      <w:r>
+        <w:rPr>
+          <w:highlight w:val="green"/>
+        </w:rPr>
         <w:t>Si la validación JWT se realiza en el Gateway, el filtro de autenticación debe estar aquí.</w:t>
       </w:r>
     </w:p>
@@ -11979,8 +12216,15 @@
         </w:tc>
       </w:tr>
     </w:tbl>
-    <w:p>
-      <w:r>
+    <w:p/>
+    <w:p>
+      <w:r>
+        <w:br w:type="page"/>
+      </w:r>
+    </w:p>
+    <w:p>
+      <w:r>
+        <w:lastRenderedPageBreak/>
         <w:pict w14:anchorId="08C27FFD">
           <v:rect id="_x0000_i1045" style="width:0;height:3pt" o:hralign="center" o:hrstd="t" o:hr="t" fillcolor="#a0a0a0" stroked="f"/>
         </w:pict>
@@ -12021,7 +12265,13 @@
         <w:t>API Gateway</w:t>
       </w:r>
       <w:r>
-        <w:t xml:space="preserve"> (localhost:8080), nunca directamente a los microservicios. Adapta las rutas al diseño que hayas implementado; si cambias alguna ruta, documéntala en el README.md. Reemplaza TOKEN por el JWT obtenido en el caso de </w:t>
+        <w:t> (localhost:</w:t>
+      </w:r>
+      <w:r>
+        <w:t>9090</w:t>
+      </w:r>
+      <w:r>
+        <w:t xml:space="preserve">), nunca directamente a los microservicios. Adapta las rutas al diseño que hayas implementado; si cambias alguna ruta, documéntala en el README.md. Reemplaza TOKEN por el JWT obtenido en el caso de </w:t>
       </w:r>
       <w:proofErr w:type="spellStart"/>
       <w:r>
@@ -12036,1852 +12286,6 @@
       <w:r>
         <w:pict w14:anchorId="28B4B8F8">
           <v:rect id="_x0000_i1046" style="width:0;height:3pt" o:hralign="center" o:hrstd="t" o:hr="t" fillcolor="#a0a0a0" stroked="f"/>
-        </w:pict>
-      </w:r>
-    </w:p>
-    <w:p>
-      <w:pPr>
-        <w:rPr>
-          <w:b/>
-          <w:bCs/>
-        </w:rPr>
-      </w:pPr>
-      <w:r>
-        <w:rPr>
-          <w:b/>
-          <w:bCs/>
-        </w:rPr>
-        <w:t>Autenticación</w:t>
-      </w:r>
-    </w:p>
-    <w:p>
-      <w:r>
-        <w:rPr>
-          <w:b/>
-          <w:bCs/>
-        </w:rPr>
-        <w:t>Caso 1 — Registro de usuario</w:t>
-      </w:r>
-    </w:p>
-    <w:p>
-      <w:proofErr w:type="spellStart"/>
-      <w:r>
-        <w:t>curl</w:t>
-      </w:r>
-      <w:proofErr w:type="spellEnd"/>
-      <w:r>
-        <w:t xml:space="preserve"> -s -X POST http://localhost:8080/api/v1/auth/register \</w:t>
-      </w:r>
-    </w:p>
-    <w:p>
-      <w:r>
-        <w:t xml:space="preserve">  -H "Content-</w:t>
-      </w:r>
-      <w:proofErr w:type="spellStart"/>
-      <w:r>
-        <w:t>Type</w:t>
-      </w:r>
-      <w:proofErr w:type="spellEnd"/>
-      <w:r>
-        <w:t xml:space="preserve">: </w:t>
-      </w:r>
-      <w:proofErr w:type="spellStart"/>
-      <w:r>
-        <w:t>application</w:t>
-      </w:r>
-      <w:proofErr w:type="spellEnd"/>
-      <w:r>
-        <w:t>/</w:t>
-      </w:r>
-      <w:proofErr w:type="spellStart"/>
-      <w:r>
-        <w:t>json</w:t>
-      </w:r>
-      <w:proofErr w:type="spellEnd"/>
-      <w:r>
-        <w:t>" \</w:t>
-      </w:r>
-    </w:p>
-    <w:p>
-      <w:r>
-        <w:t xml:space="preserve">  -d '{"</w:t>
-      </w:r>
-      <w:proofErr w:type="spellStart"/>
-      <w:r>
-        <w:t>nombre":"Carlos</w:t>
-      </w:r>
-      <w:proofErr w:type="spellEnd"/>
-      <w:r>
-        <w:t xml:space="preserve"> Quispe","email":"carlos@rapidocourier.pe","password":"Segura123!","role":"OPERADOR"}' | </w:t>
-      </w:r>
-      <w:proofErr w:type="spellStart"/>
-      <w:proofErr w:type="gramStart"/>
-      <w:r>
-        <w:t>jq</w:t>
-      </w:r>
-      <w:proofErr w:type="spellEnd"/>
-      <w:r>
-        <w:t xml:space="preserve"> .</w:t>
-      </w:r>
-      <w:proofErr w:type="gramEnd"/>
-    </w:p>
-    <w:p>
-      <w:r>
-        <w:t xml:space="preserve">Esperado: 201 </w:t>
-      </w:r>
-      <w:proofErr w:type="spellStart"/>
-      <w:r>
-        <w:t>Created</w:t>
-      </w:r>
-      <w:proofErr w:type="spellEnd"/>
-      <w:r>
-        <w:t> — </w:t>
-      </w:r>
-      <w:proofErr w:type="spellStart"/>
-      <w:r>
-        <w:t>success</w:t>
-      </w:r>
-      <w:proofErr w:type="spellEnd"/>
-      <w:r>
-        <w:t>: true, JWT en data.</w:t>
-      </w:r>
-    </w:p>
-    <w:p>
-      <w:r>
-        <w:rPr>
-          <w:b/>
-          <w:bCs/>
-        </w:rPr>
-        <w:t>Caso 2 — Login exitoso</w:t>
-      </w:r>
-    </w:p>
-    <w:p>
-      <w:proofErr w:type="spellStart"/>
-      <w:r>
-        <w:lastRenderedPageBreak/>
-        <w:t>curl</w:t>
-      </w:r>
-      <w:proofErr w:type="spellEnd"/>
-      <w:r>
-        <w:t xml:space="preserve"> -s -X POST http://localhost:8080/api/v1/auth/login \</w:t>
-      </w:r>
-    </w:p>
-    <w:p>
-      <w:r>
-        <w:t xml:space="preserve">  -H "Content-</w:t>
-      </w:r>
-      <w:proofErr w:type="spellStart"/>
-      <w:r>
-        <w:t>Type</w:t>
-      </w:r>
-      <w:proofErr w:type="spellEnd"/>
-      <w:r>
-        <w:t xml:space="preserve">: </w:t>
-      </w:r>
-      <w:proofErr w:type="spellStart"/>
-      <w:r>
-        <w:t>application</w:t>
-      </w:r>
-      <w:proofErr w:type="spellEnd"/>
-      <w:r>
-        <w:t>/</w:t>
-      </w:r>
-      <w:proofErr w:type="spellStart"/>
-      <w:r>
-        <w:t>json</w:t>
-      </w:r>
-      <w:proofErr w:type="spellEnd"/>
-      <w:r>
-        <w:t>" \</w:t>
-      </w:r>
-    </w:p>
-    <w:p>
-      <w:r>
-        <w:t xml:space="preserve">  -d '{"email":"carlos@rapidocourier.pe","password":"Segura123!"}' | </w:t>
-      </w:r>
-      <w:proofErr w:type="spellStart"/>
-      <w:proofErr w:type="gramStart"/>
-      <w:r>
-        <w:t>jq</w:t>
-      </w:r>
-      <w:proofErr w:type="spellEnd"/>
-      <w:r>
-        <w:t xml:space="preserve"> .</w:t>
-      </w:r>
-      <w:proofErr w:type="gramEnd"/>
-    </w:p>
-    <w:p>
-      <w:r>
-        <w:t>Esperado: 200 OK — </w:t>
-      </w:r>
-      <w:proofErr w:type="spellStart"/>
-      <w:r>
-        <w:t>success</w:t>
-      </w:r>
-      <w:proofErr w:type="spellEnd"/>
-      <w:r>
-        <w:t>: true, JWT válido en data.</w:t>
-      </w:r>
-    </w:p>
-    <w:p>
-      <w:r>
-        <w:rPr>
-          <w:b/>
-          <w:bCs/>
-        </w:rPr>
-        <w:t>Caso 3 — Login con credenciales incorrectas</w:t>
-      </w:r>
-    </w:p>
-    <w:p>
-      <w:proofErr w:type="spellStart"/>
-      <w:r>
-        <w:t>curl</w:t>
-      </w:r>
-      <w:proofErr w:type="spellEnd"/>
-      <w:r>
-        <w:t xml:space="preserve"> -s -X POST http://localhost:8080/api/v1/auth/login \</w:t>
-      </w:r>
-    </w:p>
-    <w:p>
-      <w:r>
-        <w:t xml:space="preserve">  -H "Content-</w:t>
-      </w:r>
-      <w:proofErr w:type="spellStart"/>
-      <w:r>
-        <w:t>Type</w:t>
-      </w:r>
-      <w:proofErr w:type="spellEnd"/>
-      <w:r>
-        <w:t xml:space="preserve">: </w:t>
-      </w:r>
-      <w:proofErr w:type="spellStart"/>
-      <w:r>
-        <w:t>application</w:t>
-      </w:r>
-      <w:proofErr w:type="spellEnd"/>
-      <w:r>
-        <w:t>/</w:t>
-      </w:r>
-      <w:proofErr w:type="spellStart"/>
-      <w:r>
-        <w:t>json</w:t>
-      </w:r>
-      <w:proofErr w:type="spellEnd"/>
-      <w:r>
-        <w:t>" \</w:t>
-      </w:r>
-    </w:p>
-    <w:p>
-      <w:r>
-        <w:t xml:space="preserve">  -d '{"email":"carlos@rapidocourier.pe","</w:t>
-      </w:r>
-      <w:proofErr w:type="spellStart"/>
-      <w:r>
-        <w:t>password</w:t>
-      </w:r>
-      <w:proofErr w:type="spellEnd"/>
-      <w:r>
-        <w:t xml:space="preserve">":"incorrecta"}' | </w:t>
-      </w:r>
-      <w:proofErr w:type="spellStart"/>
-      <w:proofErr w:type="gramStart"/>
-      <w:r>
-        <w:t>jq</w:t>
-      </w:r>
-      <w:proofErr w:type="spellEnd"/>
-      <w:r>
-        <w:t xml:space="preserve"> .</w:t>
-      </w:r>
-      <w:proofErr w:type="gramEnd"/>
-    </w:p>
-    <w:p>
-      <w:r>
-        <w:t xml:space="preserve">Esperado: 401 </w:t>
-      </w:r>
-      <w:proofErr w:type="spellStart"/>
-      <w:r>
-        <w:t>Unauthorized</w:t>
-      </w:r>
-      <w:proofErr w:type="spellEnd"/>
-      <w:r>
-        <w:t> — </w:t>
-      </w:r>
-      <w:proofErr w:type="spellStart"/>
-      <w:r>
-        <w:t>success</w:t>
-      </w:r>
-      <w:proofErr w:type="spellEnd"/>
-      <w:r>
-        <w:t>: false.</w:t>
-      </w:r>
-    </w:p>
-    <w:p>
-      <w:r>
-        <w:pict w14:anchorId="3828D471">
-          <v:rect id="_x0000_i1047" style="width:0;height:3pt" o:hralign="center" o:hrstd="t" o:hr="t" fillcolor="#a0a0a0" stroked="f"/>
-        </w:pict>
-      </w:r>
-    </w:p>
-    <w:p>
-      <w:pPr>
-        <w:rPr>
-          <w:b/>
-          <w:bCs/>
-        </w:rPr>
-      </w:pPr>
-      <w:r>
-        <w:rPr>
-          <w:b/>
-          <w:bCs/>
-        </w:rPr>
-        <w:t>Clientes (RF-01)</w:t>
-      </w:r>
-    </w:p>
-    <w:p>
-      <w:r>
-        <w:rPr>
-          <w:b/>
-          <w:bCs/>
-        </w:rPr>
-        <w:t>Caso 4 — Registro de cliente con consulta RENIEC</w:t>
-      </w:r>
-    </w:p>
-    <w:p>
-      <w:proofErr w:type="spellStart"/>
-      <w:r>
-        <w:t>curl</w:t>
-      </w:r>
-      <w:proofErr w:type="spellEnd"/>
-      <w:r>
-        <w:t xml:space="preserve"> -s -X POST http://localhost:8080/api/v1/clientes \</w:t>
-      </w:r>
-    </w:p>
-    <w:p>
-      <w:r>
-        <w:t xml:space="preserve">  -H "Content-</w:t>
-      </w:r>
-      <w:proofErr w:type="spellStart"/>
-      <w:r>
-        <w:t>Type</w:t>
-      </w:r>
-      <w:proofErr w:type="spellEnd"/>
-      <w:r>
-        <w:t xml:space="preserve">: </w:t>
-      </w:r>
-      <w:proofErr w:type="spellStart"/>
-      <w:r>
-        <w:t>application</w:t>
-      </w:r>
-      <w:proofErr w:type="spellEnd"/>
-      <w:r>
-        <w:t>/</w:t>
-      </w:r>
-      <w:proofErr w:type="spellStart"/>
-      <w:r>
-        <w:t>json</w:t>
-      </w:r>
-      <w:proofErr w:type="spellEnd"/>
-      <w:r>
-        <w:t>" \</w:t>
-      </w:r>
-    </w:p>
-    <w:p>
-      <w:r>
-        <w:t xml:space="preserve">  -H "</w:t>
-      </w:r>
-      <w:proofErr w:type="spellStart"/>
-      <w:r>
-        <w:t>Authorization</w:t>
-      </w:r>
-      <w:proofErr w:type="spellEnd"/>
-      <w:r>
-        <w:t>: Bearer TOKEN" \</w:t>
-      </w:r>
-    </w:p>
-    <w:p>
-      <w:r>
-        <w:t xml:space="preserve">  -d '{"dni":"12345678","email":"ana.flores@correo.com","telefono":"987654321"}' | </w:t>
-      </w:r>
-      <w:proofErr w:type="spellStart"/>
-      <w:proofErr w:type="gramStart"/>
-      <w:r>
-        <w:t>jq</w:t>
-      </w:r>
-      <w:proofErr w:type="spellEnd"/>
-      <w:r>
-        <w:t xml:space="preserve"> .</w:t>
-      </w:r>
-      <w:proofErr w:type="gramEnd"/>
-    </w:p>
-    <w:p>
-      <w:r>
-        <w:t xml:space="preserve">Esperado: 201 </w:t>
-      </w:r>
-      <w:proofErr w:type="spellStart"/>
-      <w:r>
-        <w:t>Created</w:t>
-      </w:r>
-      <w:proofErr w:type="spellEnd"/>
-      <w:r>
-        <w:t xml:space="preserve"> — nombre completo obtenido de RENIEC visible en data; el campo nombre no estaba en el </w:t>
-      </w:r>
-      <w:proofErr w:type="spellStart"/>
-      <w:r>
-        <w:t>request</w:t>
-      </w:r>
-      <w:proofErr w:type="spellEnd"/>
-      <w:r>
-        <w:t>.</w:t>
-      </w:r>
-    </w:p>
-    <w:p>
-      <w:r>
-        <w:rPr>
-          <w:b/>
-          <w:bCs/>
-        </w:rPr>
-        <w:t>Caso 5 — Email duplicado en registro de cliente</w:t>
-      </w:r>
-    </w:p>
-    <w:p>
-      <w:proofErr w:type="spellStart"/>
-      <w:r>
-        <w:t>curl</w:t>
-      </w:r>
-      <w:proofErr w:type="spellEnd"/>
-      <w:r>
-        <w:t xml:space="preserve"> -s -X POST http://localhost:8080/api/v1/clientes \</w:t>
-      </w:r>
-    </w:p>
-    <w:p>
-      <w:r>
-        <w:t xml:space="preserve">  -H "Content-</w:t>
-      </w:r>
-      <w:proofErr w:type="spellStart"/>
-      <w:r>
-        <w:t>Type</w:t>
-      </w:r>
-      <w:proofErr w:type="spellEnd"/>
-      <w:r>
-        <w:t xml:space="preserve">: </w:t>
-      </w:r>
-      <w:proofErr w:type="spellStart"/>
-      <w:r>
-        <w:t>application</w:t>
-      </w:r>
-      <w:proofErr w:type="spellEnd"/>
-      <w:r>
-        <w:t>/</w:t>
-      </w:r>
-      <w:proofErr w:type="spellStart"/>
-      <w:r>
-        <w:t>json</w:t>
-      </w:r>
-      <w:proofErr w:type="spellEnd"/>
-      <w:r>
-        <w:t>" \</w:t>
-      </w:r>
-    </w:p>
-    <w:p>
-      <w:r>
-        <w:t xml:space="preserve">  -H "</w:t>
-      </w:r>
-      <w:proofErr w:type="spellStart"/>
-      <w:r>
-        <w:t>Authorization</w:t>
-      </w:r>
-      <w:proofErr w:type="spellEnd"/>
-      <w:r>
-        <w:t>: Bearer TOKEN" \</w:t>
-      </w:r>
-    </w:p>
-    <w:p>
-      <w:r>
-        <w:t xml:space="preserve">  -d '{"dni":"87654321","email":"ana.flores@correo.com","telefono":"999888777"}' | </w:t>
-      </w:r>
-      <w:proofErr w:type="spellStart"/>
-      <w:proofErr w:type="gramStart"/>
-      <w:r>
-        <w:t>jq</w:t>
-      </w:r>
-      <w:proofErr w:type="spellEnd"/>
-      <w:r>
-        <w:t xml:space="preserve"> .</w:t>
-      </w:r>
-      <w:proofErr w:type="gramEnd"/>
-    </w:p>
-    <w:p>
-      <w:r>
-        <w:t xml:space="preserve">Esperado: 409 </w:t>
-      </w:r>
-      <w:proofErr w:type="spellStart"/>
-      <w:r>
-        <w:t>Conflict</w:t>
-      </w:r>
-      <w:proofErr w:type="spellEnd"/>
-      <w:r>
-        <w:t> — </w:t>
-      </w:r>
-      <w:proofErr w:type="spellStart"/>
-      <w:r>
-        <w:t>success</w:t>
-      </w:r>
-      <w:proofErr w:type="spellEnd"/>
-      <w:r>
-        <w:t>: false, mensaje indica email ya registrado.</w:t>
-      </w:r>
-    </w:p>
-    <w:p>
-      <w:r>
-        <w:rPr>
-          <w:b/>
-          <w:bCs/>
-        </w:rPr>
-        <w:t>Caso 6 — Datos inválidos en registro de cliente</w:t>
-      </w:r>
-    </w:p>
-    <w:p>
-      <w:proofErr w:type="spellStart"/>
-      <w:r>
-        <w:t>curl</w:t>
-      </w:r>
-      <w:proofErr w:type="spellEnd"/>
-      <w:r>
-        <w:t xml:space="preserve"> -s -X POST http://localhost:8080/api/v1/clientes \</w:t>
-      </w:r>
-    </w:p>
-    <w:p>
-      <w:r>
-        <w:t xml:space="preserve">  -H "Content-</w:t>
-      </w:r>
-      <w:proofErr w:type="spellStart"/>
-      <w:r>
-        <w:t>Type</w:t>
-      </w:r>
-      <w:proofErr w:type="spellEnd"/>
-      <w:r>
-        <w:t xml:space="preserve">: </w:t>
-      </w:r>
-      <w:proofErr w:type="spellStart"/>
-      <w:r>
-        <w:t>application</w:t>
-      </w:r>
-      <w:proofErr w:type="spellEnd"/>
-      <w:r>
-        <w:t>/</w:t>
-      </w:r>
-      <w:proofErr w:type="spellStart"/>
-      <w:r>
-        <w:t>json</w:t>
-      </w:r>
-      <w:proofErr w:type="spellEnd"/>
-      <w:r>
-        <w:t>" \</w:t>
-      </w:r>
-    </w:p>
-    <w:p>
-      <w:r>
-        <w:t xml:space="preserve">  -H "</w:t>
-      </w:r>
-      <w:proofErr w:type="spellStart"/>
-      <w:r>
-        <w:t>Authorization</w:t>
-      </w:r>
-      <w:proofErr w:type="spellEnd"/>
-      <w:r>
-        <w:t>: Bearer TOKEN" \</w:t>
-      </w:r>
-    </w:p>
-    <w:p>
-      <w:r>
-        <w:t xml:space="preserve">  -d '{"dni":"123","email":"correo-invalido","telefono":""}' | </w:t>
-      </w:r>
-      <w:proofErr w:type="spellStart"/>
-      <w:proofErr w:type="gramStart"/>
-      <w:r>
-        <w:t>jq</w:t>
-      </w:r>
-      <w:proofErr w:type="spellEnd"/>
-      <w:r>
-        <w:t xml:space="preserve"> .</w:t>
-      </w:r>
-      <w:proofErr w:type="gramEnd"/>
-    </w:p>
-    <w:p>
-      <w:r>
-        <w:t xml:space="preserve">Esperado: 400 Bad </w:t>
-      </w:r>
-      <w:proofErr w:type="spellStart"/>
-      <w:r>
-        <w:t>Request</w:t>
-      </w:r>
-      <w:proofErr w:type="spellEnd"/>
-      <w:r>
-        <w:t> — </w:t>
-      </w:r>
-      <w:proofErr w:type="spellStart"/>
-      <w:r>
-        <w:t>success</w:t>
-      </w:r>
-      <w:proofErr w:type="spellEnd"/>
-      <w:r>
-        <w:t>: false, data con mapa de errores agrupado por campo.</w:t>
-      </w:r>
-    </w:p>
-    <w:p>
-      <w:r>
-        <w:pict w14:anchorId="116ABE6F">
-          <v:rect id="_x0000_i1048" style="width:0;height:3pt" o:hralign="center" o:hrstd="t" o:hr="t" fillcolor="#a0a0a0" stroked="f"/>
-        </w:pict>
-      </w:r>
-    </w:p>
-    <w:p>
-      <w:pPr>
-        <w:rPr>
-          <w:b/>
-          <w:bCs/>
-        </w:rPr>
-      </w:pPr>
-      <w:r>
-        <w:rPr>
-          <w:b/>
-          <w:bCs/>
-        </w:rPr>
-        <w:lastRenderedPageBreak/>
-        <w:t>Paquetes (RF-02, RF-03, RF-04)</w:t>
-      </w:r>
-    </w:p>
-    <w:p>
-      <w:r>
-        <w:rPr>
-          <w:b/>
-          <w:bCs/>
-        </w:rPr>
-        <w:t>Caso 7 — Registro de paquete con tarifa calculada</w:t>
-      </w:r>
-    </w:p>
-    <w:p>
-      <w:proofErr w:type="spellStart"/>
-      <w:r>
-        <w:t>curl</w:t>
-      </w:r>
-      <w:proofErr w:type="spellEnd"/>
-      <w:r>
-        <w:t xml:space="preserve"> -s -X POST http://localhost:8080/api/v1/paquetes \</w:t>
-      </w:r>
-    </w:p>
-    <w:p>
-      <w:r>
-        <w:t xml:space="preserve">  -H "Content-</w:t>
-      </w:r>
-      <w:proofErr w:type="spellStart"/>
-      <w:r>
-        <w:t>Type</w:t>
-      </w:r>
-      <w:proofErr w:type="spellEnd"/>
-      <w:r>
-        <w:t xml:space="preserve">: </w:t>
-      </w:r>
-      <w:proofErr w:type="spellStart"/>
-      <w:r>
-        <w:t>application</w:t>
-      </w:r>
-      <w:proofErr w:type="spellEnd"/>
-      <w:r>
-        <w:t>/</w:t>
-      </w:r>
-      <w:proofErr w:type="spellStart"/>
-      <w:r>
-        <w:t>json</w:t>
-      </w:r>
-      <w:proofErr w:type="spellEnd"/>
-      <w:r>
-        <w:t>" \</w:t>
-      </w:r>
-    </w:p>
-    <w:p>
-      <w:r>
-        <w:t xml:space="preserve">  -H "</w:t>
-      </w:r>
-      <w:proofErr w:type="spellStart"/>
-      <w:r>
-        <w:t>Authorization</w:t>
-      </w:r>
-      <w:proofErr w:type="spellEnd"/>
-      <w:r>
-        <w:t>: Bearer TOKEN" \</w:t>
-      </w:r>
-    </w:p>
-    <w:p>
-      <w:r>
-        <w:t xml:space="preserve">  -d '{</w:t>
-      </w:r>
-    </w:p>
-    <w:p>
-      <w:r>
-        <w:t xml:space="preserve">    "</w:t>
-      </w:r>
-      <w:proofErr w:type="spellStart"/>
-      <w:r>
-        <w:t>descripcion</w:t>
-      </w:r>
-      <w:proofErr w:type="spellEnd"/>
-      <w:r>
-        <w:t>":"Documentos legales",</w:t>
-      </w:r>
-    </w:p>
-    <w:p>
-      <w:r>
-        <w:t xml:space="preserve">    "pesoKg":1.5,</w:t>
-      </w:r>
-    </w:p>
-    <w:p>
-      <w:r>
-        <w:t xml:space="preserve">    "valorDeclarado":200.00,</w:t>
-      </w:r>
-    </w:p>
-    <w:p>
-      <w:r>
-        <w:t xml:space="preserve">    "</w:t>
-      </w:r>
-      <w:proofErr w:type="spellStart"/>
-      <w:r>
-        <w:t>sucursalOrigen</w:t>
-      </w:r>
-      <w:proofErr w:type="spellEnd"/>
-      <w:r>
-        <w:t>":"Lima",</w:t>
-      </w:r>
-    </w:p>
-    <w:p>
-      <w:r>
-        <w:t xml:space="preserve">    "</w:t>
-      </w:r>
-      <w:proofErr w:type="spellStart"/>
-      <w:r>
-        <w:t>sucursalDestino</w:t>
-      </w:r>
-      <w:proofErr w:type="spellEnd"/>
-      <w:r>
-        <w:t>":"Arequipa",</w:t>
-      </w:r>
-    </w:p>
-    <w:p>
-      <w:r>
-        <w:t xml:space="preserve">    "dniRemitente":"12345678",</w:t>
-      </w:r>
-    </w:p>
-    <w:p>
-      <w:r>
-        <w:t xml:space="preserve">    "dniDestinatario":"87654321"</w:t>
-      </w:r>
-    </w:p>
-    <w:p>
-      <w:r>
-        <w:t xml:space="preserve">  }' | </w:t>
-      </w:r>
-      <w:proofErr w:type="spellStart"/>
-      <w:proofErr w:type="gramStart"/>
-      <w:r>
-        <w:t>jq</w:t>
-      </w:r>
-      <w:proofErr w:type="spellEnd"/>
-      <w:r>
-        <w:t xml:space="preserve"> .</w:t>
-      </w:r>
-      <w:proofErr w:type="gramEnd"/>
-    </w:p>
-    <w:p>
-      <w:r>
-        <w:t xml:space="preserve">Esperado: 201 </w:t>
-      </w:r>
-      <w:proofErr w:type="spellStart"/>
-      <w:r>
-        <w:t>Created</w:t>
-      </w:r>
-      <w:proofErr w:type="spellEnd"/>
-      <w:r>
-        <w:t> — código de rastreo generado y tarifa calculada visibles en data.</w:t>
-      </w:r>
-    </w:p>
-    <w:p>
-      <w:r>
-        <w:rPr>
-          <w:b/>
-          <w:bCs/>
-        </w:rPr>
-        <w:t>Caso 8 — Datos inválidos en registro de paquete</w:t>
-      </w:r>
-    </w:p>
-    <w:p>
-      <w:proofErr w:type="spellStart"/>
-      <w:r>
-        <w:t>curl</w:t>
-      </w:r>
-      <w:proofErr w:type="spellEnd"/>
-      <w:r>
-        <w:t xml:space="preserve"> -s -X POST http://localhost:8080/api/v1/paquetes \</w:t>
-      </w:r>
-    </w:p>
-    <w:p>
-      <w:r>
-        <w:t xml:space="preserve">  -H "Content-</w:t>
-      </w:r>
-      <w:proofErr w:type="spellStart"/>
-      <w:r>
-        <w:t>Type</w:t>
-      </w:r>
-      <w:proofErr w:type="spellEnd"/>
-      <w:r>
-        <w:t xml:space="preserve">: </w:t>
-      </w:r>
-      <w:proofErr w:type="spellStart"/>
-      <w:r>
-        <w:t>application</w:t>
-      </w:r>
-      <w:proofErr w:type="spellEnd"/>
-      <w:r>
-        <w:t>/</w:t>
-      </w:r>
-      <w:proofErr w:type="spellStart"/>
-      <w:r>
-        <w:t>json</w:t>
-      </w:r>
-      <w:proofErr w:type="spellEnd"/>
-      <w:r>
-        <w:t>" \</w:t>
-      </w:r>
-    </w:p>
-    <w:p>
-      <w:r>
-        <w:t xml:space="preserve">  -H "</w:t>
-      </w:r>
-      <w:proofErr w:type="spellStart"/>
-      <w:r>
-        <w:t>Authorization</w:t>
-      </w:r>
-      <w:proofErr w:type="spellEnd"/>
-      <w:r>
-        <w:t>: Bearer TOKEN" \</w:t>
-      </w:r>
-    </w:p>
-    <w:p>
-      <w:r>
-        <w:t xml:space="preserve">  -d '{"</w:t>
-      </w:r>
-      <w:proofErr w:type="spellStart"/>
-      <w:r>
-        <w:t>descripcion</w:t>
-      </w:r>
-      <w:proofErr w:type="spellEnd"/>
-      <w:r>
-        <w:t>":"","</w:t>
-      </w:r>
-      <w:proofErr w:type="spellStart"/>
-      <w:r>
-        <w:t>pesoKg</w:t>
-      </w:r>
-      <w:proofErr w:type="spellEnd"/>
-      <w:proofErr w:type="gramStart"/>
-      <w:r>
-        <w:t>":-</w:t>
-      </w:r>
-      <w:proofErr w:type="gramEnd"/>
-      <w:r>
-        <w:t xml:space="preserve">1,"valorDeclarado":0}' | </w:t>
-      </w:r>
-      <w:proofErr w:type="spellStart"/>
-      <w:proofErr w:type="gramStart"/>
-      <w:r>
-        <w:t>jq</w:t>
-      </w:r>
-      <w:proofErr w:type="spellEnd"/>
-      <w:r>
-        <w:t xml:space="preserve"> .</w:t>
-      </w:r>
-      <w:proofErr w:type="gramEnd"/>
-    </w:p>
-    <w:p>
-      <w:r>
-        <w:t xml:space="preserve">Esperado: 400 Bad </w:t>
-      </w:r>
-      <w:proofErr w:type="spellStart"/>
-      <w:r>
-        <w:t>Request</w:t>
-      </w:r>
-      <w:proofErr w:type="spellEnd"/>
-      <w:r>
-        <w:t> — mapa de errores por campo en data.</w:t>
-      </w:r>
-    </w:p>
-    <w:p>
-      <w:r>
-        <w:rPr>
-          <w:b/>
-          <w:bCs/>
-        </w:rPr>
-        <w:t>Caso 9 — Consulta de paquete por ID existente</w:t>
-      </w:r>
-    </w:p>
-    <w:p>
-      <w:proofErr w:type="spellStart"/>
-      <w:r>
-        <w:t>curl</w:t>
-      </w:r>
-      <w:proofErr w:type="spellEnd"/>
-      <w:r>
-        <w:t xml:space="preserve"> -s -X GET http://localhost:8080/api/v1/paquetes/{id} \</w:t>
-      </w:r>
-    </w:p>
-    <w:p>
-      <w:r>
-        <w:t xml:space="preserve">  -H "</w:t>
-      </w:r>
-      <w:proofErr w:type="spellStart"/>
-      <w:r>
-        <w:t>Authorization</w:t>
-      </w:r>
-      <w:proofErr w:type="spellEnd"/>
-      <w:r>
-        <w:t xml:space="preserve">: Bearer TOKEN" | </w:t>
-      </w:r>
-      <w:proofErr w:type="spellStart"/>
-      <w:proofErr w:type="gramStart"/>
-      <w:r>
-        <w:t>jq</w:t>
-      </w:r>
-      <w:proofErr w:type="spellEnd"/>
-      <w:r>
-        <w:t xml:space="preserve"> .</w:t>
-      </w:r>
-      <w:proofErr w:type="gramEnd"/>
-    </w:p>
-    <w:p>
-      <w:r>
-        <w:t>Esperado: 200 OK — datos del paquete incluyendo nombre del remitente y destinatario en data.</w:t>
-      </w:r>
-    </w:p>
-    <w:p>
-      <w:r>
-        <w:rPr>
-          <w:b/>
-          <w:bCs/>
-        </w:rPr>
-        <w:t>Caso 10 — Consulta de paquete por ID inexistente</w:t>
-      </w:r>
-    </w:p>
-    <w:p>
-      <w:proofErr w:type="spellStart"/>
-      <w:r>
-        <w:t>curl</w:t>
-      </w:r>
-      <w:proofErr w:type="spellEnd"/>
-      <w:r>
-        <w:t xml:space="preserve"> -s -X GET http://localhost:8080/api/v1/paquetes/00000000-0000-0000-0000-000000000000 \</w:t>
-      </w:r>
-    </w:p>
-    <w:p>
-      <w:r>
-        <w:t xml:space="preserve">  -H "</w:t>
-      </w:r>
-      <w:proofErr w:type="spellStart"/>
-      <w:r>
-        <w:t>Authorization</w:t>
-      </w:r>
-      <w:proofErr w:type="spellEnd"/>
-      <w:r>
-        <w:t xml:space="preserve">: Bearer TOKEN" | </w:t>
-      </w:r>
-      <w:proofErr w:type="spellStart"/>
-      <w:proofErr w:type="gramStart"/>
-      <w:r>
-        <w:t>jq</w:t>
-      </w:r>
-      <w:proofErr w:type="spellEnd"/>
-      <w:r>
-        <w:t xml:space="preserve"> .</w:t>
-      </w:r>
-      <w:proofErr w:type="gramEnd"/>
-    </w:p>
-    <w:p>
-      <w:r>
-        <w:t>Esperado: 404 Not Found — </w:t>
-      </w:r>
-      <w:proofErr w:type="spellStart"/>
-      <w:r>
-        <w:t>success</w:t>
-      </w:r>
-      <w:proofErr w:type="spellEnd"/>
-      <w:r>
-        <w:t>: false.</w:t>
-      </w:r>
-    </w:p>
-    <w:p>
-      <w:r>
-        <w:rPr>
-          <w:b/>
-          <w:bCs/>
-        </w:rPr>
-        <w:t>Caso 11 — Actualización de estado: transición válida (RF-04)</w:t>
-      </w:r>
-    </w:p>
-    <w:p>
-      <w:proofErr w:type="spellStart"/>
-      <w:r>
-        <w:lastRenderedPageBreak/>
-        <w:t>curl</w:t>
-      </w:r>
-      <w:proofErr w:type="spellEnd"/>
-      <w:r>
-        <w:t xml:space="preserve"> -s -X PATCH http://localhost:8080/api/v1/paquetes/{id}/estado \</w:t>
-      </w:r>
-    </w:p>
-    <w:p>
-      <w:r>
-        <w:t xml:space="preserve">  -H "Content-</w:t>
-      </w:r>
-      <w:proofErr w:type="spellStart"/>
-      <w:r>
-        <w:t>Type</w:t>
-      </w:r>
-      <w:proofErr w:type="spellEnd"/>
-      <w:r>
-        <w:t xml:space="preserve">: </w:t>
-      </w:r>
-      <w:proofErr w:type="spellStart"/>
-      <w:r>
-        <w:t>application</w:t>
-      </w:r>
-      <w:proofErr w:type="spellEnd"/>
-      <w:r>
-        <w:t>/</w:t>
-      </w:r>
-      <w:proofErr w:type="spellStart"/>
-      <w:r>
-        <w:t>json</w:t>
-      </w:r>
-      <w:proofErr w:type="spellEnd"/>
-      <w:r>
-        <w:t>" \</w:t>
-      </w:r>
-    </w:p>
-    <w:p>
-      <w:r>
-        <w:t xml:space="preserve">  -H "</w:t>
-      </w:r>
-      <w:proofErr w:type="spellStart"/>
-      <w:r>
-        <w:t>Authorization</w:t>
-      </w:r>
-      <w:proofErr w:type="spellEnd"/>
-      <w:r>
-        <w:t>: Bearer TOKEN" \</w:t>
-      </w:r>
-    </w:p>
-    <w:p>
-      <w:r>
-        <w:t xml:space="preserve">  -d '{"</w:t>
-      </w:r>
-      <w:proofErr w:type="spellStart"/>
-      <w:r>
-        <w:t>nuevoEstado</w:t>
-      </w:r>
-      <w:proofErr w:type="spellEnd"/>
-      <w:r>
-        <w:t xml:space="preserve">":"EN_TRANSITO"}' | </w:t>
-      </w:r>
-      <w:proofErr w:type="spellStart"/>
-      <w:proofErr w:type="gramStart"/>
-      <w:r>
-        <w:t>jq</w:t>
-      </w:r>
-      <w:proofErr w:type="spellEnd"/>
-      <w:r>
-        <w:t xml:space="preserve"> .</w:t>
-      </w:r>
-      <w:proofErr w:type="gramEnd"/>
-    </w:p>
-    <w:p>
-      <w:r>
-        <w:t>Esperado: 200 OK — paquete con nuevo estado en data.</w:t>
-      </w:r>
-    </w:p>
-    <w:p>
-      <w:r>
-        <w:rPr>
-          <w:b/>
-          <w:bCs/>
-        </w:rPr>
-        <w:t>Caso 12 — Actualización de estado: transición inválida (RF-04)</w:t>
-      </w:r>
-    </w:p>
-    <w:p>
-      <w:proofErr w:type="spellStart"/>
-      <w:r>
-        <w:t>curl</w:t>
-      </w:r>
-      <w:proofErr w:type="spellEnd"/>
-      <w:r>
-        <w:t xml:space="preserve"> -s -X PATCH http://localhost:8080/api/v1/paquetes/{id}/estado \</w:t>
-      </w:r>
-    </w:p>
-    <w:p>
-      <w:r>
-        <w:t xml:space="preserve">  -H "Content-</w:t>
-      </w:r>
-      <w:proofErr w:type="spellStart"/>
-      <w:r>
-        <w:t>Type</w:t>
-      </w:r>
-      <w:proofErr w:type="spellEnd"/>
-      <w:r>
-        <w:t xml:space="preserve">: </w:t>
-      </w:r>
-      <w:proofErr w:type="spellStart"/>
-      <w:r>
-        <w:t>application</w:t>
-      </w:r>
-      <w:proofErr w:type="spellEnd"/>
-      <w:r>
-        <w:t>/</w:t>
-      </w:r>
-      <w:proofErr w:type="spellStart"/>
-      <w:r>
-        <w:t>json</w:t>
-      </w:r>
-      <w:proofErr w:type="spellEnd"/>
-      <w:r>
-        <w:t>" \</w:t>
-      </w:r>
-    </w:p>
-    <w:p>
-      <w:r>
-        <w:t xml:space="preserve">  -H "</w:t>
-      </w:r>
-      <w:proofErr w:type="spellStart"/>
-      <w:r>
-        <w:t>Authorization</w:t>
-      </w:r>
-      <w:proofErr w:type="spellEnd"/>
-      <w:r>
-        <w:t>: Bearer TOKEN" \</w:t>
-      </w:r>
-    </w:p>
-    <w:p>
-      <w:r>
-        <w:t xml:space="preserve">  -d '{"</w:t>
-      </w:r>
-      <w:proofErr w:type="spellStart"/>
-      <w:r>
-        <w:t>nuevoEstado</w:t>
-      </w:r>
-      <w:proofErr w:type="spellEnd"/>
-      <w:r>
-        <w:t xml:space="preserve">":"REGISTRADO"}' | </w:t>
-      </w:r>
-      <w:proofErr w:type="spellStart"/>
-      <w:proofErr w:type="gramStart"/>
-      <w:r>
-        <w:t>jq</w:t>
-      </w:r>
-      <w:proofErr w:type="spellEnd"/>
-      <w:r>
-        <w:t xml:space="preserve"> .</w:t>
-      </w:r>
-      <w:proofErr w:type="gramEnd"/>
-    </w:p>
-    <w:p>
-      <w:r>
-        <w:t xml:space="preserve">Esperado: 409 </w:t>
-      </w:r>
-      <w:proofErr w:type="spellStart"/>
-      <w:r>
-        <w:t>Conflict</w:t>
-      </w:r>
-      <w:proofErr w:type="spellEnd"/>
-      <w:r>
-        <w:t> — mensaje descriptivo con los estados involucrados.</w:t>
-      </w:r>
-    </w:p>
-    <w:p>
-      <w:r>
-        <w:pict w14:anchorId="47185176">
-          <v:rect id="_x0000_i1049" style="width:0;height:3pt" o:hralign="center" o:hrstd="t" o:hr="t" fillcolor="#a0a0a0" stroked="f"/>
-        </w:pict>
-      </w:r>
-    </w:p>
-    <w:p>
-      <w:pPr>
-        <w:rPr>
-          <w:b/>
-          <w:bCs/>
-        </w:rPr>
-      </w:pPr>
-      <w:r>
-        <w:rPr>
-          <w:b/>
-          <w:bCs/>
-        </w:rPr>
-        <w:t>Historial de Estados (RF-05)</w:t>
-      </w:r>
-    </w:p>
-    <w:p>
-      <w:r>
-        <w:rPr>
-          <w:b/>
-          <w:bCs/>
-        </w:rPr>
-        <w:t>Caso 13 — Consulta del historial de estados</w:t>
-      </w:r>
-    </w:p>
-    <w:p>
-      <w:proofErr w:type="spellStart"/>
-      <w:r>
-        <w:t>curl</w:t>
-      </w:r>
-      <w:proofErr w:type="spellEnd"/>
-      <w:r>
-        <w:t xml:space="preserve"> -s -X GET http://localhost:8080/api/v1/paquetes/{id}/historial \</w:t>
-      </w:r>
-    </w:p>
-    <w:p>
-      <w:r>
-        <w:t xml:space="preserve">  -H "</w:t>
-      </w:r>
-      <w:proofErr w:type="spellStart"/>
-      <w:r>
-        <w:t>Authorization</w:t>
-      </w:r>
-      <w:proofErr w:type="spellEnd"/>
-      <w:r>
-        <w:t xml:space="preserve">: Bearer TOKEN" | </w:t>
-      </w:r>
-      <w:proofErr w:type="spellStart"/>
-      <w:proofErr w:type="gramStart"/>
-      <w:r>
-        <w:t>jq</w:t>
-      </w:r>
-      <w:proofErr w:type="spellEnd"/>
-      <w:r>
-        <w:t xml:space="preserve"> .</w:t>
-      </w:r>
-      <w:proofErr w:type="gramEnd"/>
-    </w:p>
-    <w:p>
-      <w:r>
-        <w:t xml:space="preserve">Esperado: 200 OK — lista ordenada de cambios de estado con </w:t>
-      </w:r>
-      <w:proofErr w:type="spellStart"/>
-      <w:r>
-        <w:t>timestamp</w:t>
-      </w:r>
-      <w:proofErr w:type="spellEnd"/>
-      <w:r>
-        <w:t xml:space="preserve"> y usuario en data.</w:t>
-      </w:r>
-    </w:p>
-    <w:p>
-      <w:r>
-        <w:pict w14:anchorId="0AF9EAFF">
-          <v:rect id="_x0000_i1050" style="width:0;height:3pt" o:hralign="center" o:hrstd="t" o:hr="t" fillcolor="#a0a0a0" stroked="f"/>
-        </w:pict>
-      </w:r>
-    </w:p>
-    <w:p>
-      <w:pPr>
-        <w:rPr>
-          <w:b/>
-          <w:bCs/>
-        </w:rPr>
-      </w:pPr>
-      <w:r>
-        <w:rPr>
-          <w:b/>
-          <w:bCs/>
-        </w:rPr>
-        <w:t>Búsqueda y Filtros (RF-06, RF-07)</w:t>
-      </w:r>
-    </w:p>
-    <w:p>
-      <w:r>
-        <w:rPr>
-          <w:b/>
-          <w:bCs/>
-        </w:rPr>
-        <w:t>Caso 14 — Búsqueda por texto parcial en código de rastreo (RF-07)</w:t>
-      </w:r>
-    </w:p>
-    <w:p>
-      <w:proofErr w:type="spellStart"/>
-      <w:r>
-        <w:t>curl</w:t>
-      </w:r>
-      <w:proofErr w:type="spellEnd"/>
-      <w:r>
-        <w:t xml:space="preserve"> -s -X GET "http://localhost:8080/api/v1/</w:t>
-      </w:r>
-      <w:proofErr w:type="spellStart"/>
-      <w:r>
-        <w:t>paquetes?busqueda</w:t>
-      </w:r>
-      <w:proofErr w:type="spellEnd"/>
-      <w:r>
-        <w:t>=RC2024" \</w:t>
-      </w:r>
-    </w:p>
-    <w:p>
-      <w:r>
-        <w:t xml:space="preserve">  -H "</w:t>
-      </w:r>
-      <w:proofErr w:type="spellStart"/>
-      <w:r>
-        <w:t>Authorization</w:t>
-      </w:r>
-      <w:proofErr w:type="spellEnd"/>
-      <w:r>
-        <w:t xml:space="preserve">: Bearer TOKEN" | </w:t>
-      </w:r>
-      <w:proofErr w:type="spellStart"/>
-      <w:proofErr w:type="gramStart"/>
-      <w:r>
-        <w:t>jq</w:t>
-      </w:r>
-      <w:proofErr w:type="spellEnd"/>
-      <w:r>
-        <w:t xml:space="preserve"> .</w:t>
-      </w:r>
-      <w:proofErr w:type="gramEnd"/>
-    </w:p>
-    <w:p>
-      <w:r>
-        <w:t>Esperado: 200 OK — lista de paquetes cuyo código de rastreo contenga "RC2024".</w:t>
-      </w:r>
-    </w:p>
-    <w:p>
-      <w:r>
-        <w:rPr>
-          <w:b/>
-          <w:bCs/>
-        </w:rPr>
-        <w:t>Caso 15 — Búsqueda por nombre de cliente (RF-07)</w:t>
-      </w:r>
-    </w:p>
-    <w:p>
-      <w:proofErr w:type="spellStart"/>
-      <w:r>
-        <w:t>curl</w:t>
-      </w:r>
-      <w:proofErr w:type="spellEnd"/>
-      <w:r>
-        <w:t xml:space="preserve"> -s -X GET "http://localhost:8080/api/v1/</w:t>
-      </w:r>
-      <w:proofErr w:type="spellStart"/>
-      <w:r>
-        <w:t>paquetes?busqueda</w:t>
-      </w:r>
-      <w:proofErr w:type="spellEnd"/>
-      <w:r>
-        <w:t>=flores" \</w:t>
-      </w:r>
-    </w:p>
-    <w:p>
-      <w:r>
-        <w:t xml:space="preserve">  -H "</w:t>
-      </w:r>
-      <w:proofErr w:type="spellStart"/>
-      <w:r>
-        <w:t>Authorization</w:t>
-      </w:r>
-      <w:proofErr w:type="spellEnd"/>
-      <w:r>
-        <w:t xml:space="preserve">: Bearer TOKEN" | </w:t>
-      </w:r>
-      <w:proofErr w:type="spellStart"/>
-      <w:proofErr w:type="gramStart"/>
-      <w:r>
-        <w:t>jq</w:t>
-      </w:r>
-      <w:proofErr w:type="spellEnd"/>
-      <w:r>
-        <w:t xml:space="preserve"> .</w:t>
-      </w:r>
-      <w:proofErr w:type="gramEnd"/>
-    </w:p>
-    <w:p>
-      <w:r>
-        <w:t>Esperado: 200 OK — paquetes cuyo remitente o destinatario contenga "flores" en su nombre.</w:t>
-      </w:r>
-    </w:p>
-    <w:p>
-      <w:r>
-        <w:rPr>
-          <w:b/>
-          <w:bCs/>
-        </w:rPr>
-        <w:t>Caso 16 — Filtro por sucursal y estado (RF-06)</w:t>
-      </w:r>
-    </w:p>
-    <w:p>
-      <w:proofErr w:type="spellStart"/>
-      <w:r>
-        <w:t>curl</w:t>
-      </w:r>
-      <w:proofErr w:type="spellEnd"/>
-      <w:r>
-        <w:t xml:space="preserve"> -s -X GET "http://localhost:8080/api/v1/paquetes?sucursal=Lima&amp;estado=EN_TRANSITO" \</w:t>
-      </w:r>
-    </w:p>
-    <w:p>
-      <w:r>
-        <w:t xml:space="preserve">  -H "</w:t>
-      </w:r>
-      <w:proofErr w:type="spellStart"/>
-      <w:r>
-        <w:t>Authorization</w:t>
-      </w:r>
-      <w:proofErr w:type="spellEnd"/>
-      <w:r>
-        <w:t xml:space="preserve">: Bearer TOKEN" | </w:t>
-      </w:r>
-      <w:proofErr w:type="spellStart"/>
-      <w:proofErr w:type="gramStart"/>
-      <w:r>
-        <w:t>jq</w:t>
-      </w:r>
-      <w:proofErr w:type="spellEnd"/>
-      <w:r>
-        <w:t xml:space="preserve"> .</w:t>
-      </w:r>
-      <w:proofErr w:type="gramEnd"/>
-    </w:p>
-    <w:p>
-      <w:r>
-        <w:t>Esperado: 200 OK — paquetes con origen o destino en Lima y estado EN_TRANSITO.</w:t>
-      </w:r>
-    </w:p>
-    <w:p>
-      <w:r>
-        <w:lastRenderedPageBreak/>
-        <w:pict w14:anchorId="30B8E4EC">
-          <v:rect id="_x0000_i1051" style="width:0;height:3pt" o:hralign="center" o:hrstd="t" o:hr="t" fillcolor="#a0a0a0" stroked="f"/>
-        </w:pict>
-      </w:r>
-    </w:p>
-    <w:p>
-      <w:pPr>
-        <w:rPr>
-          <w:b/>
-          <w:bCs/>
-        </w:rPr>
-      </w:pPr>
-      <w:r>
-        <w:rPr>
-          <w:b/>
-          <w:bCs/>
-        </w:rPr>
-        <w:t>Categorías (RF-09)</w:t>
-      </w:r>
-    </w:p>
-    <w:p>
-      <w:r>
-        <w:rPr>
-          <w:b/>
-          <w:bCs/>
-        </w:rPr>
-        <w:t>Caso 17 — Asignación de categoría a un paquete</w:t>
-      </w:r>
-    </w:p>
-    <w:p>
-      <w:proofErr w:type="spellStart"/>
-      <w:r>
-        <w:t>curl</w:t>
-      </w:r>
-      <w:proofErr w:type="spellEnd"/>
-      <w:r>
-        <w:t xml:space="preserve"> -s -X POST http://localhost:8080/api/v1/paquetes/{id}/categorias/{categoriaId} \</w:t>
-      </w:r>
-    </w:p>
-    <w:p>
-      <w:r>
-        <w:t xml:space="preserve">  -H "</w:t>
-      </w:r>
-      <w:proofErr w:type="spellStart"/>
-      <w:r>
-        <w:t>Authorization</w:t>
-      </w:r>
-      <w:proofErr w:type="spellEnd"/>
-      <w:r>
-        <w:t xml:space="preserve">: Bearer TOKEN" | </w:t>
-      </w:r>
-      <w:proofErr w:type="spellStart"/>
-      <w:proofErr w:type="gramStart"/>
-      <w:r>
-        <w:t>jq</w:t>
-      </w:r>
-      <w:proofErr w:type="spellEnd"/>
-      <w:r>
-        <w:t xml:space="preserve"> .</w:t>
-      </w:r>
-      <w:proofErr w:type="gramEnd"/>
-    </w:p>
-    <w:p>
-      <w:r>
-        <w:t>Esperado: 200 OK — paquete actualizado con la categoría asignada en data.</w:t>
-      </w:r>
-    </w:p>
-    <w:p>
-      <w:r>
-        <w:pict w14:anchorId="4032F29F">
-          <v:rect id="_x0000_i1052" style="width:0;height:3pt" o:hralign="center" o:hrstd="t" o:hr="t" fillcolor="#a0a0a0" stroked="f"/>
-        </w:pict>
-      </w:r>
-    </w:p>
-    <w:p>
-      <w:pPr>
-        <w:rPr>
-          <w:b/>
-          <w:bCs/>
-        </w:rPr>
-      </w:pPr>
-      <w:r>
-        <w:rPr>
-          <w:b/>
-          <w:bCs/>
-        </w:rPr>
-        <w:t>Operaciones de escritura y borrado</w:t>
-      </w:r>
-    </w:p>
-    <w:p>
-      <w:r>
-        <w:rPr>
-          <w:b/>
-          <w:bCs/>
-        </w:rPr>
-        <w:t>Caso 18 — Actualización de paquete</w:t>
-      </w:r>
-    </w:p>
-    <w:p>
-      <w:proofErr w:type="spellStart"/>
-      <w:r>
-        <w:t>curl</w:t>
-      </w:r>
-      <w:proofErr w:type="spellEnd"/>
-      <w:r>
-        <w:t xml:space="preserve"> -s -X PUT http://localhost:8080/api/v1/paquetes/{id} \</w:t>
-      </w:r>
-    </w:p>
-    <w:p>
-      <w:r>
-        <w:t xml:space="preserve">  -H "Content-</w:t>
-      </w:r>
-      <w:proofErr w:type="spellStart"/>
-      <w:r>
-        <w:t>Type</w:t>
-      </w:r>
-      <w:proofErr w:type="spellEnd"/>
-      <w:r>
-        <w:t xml:space="preserve">: </w:t>
-      </w:r>
-      <w:proofErr w:type="spellStart"/>
-      <w:r>
-        <w:t>application</w:t>
-      </w:r>
-      <w:proofErr w:type="spellEnd"/>
-      <w:r>
-        <w:t>/</w:t>
-      </w:r>
-      <w:proofErr w:type="spellStart"/>
-      <w:r>
-        <w:t>json</w:t>
-      </w:r>
-      <w:proofErr w:type="spellEnd"/>
-      <w:r>
-        <w:t>" \</w:t>
-      </w:r>
-    </w:p>
-    <w:p>
-      <w:r>
-        <w:t xml:space="preserve">  -H "</w:t>
-      </w:r>
-      <w:proofErr w:type="spellStart"/>
-      <w:r>
-        <w:t>Authorization</w:t>
-      </w:r>
-      <w:proofErr w:type="spellEnd"/>
-      <w:r>
-        <w:t>: Bearer TOKEN" \</w:t>
-      </w:r>
-    </w:p>
-    <w:p>
-      <w:r>
-        <w:t xml:space="preserve">  -d '{"</w:t>
-      </w:r>
-      <w:proofErr w:type="spellStart"/>
-      <w:r>
-        <w:t>descripcion</w:t>
-      </w:r>
-      <w:proofErr w:type="spellEnd"/>
-      <w:r>
-        <w:t xml:space="preserve">":"Documentos actualizados","pesoKg":2.0}' | </w:t>
-      </w:r>
-      <w:proofErr w:type="spellStart"/>
-      <w:proofErr w:type="gramStart"/>
-      <w:r>
-        <w:t>jq</w:t>
-      </w:r>
-      <w:proofErr w:type="spellEnd"/>
-      <w:r>
-        <w:t xml:space="preserve"> .</w:t>
-      </w:r>
-      <w:proofErr w:type="gramEnd"/>
-    </w:p>
-    <w:p>
-      <w:r>
-        <w:t>Esperado: 200 OK — datos actualizados en data.</w:t>
-      </w:r>
-    </w:p>
-    <w:p>
-      <w:r>
-        <w:rPr>
-          <w:b/>
-          <w:bCs/>
-        </w:rPr>
-        <w:t>Caso 19 — Eliminación de paquete (solo ADMIN)</w:t>
-      </w:r>
-    </w:p>
-    <w:p>
-      <w:proofErr w:type="spellStart"/>
-      <w:r>
-        <w:t>curl</w:t>
-      </w:r>
-      <w:proofErr w:type="spellEnd"/>
-      <w:r>
-        <w:t xml:space="preserve"> -s -X DELETE http://localhost:8080/api/v1/paquetes/{id} \</w:t>
-      </w:r>
-    </w:p>
-    <w:p>
-      <w:r>
-        <w:t xml:space="preserve">  -H "</w:t>
-      </w:r>
-      <w:proofErr w:type="spellStart"/>
-      <w:r>
-        <w:t>Authorization</w:t>
-      </w:r>
-      <w:proofErr w:type="spellEnd"/>
-      <w:r>
-        <w:t xml:space="preserve">: Bearer TOKEN_ADMIN" | </w:t>
-      </w:r>
-      <w:proofErr w:type="spellStart"/>
-      <w:proofErr w:type="gramStart"/>
-      <w:r>
-        <w:t>jq</w:t>
-      </w:r>
-      <w:proofErr w:type="spellEnd"/>
-      <w:r>
-        <w:t xml:space="preserve"> .</w:t>
-      </w:r>
-      <w:proofErr w:type="gramEnd"/>
-    </w:p>
-    <w:p>
-      <w:r>
-        <w:t>Esperado: 204 No Content.</w:t>
-      </w:r>
-    </w:p>
-    <w:p>
-      <w:r>
-        <w:rPr>
-          <w:b/>
-          <w:bCs/>
-        </w:rPr>
-        <w:t>Caso 20 — Eliminación de recurso inexistente</w:t>
-      </w:r>
-    </w:p>
-    <w:p>
-      <w:proofErr w:type="spellStart"/>
-      <w:r>
-        <w:t>curl</w:t>
-      </w:r>
-      <w:proofErr w:type="spellEnd"/>
-      <w:r>
-        <w:t xml:space="preserve"> -s -X DELETE http://localhost:8080/api/v1/paquetes/00000000-0000-0000-0000-000000000000 \</w:t>
-      </w:r>
-    </w:p>
-    <w:p>
-      <w:r>
-        <w:t xml:space="preserve">  -H "</w:t>
-      </w:r>
-      <w:proofErr w:type="spellStart"/>
-      <w:r>
-        <w:t>Authorization</w:t>
-      </w:r>
-      <w:proofErr w:type="spellEnd"/>
-      <w:r>
-        <w:t xml:space="preserve">: Bearer TOKEN_ADMIN" | </w:t>
-      </w:r>
-      <w:proofErr w:type="spellStart"/>
-      <w:proofErr w:type="gramStart"/>
-      <w:r>
-        <w:t>jq</w:t>
-      </w:r>
-      <w:proofErr w:type="spellEnd"/>
-      <w:r>
-        <w:t xml:space="preserve"> .</w:t>
-      </w:r>
-      <w:proofErr w:type="gramEnd"/>
-    </w:p>
-    <w:p>
-      <w:r>
-        <w:t>Esperado: 404 Not Found — </w:t>
-      </w:r>
-      <w:proofErr w:type="spellStart"/>
-      <w:r>
-        <w:t>success</w:t>
-      </w:r>
-      <w:proofErr w:type="spellEnd"/>
-      <w:r>
-        <w:t>: false.</w:t>
-      </w:r>
-    </w:p>
-    <w:p>
-      <w:r>
-        <w:pict w14:anchorId="7D92A323">
-          <v:rect id="_x0000_i1053" style="width:0;height:3pt" o:hralign="center" o:hrstd="t" o:hr="t" fillcolor="#a0a0a0" stroked="f"/>
-        </w:pict>
-      </w:r>
-    </w:p>
-    <w:p>
-      <w:pPr>
-        <w:rPr>
-          <w:b/>
-          <w:bCs/>
-        </w:rPr>
-      </w:pPr>
-      <w:r>
-        <w:rPr>
-          <w:b/>
-          <w:bCs/>
-        </w:rPr>
-        <w:t>Seguridad (RF-08)</w:t>
-      </w:r>
-    </w:p>
-    <w:p>
-      <w:r>
-        <w:rPr>
-          <w:b/>
-          <w:bCs/>
-        </w:rPr>
-        <w:t xml:space="preserve">Caso 21 — Acceso sin token a </w:t>
-      </w:r>
-      <w:proofErr w:type="spellStart"/>
-      <w:r>
-        <w:rPr>
-          <w:b/>
-          <w:bCs/>
-        </w:rPr>
-        <w:t>endpoint</w:t>
-      </w:r>
-      <w:proofErr w:type="spellEnd"/>
-      <w:r>
-        <w:rPr>
-          <w:b/>
-          <w:bCs/>
-        </w:rPr>
-        <w:t xml:space="preserve"> protegido</w:t>
-      </w:r>
-    </w:p>
-    <w:p>
-      <w:proofErr w:type="spellStart"/>
-      <w:r>
-        <w:t>curl</w:t>
-      </w:r>
-      <w:proofErr w:type="spellEnd"/>
-      <w:r>
-        <w:t xml:space="preserve"> -s -X GET http://localhost:8080/api/v1/paquetes | </w:t>
-      </w:r>
-      <w:proofErr w:type="spellStart"/>
-      <w:proofErr w:type="gramStart"/>
-      <w:r>
-        <w:t>jq</w:t>
-      </w:r>
-      <w:proofErr w:type="spellEnd"/>
-      <w:r>
-        <w:t xml:space="preserve"> .</w:t>
-      </w:r>
-      <w:proofErr w:type="gramEnd"/>
-    </w:p>
-    <w:p>
-      <w:r>
-        <w:t xml:space="preserve">Esperado: 401 </w:t>
-      </w:r>
-      <w:proofErr w:type="spellStart"/>
-      <w:r>
-        <w:t>Unauthorized</w:t>
-      </w:r>
-      <w:proofErr w:type="spellEnd"/>
-      <w:r>
-        <w:t>.</w:t>
-      </w:r>
-    </w:p>
-    <w:p>
-      <w:r>
-        <w:rPr>
-          <w:b/>
-          <w:bCs/>
-        </w:rPr>
-        <w:t>Caso 22 — Acceso con rol insuficiente: CLIENTE intenta eliminar</w:t>
-      </w:r>
-    </w:p>
-    <w:p>
-      <w:proofErr w:type="spellStart"/>
-      <w:r>
-        <w:t>curl</w:t>
-      </w:r>
-      <w:proofErr w:type="spellEnd"/>
-      <w:r>
-        <w:t xml:space="preserve"> -s -X DELETE http://localhost:8080/api/v1/paquetes/{id} \</w:t>
-      </w:r>
-    </w:p>
-    <w:p>
-      <w:r>
-        <w:t xml:space="preserve">  -H "</w:t>
-      </w:r>
-      <w:proofErr w:type="spellStart"/>
-      <w:r>
-        <w:t>Authorization</w:t>
-      </w:r>
-      <w:proofErr w:type="spellEnd"/>
-      <w:r>
-        <w:t xml:space="preserve">: Bearer TOKEN_CLIENTE" | </w:t>
-      </w:r>
-      <w:proofErr w:type="spellStart"/>
-      <w:proofErr w:type="gramStart"/>
-      <w:r>
-        <w:t>jq</w:t>
-      </w:r>
-      <w:proofErr w:type="spellEnd"/>
-      <w:r>
-        <w:t xml:space="preserve"> .</w:t>
-      </w:r>
-      <w:proofErr w:type="gramEnd"/>
-    </w:p>
-    <w:p>
-      <w:r>
-        <w:lastRenderedPageBreak/>
-        <w:t xml:space="preserve">Esperado: 403 </w:t>
-      </w:r>
-      <w:proofErr w:type="spellStart"/>
-      <w:r>
-        <w:t>Forbidden</w:t>
-      </w:r>
-      <w:proofErr w:type="spellEnd"/>
-      <w:r>
-        <w:t>.</w:t>
-      </w:r>
-    </w:p>
-    <w:p>
-      <w:r>
-        <w:pict w14:anchorId="7D896CB3">
-          <v:rect id="_x0000_i1054" style="width:0;height:3pt" o:hralign="center" o:hrstd="t" o:hr="t" fillcolor="#a0a0a0" stroked="f"/>
         </w:pict>
       </w:r>
     </w:p>
@@ -13990,7 +12394,13 @@
         </w:numPr>
       </w:pPr>
       <w:r>
-        <w:t> Regla de cálculo de tarifa (RF-03).</w:t>
+        <w:t> Regla de cálculo de</w:t>
+      </w:r>
+      <w:r>
+        <w:t xml:space="preserve"> porcentaje de participación</w:t>
+      </w:r>
+      <w:r>
+        <w:t>.</w:t>
       </w:r>
     </w:p>
     <w:p>
@@ -14001,7 +12411,7 @@
         </w:numPr>
       </w:pPr>
       <w:r>
-        <w:t> Estados y transiciones válidas del paquete (RF-04).</w:t>
+        <w:t> Estados y transiciones válidas.</w:t>
       </w:r>
     </w:p>
     <w:p>
@@ -14533,6 +12943,7 @@
           </w:tcPr>
           <w:p>
             <w:r>
+              <w:lastRenderedPageBreak/>
               <w:t>A</w:t>
             </w:r>
           </w:p>
@@ -14844,7 +13255,6 @@
           </w:tcPr>
           <w:p>
             <w:r>
-              <w:lastRenderedPageBreak/>
               <w:t>A</w:t>
             </w:r>
           </w:p>

</xml_diff>

<commit_message>
test mockito y read me
</commit_message>
<xml_diff>
--- a/EXAMEN FINAL.docx
+++ b/EXAMEN FINAL.docx
@@ -7503,12 +7503,14 @@
         <w:rPr>
           <w:b/>
           <w:bCs/>
-        </w:rPr>
-      </w:pPr>
-      <w:r>
-        <w:rPr>
-          <w:b/>
-          <w:bCs/>
+          <w:highlight w:val="green"/>
+        </w:rPr>
+      </w:pPr>
+      <w:r>
+        <w:rPr>
+          <w:b/>
+          <w:bCs/>
+          <w:highlight w:val="green"/>
         </w:rPr>
         <w:lastRenderedPageBreak/>
         <w:t xml:space="preserve">Sección 9: Pruebas Unitarias con </w:t>
@@ -7518,6 +7520,7 @@
         <w:rPr>
           <w:b/>
           <w:bCs/>
+          <w:highlight w:val="green"/>
         </w:rPr>
         <w:t>Mockito</w:t>
       </w:r>
@@ -7526,27 +7529,43 @@
         <w:rPr>
           <w:b/>
           <w:bCs/>
+          <w:highlight w:val="green"/>
         </w:rPr>
         <w:t xml:space="preserve"> (10 puntos)</w:t>
       </w:r>
     </w:p>
     <w:p>
-      <w:r>
-        <w:rPr>
-          <w:b/>
-          <w:bCs/>
+      <w:pPr>
+        <w:rPr>
+          <w:highlight w:val="green"/>
+        </w:rPr>
+      </w:pPr>
+      <w:r>
+        <w:rPr>
+          <w:b/>
+          <w:bCs/>
+          <w:highlight w:val="green"/>
         </w:rPr>
         <w:t>Qué se evalúa:</w:t>
       </w:r>
       <w:r>
+        <w:rPr>
+          <w:highlight w:val="green"/>
+        </w:rPr>
         <w:t> Pruebas aisladas de la capa de servicio en al menos 2 microservicios. Cubre RNF-05.</w:t>
       </w:r>
     </w:p>
     <w:p>
-      <w:r>
-        <w:rPr>
-          <w:b/>
-          <w:bCs/>
+      <w:pPr>
+        <w:rPr>
+          <w:highlight w:val="green"/>
+        </w:rPr>
+      </w:pPr>
+      <w:r>
+        <w:rPr>
+          <w:b/>
+          <w:bCs/>
+          <w:highlight w:val="green"/>
         </w:rPr>
         <w:t>Entregables:</w:t>
       </w:r>
@@ -7557,26 +7576,42 @@
           <w:ilvl w:val="0"/>
           <w:numId w:val="11"/>
         </w:numPr>
-      </w:pPr>
-      <w:r>
+        <w:rPr>
+          <w:highlight w:val="green"/>
+        </w:rPr>
+      </w:pPr>
+      <w:r>
+        <w:rPr>
+          <w:highlight w:val="green"/>
+        </w:rPr>
         <w:t>Clases de prueba en al menos </w:t>
       </w:r>
       <w:r>
         <w:rPr>
           <w:b/>
           <w:bCs/>
+          <w:highlight w:val="green"/>
         </w:rPr>
         <w:t>2 microservicios distintos</w:t>
       </w:r>
       <w:r>
+        <w:rPr>
+          <w:highlight w:val="green"/>
+        </w:rPr>
         <w:t> usando @</w:t>
       </w:r>
       <w:proofErr w:type="gramStart"/>
       <w:r>
+        <w:rPr>
+          <w:highlight w:val="green"/>
+        </w:rPr>
         <w:t>ExtendWith(</w:t>
       </w:r>
       <w:proofErr w:type="gramEnd"/>
       <w:r>
+        <w:rPr>
+          <w:highlight w:val="green"/>
+        </w:rPr>
         <w:t>MockitoExtension.class).</w:t>
       </w:r>
     </w:p>
@@ -7586,8 +7621,14 @@
           <w:ilvl w:val="0"/>
           <w:numId w:val="11"/>
         </w:numPr>
-      </w:pPr>
-      <w:r>
+        <w:rPr>
+          <w:highlight w:val="green"/>
+        </w:rPr>
+      </w:pPr>
+      <w:r>
+        <w:rPr>
+          <w:highlight w:val="green"/>
+        </w:rPr>
         <w:t>@Mock para todas las dependencias; @InjectMocks para la clase bajo prueba.</w:t>
       </w:r>
     </w:p>
@@ -7597,18 +7638,28 @@
           <w:ilvl w:val="0"/>
           <w:numId w:val="11"/>
         </w:numPr>
-      </w:pPr>
-      <w:r>
+        <w:rPr>
+          <w:highlight w:val="green"/>
+        </w:rPr>
+      </w:pPr>
+      <w:r>
+        <w:rPr>
+          <w:highlight w:val="green"/>
+        </w:rPr>
         <w:t>Mínimo </w:t>
       </w:r>
       <w:r>
         <w:rPr>
           <w:b/>
           <w:bCs/>
+          <w:highlight w:val="green"/>
         </w:rPr>
         <w:t>6 casos de prueba en total</w:t>
       </w:r>
       <w:r>
+        <w:rPr>
+          <w:highlight w:val="green"/>
+        </w:rPr>
         <w:t> cubriendo obligatoriamente:</w:t>
       </w:r>
     </w:p>
@@ -7618,40 +7669,70 @@
           <w:ilvl w:val="1"/>
           <w:numId w:val="11"/>
         </w:numPr>
-      </w:pPr>
-      <w:r>
+        <w:rPr>
+          <w:highlight w:val="green"/>
+        </w:rPr>
+      </w:pPr>
+      <w:r>
+        <w:rPr>
+          <w:highlight w:val="green"/>
+        </w:rPr>
         <w:t xml:space="preserve">Al menos 1 </w:t>
       </w:r>
       <w:proofErr w:type="spellStart"/>
       <w:r>
+        <w:rPr>
+          <w:highlight w:val="green"/>
+        </w:rPr>
         <w:t>happy</w:t>
       </w:r>
       <w:proofErr w:type="spellEnd"/>
       <w:r>
+        <w:rPr>
+          <w:highlight w:val="green"/>
+        </w:rPr>
         <w:t xml:space="preserve"> </w:t>
       </w:r>
       <w:proofErr w:type="spellStart"/>
       <w:r>
+        <w:rPr>
+          <w:highlight w:val="green"/>
+        </w:rPr>
         <w:t>path</w:t>
       </w:r>
       <w:proofErr w:type="spellEnd"/>
       <w:r>
+        <w:rPr>
+          <w:highlight w:val="green"/>
+        </w:rPr>
         <w:t xml:space="preserve"> por servicio probado (verificado con </w:t>
       </w:r>
       <w:proofErr w:type="spellStart"/>
       <w:r>
+        <w:rPr>
+          <w:highlight w:val="green"/>
+        </w:rPr>
         <w:t>assertEquals</w:t>
       </w:r>
       <w:proofErr w:type="spellEnd"/>
       <w:r>
+        <w:rPr>
+          <w:highlight w:val="green"/>
+        </w:rPr>
         <w:t> / </w:t>
       </w:r>
       <w:proofErr w:type="spellStart"/>
       <w:r>
+        <w:rPr>
+          <w:highlight w:val="green"/>
+        </w:rPr>
         <w:t>assertNotNull</w:t>
       </w:r>
       <w:proofErr w:type="spellEnd"/>
       <w:r>
+        <w:rPr>
+          <w:highlight w:val="green"/>
+        </w:rPr>
         <w:t>).</w:t>
       </w:r>
     </w:p>
@@ -7661,16 +7742,28 @@
           <w:ilvl w:val="1"/>
           <w:numId w:val="11"/>
         </w:numPr>
-      </w:pPr>
-      <w:r>
+        <w:rPr>
+          <w:highlight w:val="green"/>
+        </w:rPr>
+      </w:pPr>
+      <w:r>
+        <w:rPr>
+          <w:highlight w:val="green"/>
+        </w:rPr>
         <w:t>Al menos 2 rutas de excepción con </w:t>
       </w:r>
       <w:proofErr w:type="spellStart"/>
       <w:r>
+        <w:rPr>
+          <w:highlight w:val="green"/>
+        </w:rPr>
         <w:t>assertThrows</w:t>
       </w:r>
       <w:proofErr w:type="spellEnd"/>
       <w:r>
+        <w:rPr>
+          <w:highlight w:val="green"/>
+        </w:rPr>
         <w:t> verificando tipo y mensaje (ejemplos: email duplicado, transición de estado inválida).</w:t>
       </w:r>
     </w:p>
@@ -7680,16 +7773,28 @@
           <w:ilvl w:val="1"/>
           <w:numId w:val="11"/>
         </w:numPr>
-      </w:pPr>
-      <w:r>
+        <w:rPr>
+          <w:highlight w:val="green"/>
+        </w:rPr>
+      </w:pPr>
+      <w:r>
+        <w:rPr>
+          <w:highlight w:val="green"/>
+        </w:rPr>
         <w:t>Al menos 1 caso de resultado vacío (repositorio retorna lista vacía u </w:t>
       </w:r>
       <w:proofErr w:type="spellStart"/>
       <w:r>
+        <w:rPr>
+          <w:highlight w:val="green"/>
+        </w:rPr>
         <w:t>Optional.empty</w:t>
       </w:r>
       <w:proofErr w:type="spellEnd"/>
       <w:r>
+        <w:rPr>
+          <w:highlight w:val="green"/>
+        </w:rPr>
         <w:t>()).</w:t>
       </w:r>
     </w:p>
@@ -7699,8 +7804,14 @@
           <w:ilvl w:val="0"/>
           <w:numId w:val="11"/>
         </w:numPr>
-      </w:pPr>
-      <w:r>
+        <w:rPr>
+          <w:highlight w:val="green"/>
+        </w:rPr>
+      </w:pPr>
+      <w:r>
+        <w:rPr>
+          <w:highlight w:val="green"/>
+        </w:rPr>
         <w:t>Si tienes un componente auxiliar compartido entre servicios (por ejemplo, un calculador de tarifa), usa @Spy y demuestra el impacto cruzado. Si no aplica, justifícalo con un comentario en el archivo de prueba.</w:t>
       </w:r>
     </w:p>

</xml_diff>